<commit_message>
add more notes for the read/write
</commit_message>
<xml_diff>
--- a/Javascript/NodeJs Notes.docx
+++ b/Javascript/NodeJs Notes.docx
@@ -3764,6 +3764,218 @@
         </w:rPr>
         <w:t>Using .on() is a type of event listeners that waits for an action</w:t>
       </w:r>
+    </w:p>
+    <w:p>
+      <w:pPr>
+        <w:rPr>
+          <w:color w:val="000000" w:themeColor="text1"/>
+          <w:sz w:val="22"/>
+          <w:szCs w:val="22"/>
+        </w:rPr>
+      </w:pPr>
+    </w:p>
+    <w:p>
+      <w:pPr>
+        <w:rPr>
+          <w:b/>
+          <w:bCs/>
+          <w:color w:val="000000" w:themeColor="text1"/>
+          <w:u w:val="single"/>
+        </w:rPr>
+      </w:pPr>
+      <w:r>
+        <w:rPr>
+          <w:b/>
+          <w:bCs/>
+          <w:color w:val="000000" w:themeColor="text1"/>
+          <w:u w:val="single"/>
+        </w:rPr>
+        <w:t>Continue RW To Files:</w:t>
+      </w:r>
+    </w:p>
+    <w:p>
+      <w:pPr>
+        <w:pStyle w:val="ListParagraph"/>
+        <w:numPr>
+          <w:ilvl w:val="0"/>
+          <w:numId w:val="15"/>
+        </w:numPr>
+        <w:jc w:val="both"/>
+        <w:rPr>
+          <w:color w:val="000000" w:themeColor="text1"/>
+          <w:sz w:val="22"/>
+          <w:szCs w:val="22"/>
+        </w:rPr>
+      </w:pPr>
+      <w:r>
+        <w:rPr>
+          <w:color w:val="000000" w:themeColor="text1"/>
+          <w:sz w:val="22"/>
+          <w:szCs w:val="22"/>
+        </w:rPr>
+        <w:t>fs.promises is Node.js’s Promise-based version of the fs (file system) module. It lets you work with files using async/await instead of callbacks.</w:t>
+      </w:r>
+    </w:p>
+    <w:p>
+      <w:pPr>
+        <w:pStyle w:val="ListParagraph"/>
+        <w:numPr>
+          <w:ilvl w:val="0"/>
+          <w:numId w:val="15"/>
+        </w:numPr>
+        <w:jc w:val="both"/>
+        <w:rPr>
+          <w:color w:val="000000" w:themeColor="text1"/>
+          <w:sz w:val="22"/>
+          <w:szCs w:val="22"/>
+        </w:rPr>
+      </w:pPr>
+      <w:r>
+        <w:rPr>
+          <w:color w:val="000000" w:themeColor="text1"/>
+          <w:sz w:val="22"/>
+          <w:szCs w:val="22"/>
+        </w:rPr>
+        <w:t>In the past in the fs read and write ops we used to pass a callback function to handle the error or to do something with the read data. Now we use a promise or await to store it in a variable and write code normally</w:t>
+      </w:r>
+    </w:p>
+    <w:p>
+      <w:pPr>
+        <w:pStyle w:val="ListParagraph"/>
+        <w:numPr>
+          <w:ilvl w:val="0"/>
+          <w:numId w:val="15"/>
+        </w:numPr>
+        <w:rPr>
+          <w:color w:val="000000" w:themeColor="text1"/>
+          <w:sz w:val="22"/>
+          <w:szCs w:val="22"/>
+        </w:rPr>
+      </w:pPr>
+      <w:r>
+        <w:rPr>
+          <w:color w:val="000000" w:themeColor="text1"/>
+          <w:sz w:val="22"/>
+          <w:szCs w:val="22"/>
+        </w:rPr>
+        <w:t>await fs.mkdir(`uploads/users/${userId}`, { recursive: true });</w:t>
+      </w:r>
+      <w:r>
+        <w:rPr>
+          <w:color w:val="000000" w:themeColor="text1"/>
+          <w:sz w:val="22"/>
+          <w:szCs w:val="22"/>
+        </w:rPr>
+        <w:t xml:space="preserve"> the first one is the directory to be made the last in the directory is the userId which is the directory to be made, the other one is a function that tells our mkdir function to create any parent directory that does not exist already</w:t>
+      </w:r>
+    </w:p>
+    <w:p>
+      <w:pPr>
+        <w:pStyle w:val="ListParagraph"/>
+        <w:numPr>
+          <w:ilvl w:val="0"/>
+          <w:numId w:val="15"/>
+        </w:numPr>
+        <w:rPr>
+          <w:color w:val="000000" w:themeColor="text1"/>
+          <w:sz w:val="22"/>
+          <w:szCs w:val="22"/>
+        </w:rPr>
+      </w:pPr>
+      <w:r>
+        <w:rPr>
+          <w:color w:val="000000" w:themeColor="text1"/>
+          <w:sz w:val="22"/>
+          <w:szCs w:val="22"/>
+        </w:rPr>
+        <w:lastRenderedPageBreak/>
+        <w:t>fs.existsSync(</w:t>
+      </w:r>
+      <w:r>
+        <w:rPr>
+          <w:color w:val="000000" w:themeColor="text1"/>
+          <w:sz w:val="22"/>
+          <w:szCs w:val="22"/>
+        </w:rPr>
+        <w:t>‘file/directory). Returns a simple  Boolean of true or false. Sometimes we need to check that a file exist before doing some operation</w:t>
+      </w:r>
+    </w:p>
+    <w:p>
+      <w:pPr>
+        <w:rPr>
+          <w:b/>
+          <w:bCs/>
+          <w:color w:val="000000" w:themeColor="text1"/>
+          <w:u w:val="single"/>
+        </w:rPr>
+      </w:pPr>
+      <w:r>
+        <w:rPr>
+          <w:b/>
+          <w:bCs/>
+          <w:color w:val="000000" w:themeColor="text1"/>
+          <w:u w:val="single"/>
+        </w:rPr>
+        <w:t>NPM Dependency Manager:</w:t>
+      </w:r>
+    </w:p>
+    <w:p>
+      <w:pPr>
+        <w:pStyle w:val="ListParagraph"/>
+        <w:numPr>
+          <w:ilvl w:val="0"/>
+          <w:numId w:val="14"/>
+        </w:numPr>
+        <w:rPr>
+          <w:color w:val="000000" w:themeColor="text1"/>
+          <w:sz w:val="22"/>
+          <w:szCs w:val="22"/>
+        </w:rPr>
+      </w:pPr>
+      <w:r>
+        <w:rPr>
+          <w:color w:val="000000" w:themeColor="text1"/>
+          <w:sz w:val="22"/>
+          <w:szCs w:val="22"/>
+        </w:rPr>
+        <w:t>rs.pipe(ws);</w:t>
+      </w:r>
+      <w:r>
+        <w:rPr>
+          <w:color w:val="000000" w:themeColor="text1"/>
+          <w:sz w:val="22"/>
+          <w:szCs w:val="22"/>
+        </w:rPr>
+        <w:t xml:space="preserve"> the rs is for read stream, the ws is for write stream the main idea is to copy from a file into another file using the pipe. So no need to load the file into the memory</w:t>
+      </w:r>
+    </w:p>
+    <w:p>
+      <w:pPr>
+        <w:pStyle w:val="ListParagraph"/>
+        <w:numPr>
+          <w:ilvl w:val="0"/>
+          <w:numId w:val="14"/>
+        </w:numPr>
+        <w:rPr>
+          <w:color w:val="000000" w:themeColor="text1"/>
+          <w:sz w:val="22"/>
+          <w:szCs w:val="22"/>
+        </w:rPr>
+      </w:pPr>
+    </w:p>
+    <w:p>
+      <w:pPr>
+        <w:pStyle w:val="ListParagraph"/>
+        <w:numPr>
+          <w:ilvl w:val="0"/>
+          <w:numId w:val="14"/>
+        </w:numPr>
+        <w:rPr>
+          <w:color w:val="000000" w:themeColor="text1"/>
+          <w:sz w:val="22"/>
+          <w:szCs w:val="22"/>
+        </w:rPr>
+      </w:pPr>
     </w:p>
     <w:sectPr>
       <w:pgSz w:w="12240" w:h="15840"/>
@@ -5170,9 +5382,235 @@
     </w:lvl>
   </w:abstractNum>
   <w:abstractNum w:abstractNumId="12" w15:restartNumberingAfterBreak="0">
+    <w:nsid w:val="6BC479C5"/>
+    <w:multiLevelType w:val="hybridMultilevel"/>
+    <w:tmpl w:val="AC2E0260"/>
+    <w:lvl w:ilvl="0" w:tplc="04090001">
+      <w:start w:val="1"/>
+      <w:numFmt w:val="bullet"/>
+      <w:lvlText w:val=""/>
+      <w:lvlJc w:val="left"/>
+      <w:pPr>
+        <w:ind w:left="720" w:hanging="360"/>
+      </w:pPr>
+      <w:rPr>
+        <w:rFonts w:ascii="Symbol" w:hAnsi="Symbol" w:hint="default"/>
+      </w:rPr>
+    </w:lvl>
+    <w:lvl w:ilvl="1" w:tplc="04090003" w:tentative="1">
+      <w:start w:val="1"/>
+      <w:numFmt w:val="bullet"/>
+      <w:lvlText w:val="o"/>
+      <w:lvlJc w:val="left"/>
+      <w:pPr>
+        <w:ind w:left="1440" w:hanging="360"/>
+      </w:pPr>
+      <w:rPr>
+        <w:rFonts w:ascii="Courier New" w:hAnsi="Courier New" w:cs="Courier New" w:hint="default"/>
+      </w:rPr>
+    </w:lvl>
+    <w:lvl w:ilvl="2" w:tplc="04090005" w:tentative="1">
+      <w:start w:val="1"/>
+      <w:numFmt w:val="bullet"/>
+      <w:lvlText w:val=""/>
+      <w:lvlJc w:val="left"/>
+      <w:pPr>
+        <w:ind w:left="2160" w:hanging="360"/>
+      </w:pPr>
+      <w:rPr>
+        <w:rFonts w:ascii="Wingdings" w:hAnsi="Wingdings" w:hint="default"/>
+      </w:rPr>
+    </w:lvl>
+    <w:lvl w:ilvl="3" w:tplc="04090001" w:tentative="1">
+      <w:start w:val="1"/>
+      <w:numFmt w:val="bullet"/>
+      <w:lvlText w:val=""/>
+      <w:lvlJc w:val="left"/>
+      <w:pPr>
+        <w:ind w:left="2880" w:hanging="360"/>
+      </w:pPr>
+      <w:rPr>
+        <w:rFonts w:ascii="Symbol" w:hAnsi="Symbol" w:hint="default"/>
+      </w:rPr>
+    </w:lvl>
+    <w:lvl w:ilvl="4" w:tplc="04090003" w:tentative="1">
+      <w:start w:val="1"/>
+      <w:numFmt w:val="bullet"/>
+      <w:lvlText w:val="o"/>
+      <w:lvlJc w:val="left"/>
+      <w:pPr>
+        <w:ind w:left="3600" w:hanging="360"/>
+      </w:pPr>
+      <w:rPr>
+        <w:rFonts w:ascii="Courier New" w:hAnsi="Courier New" w:cs="Courier New" w:hint="default"/>
+      </w:rPr>
+    </w:lvl>
+    <w:lvl w:ilvl="5" w:tplc="04090005" w:tentative="1">
+      <w:start w:val="1"/>
+      <w:numFmt w:val="bullet"/>
+      <w:lvlText w:val=""/>
+      <w:lvlJc w:val="left"/>
+      <w:pPr>
+        <w:ind w:left="4320" w:hanging="360"/>
+      </w:pPr>
+      <w:rPr>
+        <w:rFonts w:ascii="Wingdings" w:hAnsi="Wingdings" w:hint="default"/>
+      </w:rPr>
+    </w:lvl>
+    <w:lvl w:ilvl="6" w:tplc="04090001" w:tentative="1">
+      <w:start w:val="1"/>
+      <w:numFmt w:val="bullet"/>
+      <w:lvlText w:val=""/>
+      <w:lvlJc w:val="left"/>
+      <w:pPr>
+        <w:ind w:left="5040" w:hanging="360"/>
+      </w:pPr>
+      <w:rPr>
+        <w:rFonts w:ascii="Symbol" w:hAnsi="Symbol" w:hint="default"/>
+      </w:rPr>
+    </w:lvl>
+    <w:lvl w:ilvl="7" w:tplc="04090003" w:tentative="1">
+      <w:start w:val="1"/>
+      <w:numFmt w:val="bullet"/>
+      <w:lvlText w:val="o"/>
+      <w:lvlJc w:val="left"/>
+      <w:pPr>
+        <w:ind w:left="5760" w:hanging="360"/>
+      </w:pPr>
+      <w:rPr>
+        <w:rFonts w:ascii="Courier New" w:hAnsi="Courier New" w:cs="Courier New" w:hint="default"/>
+      </w:rPr>
+    </w:lvl>
+    <w:lvl w:ilvl="8" w:tplc="04090005" w:tentative="1">
+      <w:start w:val="1"/>
+      <w:numFmt w:val="bullet"/>
+      <w:lvlText w:val=""/>
+      <w:lvlJc w:val="left"/>
+      <w:pPr>
+        <w:ind w:left="6480" w:hanging="360"/>
+      </w:pPr>
+      <w:rPr>
+        <w:rFonts w:ascii="Wingdings" w:hAnsi="Wingdings" w:hint="default"/>
+      </w:rPr>
+    </w:lvl>
+  </w:abstractNum>
+  <w:abstractNum w:abstractNumId="13" w15:restartNumberingAfterBreak="0">
     <w:nsid w:val="6EBB3E08"/>
     <w:multiLevelType w:val="hybridMultilevel"/>
     <w:tmpl w:val="F120050C"/>
+    <w:lvl w:ilvl="0" w:tplc="04090001">
+      <w:start w:val="1"/>
+      <w:numFmt w:val="bullet"/>
+      <w:lvlText w:val=""/>
+      <w:lvlJc w:val="left"/>
+      <w:pPr>
+        <w:ind w:left="720" w:hanging="360"/>
+      </w:pPr>
+      <w:rPr>
+        <w:rFonts w:ascii="Symbol" w:hAnsi="Symbol" w:hint="default"/>
+      </w:rPr>
+    </w:lvl>
+    <w:lvl w:ilvl="1" w:tplc="04090003" w:tentative="1">
+      <w:start w:val="1"/>
+      <w:numFmt w:val="bullet"/>
+      <w:lvlText w:val="o"/>
+      <w:lvlJc w:val="left"/>
+      <w:pPr>
+        <w:ind w:left="1440" w:hanging="360"/>
+      </w:pPr>
+      <w:rPr>
+        <w:rFonts w:ascii="Courier New" w:hAnsi="Courier New" w:cs="Courier New" w:hint="default"/>
+      </w:rPr>
+    </w:lvl>
+    <w:lvl w:ilvl="2" w:tplc="04090005" w:tentative="1">
+      <w:start w:val="1"/>
+      <w:numFmt w:val="bullet"/>
+      <w:lvlText w:val=""/>
+      <w:lvlJc w:val="left"/>
+      <w:pPr>
+        <w:ind w:left="2160" w:hanging="360"/>
+      </w:pPr>
+      <w:rPr>
+        <w:rFonts w:ascii="Wingdings" w:hAnsi="Wingdings" w:hint="default"/>
+      </w:rPr>
+    </w:lvl>
+    <w:lvl w:ilvl="3" w:tplc="04090001" w:tentative="1">
+      <w:start w:val="1"/>
+      <w:numFmt w:val="bullet"/>
+      <w:lvlText w:val=""/>
+      <w:lvlJc w:val="left"/>
+      <w:pPr>
+        <w:ind w:left="2880" w:hanging="360"/>
+      </w:pPr>
+      <w:rPr>
+        <w:rFonts w:ascii="Symbol" w:hAnsi="Symbol" w:hint="default"/>
+      </w:rPr>
+    </w:lvl>
+    <w:lvl w:ilvl="4" w:tplc="04090003" w:tentative="1">
+      <w:start w:val="1"/>
+      <w:numFmt w:val="bullet"/>
+      <w:lvlText w:val="o"/>
+      <w:lvlJc w:val="left"/>
+      <w:pPr>
+        <w:ind w:left="3600" w:hanging="360"/>
+      </w:pPr>
+      <w:rPr>
+        <w:rFonts w:ascii="Courier New" w:hAnsi="Courier New" w:cs="Courier New" w:hint="default"/>
+      </w:rPr>
+    </w:lvl>
+    <w:lvl w:ilvl="5" w:tplc="04090005" w:tentative="1">
+      <w:start w:val="1"/>
+      <w:numFmt w:val="bullet"/>
+      <w:lvlText w:val=""/>
+      <w:lvlJc w:val="left"/>
+      <w:pPr>
+        <w:ind w:left="4320" w:hanging="360"/>
+      </w:pPr>
+      <w:rPr>
+        <w:rFonts w:ascii="Wingdings" w:hAnsi="Wingdings" w:hint="default"/>
+      </w:rPr>
+    </w:lvl>
+    <w:lvl w:ilvl="6" w:tplc="04090001" w:tentative="1">
+      <w:start w:val="1"/>
+      <w:numFmt w:val="bullet"/>
+      <w:lvlText w:val=""/>
+      <w:lvlJc w:val="left"/>
+      <w:pPr>
+        <w:ind w:left="5040" w:hanging="360"/>
+      </w:pPr>
+      <w:rPr>
+        <w:rFonts w:ascii="Symbol" w:hAnsi="Symbol" w:hint="default"/>
+      </w:rPr>
+    </w:lvl>
+    <w:lvl w:ilvl="7" w:tplc="04090003" w:tentative="1">
+      <w:start w:val="1"/>
+      <w:numFmt w:val="bullet"/>
+      <w:lvlText w:val="o"/>
+      <w:lvlJc w:val="left"/>
+      <w:pPr>
+        <w:ind w:left="5760" w:hanging="360"/>
+      </w:pPr>
+      <w:rPr>
+        <w:rFonts w:ascii="Courier New" w:hAnsi="Courier New" w:cs="Courier New" w:hint="default"/>
+      </w:rPr>
+    </w:lvl>
+    <w:lvl w:ilvl="8" w:tplc="04090005" w:tentative="1">
+      <w:start w:val="1"/>
+      <w:numFmt w:val="bullet"/>
+      <w:lvlText w:val=""/>
+      <w:lvlJc w:val="left"/>
+      <w:pPr>
+        <w:ind w:left="6480" w:hanging="360"/>
+      </w:pPr>
+      <w:rPr>
+        <w:rFonts w:ascii="Wingdings" w:hAnsi="Wingdings" w:hint="default"/>
+      </w:rPr>
+    </w:lvl>
+  </w:abstractNum>
+  <w:abstractNum w:abstractNumId="14" w15:restartNumberingAfterBreak="0">
+    <w:nsid w:val="77721F32"/>
+    <w:multiLevelType w:val="hybridMultilevel"/>
+    <w:tmpl w:val="13760090"/>
     <w:lvl w:ilvl="0" w:tplc="04090001">
       <w:start w:val="1"/>
       <w:numFmt w:val="bullet"/>
@@ -5289,7 +5727,7 @@
     <w:abstractNumId w:val="9"/>
   </w:num>
   <w:num w:numId="3" w16cid:durableId="2060085104">
-    <w:abstractNumId w:val="12"/>
+    <w:abstractNumId w:val="13"/>
   </w:num>
   <w:num w:numId="4" w16cid:durableId="789473921">
     <w:abstractNumId w:val="5"/>
@@ -5320,6 +5758,12 @@
   </w:num>
   <w:num w:numId="13" w16cid:durableId="1560096834">
     <w:abstractNumId w:val="3"/>
+  </w:num>
+  <w:num w:numId="14" w16cid:durableId="167141314">
+    <w:abstractNumId w:val="12"/>
+  </w:num>
+  <w:num w:numId="15" w16cid:durableId="1711104382">
+    <w:abstractNumId w:val="14"/>
   </w:num>
 </w:numbering>
 </file>
@@ -5927,7 +6371,6 @@
   <w:style w:type="character" w:default="1" w:styleId="DefaultParagraphFont">
     <w:name w:val="Default Paragraph Font"/>
     <w:uiPriority w:val="1"/>
-    <w:semiHidden/>
     <w:unhideWhenUsed/>
   </w:style>
   <w:style w:type="table" w:default="1" w:styleId="TableNormal">

</xml_diff>

<commit_message>
add some middleware and routing notes
</commit_message>
<xml_diff>
--- a/Javascript/NodeJs Notes.docx
+++ b/Javascript/NodeJs Notes.docx
@@ -8838,10 +8838,38 @@
     </w:p>
     <w:p>
       <w:pPr>
+        <w:rPr>
+          <w:color w:val="000000" w:themeColor="text1"/>
+          <w:sz w:val="22"/>
+          <w:szCs w:val="22"/>
+        </w:rPr>
+      </w:pPr>
+    </w:p>
+    <w:p>
+      <w:pPr>
+        <w:rPr>
+          <w:b/>
+          <w:bCs/>
+          <w:color w:val="000000" w:themeColor="text1"/>
+          <w:u w:val="single"/>
+        </w:rPr>
+      </w:pPr>
+      <w:r>
+        <w:rPr>
+          <w:b/>
+          <w:bCs/>
+          <w:color w:val="000000" w:themeColor="text1"/>
+          <w:u w:val="single"/>
+        </w:rPr>
+        <w:t>Express:</w:t>
+      </w:r>
+    </w:p>
+    <w:p>
+      <w:pPr>
         <w:pStyle w:val="ListParagraph"/>
         <w:numPr>
           <w:ilvl w:val="0"/>
-          <w:numId w:val="16"/>
+          <w:numId w:val="17"/>
         </w:numPr>
         <w:rPr>
           <w:color w:val="000000" w:themeColor="text1"/>
@@ -8849,7 +8877,1510 @@
           <w:szCs w:val="22"/>
         </w:rPr>
       </w:pPr>
-    </w:p>
+      <w:r>
+        <w:rPr>
+          <w:b/>
+          <w:bCs/>
+          <w:color w:val="000000" w:themeColor="text1"/>
+          <w:sz w:val="22"/>
+          <w:szCs w:val="22"/>
+        </w:rPr>
+        <w:t xml:space="preserve">What is express.js: </w:t>
+      </w:r>
+      <w:r>
+        <w:rPr>
+          <w:color w:val="000000" w:themeColor="text1"/>
+          <w:sz w:val="22"/>
+          <w:szCs w:val="22"/>
+        </w:rPr>
+        <w:t>Express gives you tools that make it much easier to build web servers and APIs with Node.js.</w:t>
+      </w:r>
+      <w:r>
+        <w:rPr>
+          <w:color w:val="000000" w:themeColor="text1"/>
+          <w:sz w:val="22"/>
+          <w:szCs w:val="22"/>
+        </w:rPr>
+        <w:t xml:space="preserve"> </w:t>
+      </w:r>
+      <w:proofErr w:type="gramStart"/>
+      <w:r>
+        <w:rPr>
+          <w:color w:val="000000" w:themeColor="text1"/>
+          <w:sz w:val="22"/>
+          <w:szCs w:val="22"/>
+        </w:rPr>
+        <w:t>it’s</w:t>
+      </w:r>
+      <w:proofErr w:type="gramEnd"/>
+      <w:r>
+        <w:rPr>
+          <w:color w:val="000000" w:themeColor="text1"/>
+          <w:sz w:val="22"/>
+          <w:szCs w:val="22"/>
+        </w:rPr>
+        <w:t xml:space="preserve"> a framework built on top of </w:t>
+      </w:r>
+      <w:proofErr w:type="spellStart"/>
+      <w:proofErr w:type="gramStart"/>
+      <w:r>
+        <w:rPr>
+          <w:color w:val="000000" w:themeColor="text1"/>
+          <w:sz w:val="22"/>
+          <w:szCs w:val="22"/>
+        </w:rPr>
+        <w:t>javascript’s</w:t>
+      </w:r>
+      <w:proofErr w:type="spellEnd"/>
+      <w:proofErr w:type="gramEnd"/>
+      <w:r>
+        <w:rPr>
+          <w:color w:val="000000" w:themeColor="text1"/>
+          <w:sz w:val="22"/>
+          <w:szCs w:val="22"/>
+        </w:rPr>
+        <w:t xml:space="preserve"> node.js</w:t>
+      </w:r>
+    </w:p>
+    <w:p>
+      <w:pPr>
+        <w:pStyle w:val="ListParagraph"/>
+        <w:numPr>
+          <w:ilvl w:val="0"/>
+          <w:numId w:val="17"/>
+        </w:numPr>
+        <w:rPr>
+          <w:color w:val="000000" w:themeColor="text1"/>
+          <w:sz w:val="22"/>
+          <w:szCs w:val="22"/>
+        </w:rPr>
+      </w:pPr>
+      <w:r>
+        <w:rPr>
+          <w:color w:val="000000" w:themeColor="text1"/>
+          <w:sz w:val="22"/>
+          <w:szCs w:val="22"/>
+        </w:rPr>
+        <w:t xml:space="preserve">An Express Router lets you </w:t>
+      </w:r>
+      <w:proofErr w:type="gramStart"/>
+      <w:r>
+        <w:rPr>
+          <w:color w:val="000000" w:themeColor="text1"/>
+          <w:sz w:val="22"/>
+          <w:szCs w:val="22"/>
+        </w:rPr>
+        <w:t xml:space="preserve">group </w:t>
+      </w:r>
+      <w:proofErr w:type="gramEnd"/>
+      <w:r>
+        <w:rPr>
+          <w:color w:val="000000" w:themeColor="text1"/>
+          <w:sz w:val="22"/>
+          <w:szCs w:val="22"/>
+        </w:rPr>
+        <w:t>related routes together instead of putting every route inside your main app.js.</w:t>
+      </w:r>
+      <w:r>
+        <w:rPr>
+          <w:color w:val="000000" w:themeColor="text1"/>
+          <w:sz w:val="22"/>
+          <w:szCs w:val="22"/>
+        </w:rPr>
+        <w:t xml:space="preserve"> </w:t>
+      </w:r>
+      <w:proofErr w:type="gramStart"/>
+      <w:r>
+        <w:rPr>
+          <w:color w:val="000000" w:themeColor="text1"/>
+          <w:sz w:val="22"/>
+          <w:szCs w:val="22"/>
+        </w:rPr>
+        <w:t>so</w:t>
+      </w:r>
+      <w:proofErr w:type="gramEnd"/>
+      <w:r>
+        <w:rPr>
+          <w:color w:val="000000" w:themeColor="text1"/>
+          <w:sz w:val="22"/>
+          <w:szCs w:val="22"/>
+        </w:rPr>
+        <w:t xml:space="preserve"> each </w:t>
+      </w:r>
+      <w:proofErr w:type="gramStart"/>
+      <w:r>
+        <w:rPr>
+          <w:color w:val="000000" w:themeColor="text1"/>
+          <w:sz w:val="22"/>
+          <w:szCs w:val="22"/>
+        </w:rPr>
+        <w:t>entity</w:t>
+      </w:r>
+      <w:proofErr w:type="gramEnd"/>
+      <w:r>
+        <w:rPr>
+          <w:color w:val="000000" w:themeColor="text1"/>
+          <w:sz w:val="22"/>
+          <w:szCs w:val="22"/>
+        </w:rPr>
+        <w:t xml:space="preserve"> for </w:t>
+      </w:r>
+      <w:proofErr w:type="gramStart"/>
+      <w:r>
+        <w:rPr>
+          <w:color w:val="000000" w:themeColor="text1"/>
+          <w:sz w:val="22"/>
+          <w:szCs w:val="22"/>
+        </w:rPr>
+        <w:t>example</w:t>
+      </w:r>
+      <w:proofErr w:type="gramEnd"/>
+      <w:r>
+        <w:rPr>
+          <w:color w:val="000000" w:themeColor="text1"/>
+          <w:sz w:val="22"/>
+          <w:szCs w:val="22"/>
+        </w:rPr>
+        <w:t xml:space="preserve"> gets a router class inside the route directory and we export the router of each .</w:t>
+      </w:r>
+      <w:proofErr w:type="spellStart"/>
+      <w:r>
+        <w:rPr>
+          <w:color w:val="000000" w:themeColor="text1"/>
+          <w:sz w:val="22"/>
+          <w:szCs w:val="22"/>
+        </w:rPr>
+        <w:t>js</w:t>
+      </w:r>
+      <w:proofErr w:type="spellEnd"/>
+      <w:r>
+        <w:rPr>
+          <w:color w:val="000000" w:themeColor="text1"/>
+          <w:sz w:val="22"/>
+          <w:szCs w:val="22"/>
+        </w:rPr>
+        <w:t xml:space="preserve"> file and we import it into </w:t>
+      </w:r>
+      <w:proofErr w:type="gramStart"/>
+      <w:r>
+        <w:rPr>
+          <w:color w:val="000000" w:themeColor="text1"/>
+          <w:sz w:val="22"/>
+          <w:szCs w:val="22"/>
+        </w:rPr>
+        <w:t>he</w:t>
+      </w:r>
+      <w:proofErr w:type="gramEnd"/>
+      <w:r>
+        <w:rPr>
+          <w:color w:val="000000" w:themeColor="text1"/>
+          <w:sz w:val="22"/>
+          <w:szCs w:val="22"/>
+        </w:rPr>
+        <w:t xml:space="preserve"> main app.js to use it</w:t>
+      </w:r>
+    </w:p>
+    <w:p>
+      <w:pPr>
+        <w:pStyle w:val="ListParagraph"/>
+        <w:numPr>
+          <w:ilvl w:val="0"/>
+          <w:numId w:val="17"/>
+        </w:numPr>
+        <w:rPr>
+          <w:color w:val="000000" w:themeColor="text1"/>
+          <w:sz w:val="22"/>
+          <w:szCs w:val="22"/>
+        </w:rPr>
+      </w:pPr>
+      <w:proofErr w:type="spellStart"/>
+      <w:proofErr w:type="gramStart"/>
+      <w:r>
+        <w:rPr>
+          <w:color w:val="000000" w:themeColor="text1"/>
+          <w:sz w:val="22"/>
+          <w:szCs w:val="22"/>
+        </w:rPr>
+        <w:lastRenderedPageBreak/>
+        <w:t>app.use</w:t>
+      </w:r>
+      <w:proofErr w:type="spellEnd"/>
+      <w:r>
+        <w:rPr>
+          <w:color w:val="000000" w:themeColor="text1"/>
+          <w:sz w:val="22"/>
+          <w:szCs w:val="22"/>
+        </w:rPr>
+        <w:t>(</w:t>
+      </w:r>
+      <w:proofErr w:type="gramEnd"/>
+      <w:r>
+        <w:rPr>
+          <w:color w:val="000000" w:themeColor="text1"/>
+          <w:sz w:val="22"/>
+          <w:szCs w:val="22"/>
+        </w:rPr>
+        <w:t xml:space="preserve">) is used to </w:t>
+      </w:r>
+      <w:r>
+        <w:rPr>
+          <w:color w:val="000000" w:themeColor="text1"/>
+          <w:sz w:val="22"/>
+          <w:szCs w:val="22"/>
+        </w:rPr>
+        <w:t>run</w:t>
+      </w:r>
+      <w:r>
+        <w:rPr>
+          <w:color w:val="000000" w:themeColor="text1"/>
+          <w:sz w:val="22"/>
+          <w:szCs w:val="22"/>
+        </w:rPr>
+        <w:t xml:space="preserve"> middleware on your application. Middleware is a function that runs during the request/response cycle.</w:t>
+      </w:r>
+      <w:r>
+        <w:rPr>
+          <w:color w:val="000000" w:themeColor="text1"/>
+          <w:sz w:val="22"/>
+          <w:szCs w:val="22"/>
+        </w:rPr>
+        <w:t xml:space="preserve"> It takes 2 </w:t>
+      </w:r>
+      <w:proofErr w:type="gramStart"/>
+      <w:r>
+        <w:rPr>
+          <w:color w:val="000000" w:themeColor="text1"/>
+          <w:sz w:val="22"/>
+          <w:szCs w:val="22"/>
+        </w:rPr>
+        <w:t>parameters</w:t>
+      </w:r>
+      <w:proofErr w:type="gramEnd"/>
+      <w:r>
+        <w:rPr>
+          <w:color w:val="000000" w:themeColor="text1"/>
+          <w:sz w:val="22"/>
+          <w:szCs w:val="22"/>
+        </w:rPr>
+        <w:t xml:space="preserve"> the first is the path and the second is the callback function that we should run after the path</w:t>
+      </w:r>
+    </w:p>
+    <w:p>
+      <w:pPr>
+        <w:pStyle w:val="ListParagraph"/>
+        <w:numPr>
+          <w:ilvl w:val="0"/>
+          <w:numId w:val="17"/>
+        </w:numPr>
+        <w:rPr>
+          <w:color w:val="000000" w:themeColor="text1"/>
+          <w:sz w:val="22"/>
+          <w:szCs w:val="22"/>
+        </w:rPr>
+      </w:pPr>
+      <w:proofErr w:type="spellStart"/>
+      <w:proofErr w:type="gramStart"/>
+      <w:r>
+        <w:rPr>
+          <w:color w:val="000000" w:themeColor="text1"/>
+          <w:sz w:val="22"/>
+          <w:szCs w:val="22"/>
+        </w:rPr>
+        <w:t>app.use</w:t>
+      </w:r>
+      <w:proofErr w:type="spellEnd"/>
+      <w:r>
+        <w:rPr>
+          <w:color w:val="000000" w:themeColor="text1"/>
+          <w:sz w:val="22"/>
+          <w:szCs w:val="22"/>
+        </w:rPr>
+        <w:t>(</w:t>
+      </w:r>
+      <w:proofErr w:type="gramEnd"/>
+      <w:r>
+        <w:rPr>
+          <w:color w:val="000000" w:themeColor="text1"/>
+          <w:sz w:val="22"/>
+          <w:szCs w:val="22"/>
+        </w:rPr>
+        <w:t>) tells Express: "Use this middleware for incoming requests."</w:t>
+      </w:r>
+    </w:p>
+    <w:p>
+      <w:pPr>
+        <w:pStyle w:val="ListParagraph"/>
+        <w:numPr>
+          <w:ilvl w:val="0"/>
+          <w:numId w:val="17"/>
+        </w:numPr>
+        <w:rPr>
+          <w:color w:val="000000" w:themeColor="text1"/>
+          <w:sz w:val="22"/>
+          <w:szCs w:val="22"/>
+        </w:rPr>
+      </w:pPr>
+      <w:r>
+        <w:rPr>
+          <w:color w:val="000000" w:themeColor="text1"/>
+          <w:sz w:val="22"/>
+          <w:szCs w:val="22"/>
+        </w:rPr>
+        <w:t xml:space="preserve">router is an </w:t>
+      </w:r>
+      <w:r>
+        <w:rPr>
+          <w:color w:val="000000" w:themeColor="text1"/>
+          <w:sz w:val="22"/>
+          <w:szCs w:val="22"/>
+        </w:rPr>
+        <w:t>object created by Express</w:t>
+      </w:r>
+      <w:r>
+        <w:rPr>
+          <w:color w:val="000000" w:themeColor="text1"/>
+          <w:sz w:val="22"/>
+          <w:szCs w:val="22"/>
+        </w:rPr>
+        <w:t xml:space="preserve"> that lets you define routes separately from your main app</w:t>
+      </w:r>
+    </w:p>
+    <w:p>
+      <w:pPr>
+        <w:pStyle w:val="ListParagraph"/>
+        <w:numPr>
+          <w:ilvl w:val="0"/>
+          <w:numId w:val="17"/>
+        </w:numPr>
+        <w:rPr>
+          <w:color w:val="000000" w:themeColor="text1"/>
+          <w:sz w:val="22"/>
+          <w:szCs w:val="22"/>
+        </w:rPr>
+      </w:pPr>
+      <w:proofErr w:type="gramStart"/>
+      <w:r>
+        <w:rPr>
+          <w:color w:val="000000" w:themeColor="text1"/>
+          <w:sz w:val="22"/>
+          <w:szCs w:val="22"/>
+        </w:rPr>
+        <w:t>the</w:t>
+      </w:r>
+      <w:proofErr w:type="gramEnd"/>
+      <w:r>
+        <w:rPr>
+          <w:color w:val="000000" w:themeColor="text1"/>
+          <w:sz w:val="22"/>
+          <w:szCs w:val="22"/>
+        </w:rPr>
+        <w:t xml:space="preserve"> </w:t>
+      </w:r>
+      <w:proofErr w:type="spellStart"/>
+      <w:proofErr w:type="gramStart"/>
+      <w:r>
+        <w:rPr>
+          <w:color w:val="000000" w:themeColor="text1"/>
+          <w:sz w:val="22"/>
+          <w:szCs w:val="22"/>
+        </w:rPr>
+        <w:t>router.httpMethod</w:t>
+      </w:r>
+      <w:proofErr w:type="spellEnd"/>
+      <w:proofErr w:type="gramEnd"/>
+      <w:r>
+        <w:rPr>
+          <w:color w:val="000000" w:themeColor="text1"/>
+          <w:sz w:val="22"/>
+          <w:szCs w:val="22"/>
+        </w:rPr>
+        <w:t xml:space="preserve">() takes 2 parameters the first one is the path of the request and the second one a handler callback function </w:t>
+      </w:r>
+      <w:r>
+        <w:rPr>
+          <w:color w:val="000000" w:themeColor="text1"/>
+          <w:sz w:val="22"/>
+          <w:szCs w:val="22"/>
+        </w:rPr>
+        <w:sym w:font="Wingdings" w:char="F0E0"/>
+      </w:r>
+      <w:r>
+        <w:rPr>
+          <w:color w:val="000000" w:themeColor="text1"/>
+          <w:sz w:val="22"/>
+          <w:szCs w:val="22"/>
+        </w:rPr>
+        <w:t xml:space="preserve"> (req, res) =&gt; </w:t>
+      </w:r>
+      <w:r>
+        <w:rPr>
+          <w:color w:val="000000" w:themeColor="text1"/>
+          <w:sz w:val="22"/>
+          <w:szCs w:val="22"/>
+        </w:rPr>
+        <w:t>{}</w:t>
+      </w:r>
+    </w:p>
+    <w:p>
+      <w:pPr>
+        <w:pStyle w:val="ListParagraph"/>
+        <w:numPr>
+          <w:ilvl w:val="0"/>
+          <w:numId w:val="17"/>
+        </w:numPr>
+        <w:rPr>
+          <w:color w:val="000000" w:themeColor="text1"/>
+          <w:sz w:val="22"/>
+          <w:szCs w:val="22"/>
+        </w:rPr>
+      </w:pPr>
+      <w:r>
+        <w:rPr>
+          <w:color w:val="000000" w:themeColor="text1"/>
+          <w:sz w:val="22"/>
+          <w:szCs w:val="22"/>
+        </w:rPr>
+        <w:t>A dynamic URL parameter is a part of the URL that changes depending on what resource the user wants.</w:t>
+      </w:r>
+    </w:p>
+    <w:p>
+      <w:pPr>
+        <w:pStyle w:val="ListParagraph"/>
+        <w:numPr>
+          <w:ilvl w:val="0"/>
+          <w:numId w:val="17"/>
+        </w:numPr>
+        <w:rPr>
+          <w:color w:val="000000" w:themeColor="text1"/>
+          <w:sz w:val="22"/>
+          <w:szCs w:val="22"/>
+        </w:rPr>
+      </w:pPr>
+      <w:proofErr w:type="spellStart"/>
+      <w:proofErr w:type="gramStart"/>
+      <w:r>
+        <w:rPr>
+          <w:color w:val="000000" w:themeColor="text1"/>
+          <w:sz w:val="22"/>
+          <w:szCs w:val="22"/>
+        </w:rPr>
+        <w:t>router.get</w:t>
+      </w:r>
+      <w:proofErr w:type="spellEnd"/>
+      <w:r>
+        <w:rPr>
+          <w:color w:val="000000" w:themeColor="text1"/>
+          <w:sz w:val="22"/>
+          <w:szCs w:val="22"/>
+        </w:rPr>
+        <w:t>(</w:t>
+      </w:r>
+      <w:proofErr w:type="gramEnd"/>
+      <w:r>
+        <w:rPr>
+          <w:color w:val="000000" w:themeColor="text1"/>
+          <w:sz w:val="22"/>
+          <w:szCs w:val="22"/>
+        </w:rPr>
+        <w:t>"/:id", (req, res) =&gt; {</w:t>
+      </w:r>
+    </w:p>
+    <w:p>
+      <w:pPr>
+        <w:ind w:left="720"/>
+        <w:rPr>
+          <w:color w:val="000000" w:themeColor="text1"/>
+          <w:sz w:val="22"/>
+          <w:szCs w:val="22"/>
+        </w:rPr>
+      </w:pPr>
+      <w:r>
+        <w:rPr>
+          <w:color w:val="000000" w:themeColor="text1"/>
+          <w:sz w:val="22"/>
+          <w:szCs w:val="22"/>
+        </w:rPr>
+        <w:t xml:space="preserve">  // ...</w:t>
+      </w:r>
+    </w:p>
+    <w:p>
+      <w:pPr>
+        <w:ind w:left="720"/>
+        <w:rPr>
+          <w:color w:val="000000" w:themeColor="text1"/>
+          <w:sz w:val="22"/>
+          <w:szCs w:val="22"/>
+        </w:rPr>
+      </w:pPr>
+      <w:r>
+        <w:rPr>
+          <w:color w:val="000000" w:themeColor="text1"/>
+          <w:sz w:val="22"/>
+          <w:szCs w:val="22"/>
+        </w:rPr>
+        <w:t>});</w:t>
+      </w:r>
+      <w:r>
+        <w:rPr>
+          <w:color w:val="000000" w:themeColor="text1"/>
+          <w:sz w:val="22"/>
+          <w:szCs w:val="22"/>
+        </w:rPr>
+        <w:t xml:space="preserve"> the id is the dynamic parameter</w:t>
+      </w:r>
+    </w:p>
+    <w:p>
+      <w:pPr>
+        <w:pStyle w:val="ListParagraph"/>
+        <w:numPr>
+          <w:ilvl w:val="0"/>
+          <w:numId w:val="17"/>
+        </w:numPr>
+        <w:rPr>
+          <w:color w:val="000000" w:themeColor="text1"/>
+          <w:sz w:val="22"/>
+          <w:szCs w:val="22"/>
+        </w:rPr>
+      </w:pPr>
+      <w:proofErr w:type="spellStart"/>
+      <w:proofErr w:type="gramStart"/>
+      <w:r>
+        <w:rPr>
+          <w:color w:val="000000" w:themeColor="text1"/>
+          <w:sz w:val="22"/>
+          <w:szCs w:val="22"/>
+        </w:rPr>
+        <w:t>req.params</w:t>
+      </w:r>
+      <w:proofErr w:type="gramEnd"/>
+      <w:r>
+        <w:rPr>
+          <w:color w:val="000000" w:themeColor="text1"/>
+          <w:sz w:val="22"/>
+          <w:szCs w:val="22"/>
+        </w:rPr>
+        <w:t>.valuePassedInURL</w:t>
+      </w:r>
+      <w:proofErr w:type="spellEnd"/>
+      <w:r>
+        <w:rPr>
+          <w:color w:val="000000" w:themeColor="text1"/>
+          <w:sz w:val="22"/>
+          <w:szCs w:val="22"/>
+        </w:rPr>
+        <w:t xml:space="preserve">: </w:t>
+      </w:r>
+      <w:r>
+        <w:rPr>
+          <w:color w:val="000000" w:themeColor="text1"/>
+          <w:sz w:val="22"/>
+          <w:szCs w:val="22"/>
+        </w:rPr>
+        <w:t xml:space="preserve">the </w:t>
+      </w:r>
+      <w:proofErr w:type="spellStart"/>
+      <w:proofErr w:type="gramStart"/>
+      <w:r>
+        <w:rPr>
+          <w:color w:val="000000" w:themeColor="text1"/>
+          <w:sz w:val="22"/>
+          <w:szCs w:val="22"/>
+        </w:rPr>
+        <w:t>request.params</w:t>
+      </w:r>
+      <w:proofErr w:type="spellEnd"/>
+      <w:proofErr w:type="gramEnd"/>
+      <w:r>
+        <w:rPr>
+          <w:color w:val="000000" w:themeColor="text1"/>
+          <w:sz w:val="22"/>
+          <w:szCs w:val="22"/>
+        </w:rPr>
+        <w:t xml:space="preserve"> contains the data that </w:t>
+      </w:r>
+      <w:proofErr w:type="gramStart"/>
+      <w:r>
+        <w:rPr>
+          <w:color w:val="000000" w:themeColor="text1"/>
+          <w:sz w:val="22"/>
+          <w:szCs w:val="22"/>
+        </w:rPr>
+        <w:t>where</w:t>
+      </w:r>
+      <w:proofErr w:type="gramEnd"/>
+      <w:r>
+        <w:rPr>
+          <w:color w:val="000000" w:themeColor="text1"/>
+          <w:sz w:val="22"/>
+          <w:szCs w:val="22"/>
+        </w:rPr>
+        <w:t xml:space="preserve"> passed to the URL such as </w:t>
+      </w:r>
+      <w:proofErr w:type="spellStart"/>
+      <w:proofErr w:type="gramStart"/>
+      <w:r>
+        <w:rPr>
+          <w:color w:val="000000" w:themeColor="text1"/>
+          <w:sz w:val="22"/>
+          <w:szCs w:val="22"/>
+        </w:rPr>
+        <w:t>id,name</w:t>
+      </w:r>
+      <w:proofErr w:type="spellEnd"/>
+      <w:proofErr w:type="gramEnd"/>
+      <w:r>
+        <w:rPr>
+          <w:color w:val="000000" w:themeColor="text1"/>
+          <w:sz w:val="22"/>
+          <w:szCs w:val="22"/>
+        </w:rPr>
+        <w:t xml:space="preserve"> or any parameters in the URL</w:t>
+      </w:r>
+    </w:p>
+    <w:p>
+      <w:pPr>
+        <w:pStyle w:val="ListParagraph"/>
+        <w:numPr>
+          <w:ilvl w:val="0"/>
+          <w:numId w:val="17"/>
+        </w:numPr>
+        <w:rPr>
+          <w:color w:val="000000" w:themeColor="text1"/>
+          <w:sz w:val="22"/>
+          <w:szCs w:val="22"/>
+        </w:rPr>
+      </w:pPr>
+      <w:r>
+        <w:rPr>
+          <w:color w:val="000000" w:themeColor="text1"/>
+          <w:sz w:val="22"/>
+          <w:szCs w:val="22"/>
+        </w:rPr>
+        <w:t xml:space="preserve">in case in a </w:t>
+      </w:r>
+      <w:proofErr w:type="gramStart"/>
+      <w:r>
+        <w:rPr>
+          <w:color w:val="000000" w:themeColor="text1"/>
+          <w:sz w:val="22"/>
+          <w:szCs w:val="22"/>
+        </w:rPr>
+        <w:t>route</w:t>
+      </w:r>
+      <w:proofErr w:type="gramEnd"/>
+      <w:r>
+        <w:rPr>
+          <w:color w:val="000000" w:themeColor="text1"/>
+          <w:sz w:val="22"/>
+          <w:szCs w:val="22"/>
+        </w:rPr>
+        <w:t xml:space="preserve"> we have 10 methods do they get executed by the order they are written</w:t>
+      </w:r>
+    </w:p>
+    <w:p>
+      <w:pPr>
+        <w:pStyle w:val="ListParagraph"/>
+        <w:numPr>
+          <w:ilvl w:val="0"/>
+          <w:numId w:val="17"/>
+        </w:numPr>
+        <w:rPr>
+          <w:color w:val="000000" w:themeColor="text1"/>
+          <w:sz w:val="22"/>
+          <w:szCs w:val="22"/>
+        </w:rPr>
+      </w:pPr>
+      <w:proofErr w:type="spellStart"/>
+      <w:proofErr w:type="gramStart"/>
+      <w:r>
+        <w:rPr>
+          <w:color w:val="000000" w:themeColor="text1"/>
+          <w:sz w:val="22"/>
+          <w:szCs w:val="22"/>
+        </w:rPr>
+        <w:t>router.route</w:t>
+      </w:r>
+      <w:proofErr w:type="spellEnd"/>
+      <w:proofErr w:type="gramEnd"/>
+      <w:r>
+        <w:rPr>
+          <w:color w:val="000000" w:themeColor="text1"/>
+          <w:sz w:val="22"/>
+          <w:szCs w:val="22"/>
+        </w:rPr>
+        <w:t>("/:id")</w:t>
+      </w:r>
+      <w:r>
+        <w:rPr>
+          <w:color w:val="000000" w:themeColor="text1"/>
+          <w:sz w:val="22"/>
+          <w:szCs w:val="22"/>
+        </w:rPr>
+        <w:t xml:space="preserve"> is used since we can have many http methods related to the same </w:t>
+      </w:r>
+      <w:proofErr w:type="spellStart"/>
+      <w:r>
+        <w:rPr>
+          <w:color w:val="000000" w:themeColor="text1"/>
+          <w:sz w:val="22"/>
+          <w:szCs w:val="22"/>
+        </w:rPr>
+        <w:t>url</w:t>
+      </w:r>
+      <w:proofErr w:type="spellEnd"/>
+      <w:r>
+        <w:rPr>
+          <w:color w:val="000000" w:themeColor="text1"/>
+          <w:sz w:val="22"/>
+          <w:szCs w:val="22"/>
+        </w:rPr>
+        <w:t xml:space="preserve"> path</w:t>
+      </w:r>
+      <w:r>
+        <w:rPr>
+          <w:color w:val="000000" w:themeColor="text1"/>
+          <w:sz w:val="22"/>
+          <w:szCs w:val="22"/>
+        </w:rPr>
+        <w:t xml:space="preserve">. Instead of writing 4 methods for the same </w:t>
+      </w:r>
+      <w:proofErr w:type="gramStart"/>
+      <w:r>
+        <w:rPr>
+          <w:color w:val="000000" w:themeColor="text1"/>
+          <w:sz w:val="22"/>
+          <w:szCs w:val="22"/>
+        </w:rPr>
+        <w:t>parameter</w:t>
+      </w:r>
+      <w:proofErr w:type="gramEnd"/>
+      <w:r>
+        <w:rPr>
+          <w:color w:val="000000" w:themeColor="text1"/>
+          <w:sz w:val="22"/>
+          <w:szCs w:val="22"/>
+        </w:rPr>
+        <w:t xml:space="preserve"> we write only one and let all the http methods operate beneath it</w:t>
+      </w:r>
+    </w:p>
+    <w:p>
+      <w:pPr>
+        <w:pStyle w:val="ListParagraph"/>
+        <w:numPr>
+          <w:ilvl w:val="0"/>
+          <w:numId w:val="17"/>
+        </w:numPr>
+        <w:rPr>
+          <w:color w:val="000000" w:themeColor="text1"/>
+          <w:sz w:val="22"/>
+          <w:szCs w:val="22"/>
+        </w:rPr>
+      </w:pPr>
+      <w:proofErr w:type="spellStart"/>
+      <w:proofErr w:type="gramStart"/>
+      <w:r>
+        <w:rPr>
+          <w:color w:val="000000" w:themeColor="text1"/>
+          <w:sz w:val="22"/>
+          <w:szCs w:val="22"/>
+        </w:rPr>
+        <w:t>router.param</w:t>
+      </w:r>
+      <w:proofErr w:type="spellEnd"/>
+      <w:proofErr w:type="gramEnd"/>
+      <w:r>
+        <w:rPr>
+          <w:color w:val="000000" w:themeColor="text1"/>
+          <w:sz w:val="22"/>
+          <w:szCs w:val="22"/>
+        </w:rPr>
+        <w:t>()</w:t>
+      </w:r>
+      <w:r>
+        <w:rPr>
+          <w:color w:val="000000" w:themeColor="text1"/>
+          <w:sz w:val="22"/>
+          <w:szCs w:val="22"/>
+        </w:rPr>
+        <w:t xml:space="preserve"> is a function that runs first when a certain parameter appears. </w:t>
+      </w:r>
+    </w:p>
+    <w:p>
+      <w:pPr>
+        <w:pStyle w:val="ListParagraph"/>
+        <w:numPr>
+          <w:ilvl w:val="0"/>
+          <w:numId w:val="17"/>
+        </w:numPr>
+        <w:rPr>
+          <w:color w:val="000000" w:themeColor="text1"/>
+          <w:sz w:val="22"/>
+          <w:szCs w:val="22"/>
+        </w:rPr>
+      </w:pPr>
+      <w:r>
+        <w:rPr>
+          <w:color w:val="000000" w:themeColor="text1"/>
+          <w:sz w:val="22"/>
+          <w:szCs w:val="22"/>
+        </w:rPr>
+        <w:t xml:space="preserve">next is </w:t>
+      </w:r>
+      <w:proofErr w:type="gramStart"/>
+      <w:r>
+        <w:rPr>
+          <w:color w:val="000000" w:themeColor="text1"/>
+          <w:sz w:val="22"/>
+          <w:szCs w:val="22"/>
+        </w:rPr>
+        <w:t>actually a</w:t>
+      </w:r>
+      <w:proofErr w:type="gramEnd"/>
+      <w:r>
+        <w:rPr>
+          <w:color w:val="000000" w:themeColor="text1"/>
+          <w:sz w:val="22"/>
+          <w:szCs w:val="22"/>
+        </w:rPr>
+        <w:t xml:space="preserve"> </w:t>
+      </w:r>
+      <w:r>
+        <w:rPr>
+          <w:color w:val="000000" w:themeColor="text1"/>
+          <w:sz w:val="22"/>
+          <w:szCs w:val="22"/>
+        </w:rPr>
+        <w:t>function</w:t>
+      </w:r>
+      <w:r>
+        <w:rPr>
+          <w:color w:val="000000" w:themeColor="text1"/>
+          <w:sz w:val="22"/>
+          <w:szCs w:val="22"/>
+        </w:rPr>
+        <w:t>, not really an "attribute."</w:t>
+      </w:r>
+      <w:r>
+        <w:rPr>
+          <w:color w:val="000000" w:themeColor="text1"/>
+          <w:sz w:val="22"/>
+          <w:szCs w:val="22"/>
+        </w:rPr>
+        <w:t xml:space="preserve">  </w:t>
+      </w:r>
+      <w:proofErr w:type="gramStart"/>
+      <w:r>
+        <w:rPr>
+          <w:color w:val="000000" w:themeColor="text1"/>
+          <w:sz w:val="22"/>
+          <w:szCs w:val="22"/>
+        </w:rPr>
+        <w:t>next(</w:t>
+      </w:r>
+      <w:proofErr w:type="gramEnd"/>
+      <w:r>
+        <w:rPr>
+          <w:color w:val="000000" w:themeColor="text1"/>
+          <w:sz w:val="22"/>
+          <w:szCs w:val="22"/>
+        </w:rPr>
+        <w:t>) tells Express:</w:t>
+      </w:r>
+      <w:r>
+        <w:rPr>
+          <w:color w:val="000000" w:themeColor="text1"/>
+          <w:sz w:val="22"/>
+          <w:szCs w:val="22"/>
+        </w:rPr>
+        <w:t xml:space="preserve"> </w:t>
+      </w:r>
+      <w:r>
+        <w:rPr>
+          <w:color w:val="000000" w:themeColor="text1"/>
+          <w:sz w:val="22"/>
+          <w:szCs w:val="22"/>
+        </w:rPr>
+        <w:t>"I'm done here. Move to the next middleware or handler."</w:t>
+      </w:r>
+    </w:p>
+    <w:p>
+      <w:pPr>
+        <w:pStyle w:val="ListParagraph"/>
+        <w:numPr>
+          <w:ilvl w:val="0"/>
+          <w:numId w:val="17"/>
+        </w:numPr>
+        <w:rPr>
+          <w:color w:val="000000" w:themeColor="text1"/>
+          <w:sz w:val="22"/>
+          <w:szCs w:val="22"/>
+        </w:rPr>
+      </w:pPr>
+      <w:r>
+        <w:rPr>
+          <w:color w:val="000000" w:themeColor="text1"/>
+          <w:sz w:val="22"/>
+          <w:szCs w:val="22"/>
+        </w:rPr>
+        <w:t xml:space="preserve">Finally, </w:t>
+      </w:r>
+      <w:proofErr w:type="spellStart"/>
+      <w:proofErr w:type="gramStart"/>
+      <w:r>
+        <w:rPr>
+          <w:color w:val="000000" w:themeColor="text1"/>
+          <w:sz w:val="22"/>
+          <w:szCs w:val="22"/>
+        </w:rPr>
+        <w:t>req.query</w:t>
+      </w:r>
+      <w:proofErr w:type="spellEnd"/>
+      <w:proofErr w:type="gramEnd"/>
+      <w:r>
+        <w:rPr>
+          <w:color w:val="000000" w:themeColor="text1"/>
+          <w:sz w:val="22"/>
+          <w:szCs w:val="22"/>
+        </w:rPr>
+        <w:t xml:space="preserve"> is used to access query-string parameters.</w:t>
+      </w:r>
+      <w:r>
+        <w:rPr>
+          <w:color w:val="000000" w:themeColor="text1"/>
+          <w:sz w:val="22"/>
+          <w:szCs w:val="22"/>
+        </w:rPr>
+        <w:t xml:space="preserve"> It can be used for filtering</w:t>
+      </w:r>
+    </w:p>
+    <w:p>
+      <w:pPr>
+        <w:rPr>
+          <w:b/>
+          <w:bCs/>
+          <w:color w:val="000000" w:themeColor="text1"/>
+          <w:u w:val="single"/>
+        </w:rPr>
+      </w:pPr>
+    </w:p>
+    <w:p>
+      <w:pPr>
+        <w:rPr>
+          <w:b/>
+          <w:bCs/>
+          <w:color w:val="000000" w:themeColor="text1"/>
+          <w:u w:val="single"/>
+        </w:rPr>
+      </w:pPr>
+      <w:r>
+        <w:rPr>
+          <w:b/>
+          <w:bCs/>
+          <w:color w:val="000000" w:themeColor="text1"/>
+          <w:u w:val="single"/>
+        </w:rPr>
+        <w:t>Middleware:</w:t>
+      </w:r>
+    </w:p>
+    <w:p>
+      <w:pPr>
+        <w:pStyle w:val="ListParagraph"/>
+        <w:numPr>
+          <w:ilvl w:val="0"/>
+          <w:numId w:val="18"/>
+        </w:numPr>
+        <w:rPr>
+          <w:color w:val="000000" w:themeColor="text1"/>
+          <w:sz w:val="22"/>
+          <w:szCs w:val="22"/>
+        </w:rPr>
+      </w:pPr>
+      <w:r>
+        <w:rPr>
+          <w:color w:val="000000" w:themeColor="text1"/>
+          <w:sz w:val="22"/>
+          <w:szCs w:val="22"/>
+        </w:rPr>
+        <w:t>Middleware is code that runs between the beginning and the ending of an http request</w:t>
+      </w:r>
+    </w:p>
+    <w:p>
+      <w:pPr>
+        <w:pStyle w:val="ListParagraph"/>
+        <w:numPr>
+          <w:ilvl w:val="0"/>
+          <w:numId w:val="18"/>
+        </w:numPr>
+        <w:rPr>
+          <w:color w:val="000000" w:themeColor="text1"/>
+          <w:sz w:val="22"/>
+          <w:szCs w:val="22"/>
+        </w:rPr>
+      </w:pPr>
+      <w:r>
+        <w:rPr>
+          <w:color w:val="000000" w:themeColor="text1"/>
+          <w:sz w:val="22"/>
+          <w:szCs w:val="22"/>
+        </w:rPr>
+        <w:t>We need middleware for separation of concerns, reusability, and modularity. Instead of cramming every single piece of logic (logging, authentication, parsing, compression, routing, error handling) into one giant route handler, we break it into small, focused, reusable pieces.</w:t>
+      </w:r>
+    </w:p>
+    <w:p>
+      <w:pPr>
+        <w:pStyle w:val="ListParagraph"/>
+        <w:numPr>
+          <w:ilvl w:val="0"/>
+          <w:numId w:val="18"/>
+        </w:numPr>
+        <w:rPr>
+          <w:color w:val="000000" w:themeColor="text1"/>
+          <w:sz w:val="22"/>
+          <w:szCs w:val="22"/>
+        </w:rPr>
+      </w:pPr>
+      <w:r>
+        <w:rPr>
+          <w:color w:val="000000" w:themeColor="text1"/>
+          <w:sz w:val="22"/>
+          <w:szCs w:val="22"/>
+        </w:rPr>
+        <w:t xml:space="preserve">One of the most important built in middleware in </w:t>
+      </w:r>
+      <w:proofErr w:type="spellStart"/>
+      <w:proofErr w:type="gramStart"/>
+      <w:r>
+        <w:rPr>
+          <w:color w:val="000000" w:themeColor="text1"/>
+          <w:sz w:val="22"/>
+          <w:szCs w:val="22"/>
+        </w:rPr>
+        <w:t>express.json</w:t>
+      </w:r>
+      <w:proofErr w:type="spellEnd"/>
+      <w:proofErr w:type="gramEnd"/>
+      <w:r>
+        <w:rPr>
+          <w:color w:val="000000" w:themeColor="text1"/>
+          <w:sz w:val="22"/>
+          <w:szCs w:val="22"/>
+        </w:rPr>
+        <w:t xml:space="preserve"> </w:t>
+      </w:r>
+      <w:proofErr w:type="gramStart"/>
+      <w:r>
+        <w:rPr>
+          <w:color w:val="000000" w:themeColor="text1"/>
+          <w:sz w:val="22"/>
+          <w:szCs w:val="22"/>
+        </w:rPr>
+        <w:t>is .static</w:t>
+      </w:r>
+      <w:proofErr w:type="gramEnd"/>
+      <w:r>
+        <w:rPr>
+          <w:color w:val="000000" w:themeColor="text1"/>
+          <w:sz w:val="22"/>
+          <w:szCs w:val="22"/>
+        </w:rPr>
+        <w:t xml:space="preserve"> </w:t>
+      </w:r>
+      <w:proofErr w:type="gramStart"/>
+      <w:r>
+        <w:rPr>
+          <w:color w:val="000000" w:themeColor="text1"/>
+          <w:sz w:val="22"/>
+          <w:szCs w:val="22"/>
+        </w:rPr>
+        <w:t>and .</w:t>
+      </w:r>
+      <w:proofErr w:type="spellStart"/>
+      <w:r>
+        <w:rPr>
+          <w:color w:val="000000" w:themeColor="text1"/>
+          <w:sz w:val="22"/>
+          <w:szCs w:val="22"/>
+        </w:rPr>
+        <w:t>json</w:t>
+      </w:r>
+      <w:proofErr w:type="spellEnd"/>
+      <w:proofErr w:type="gramEnd"/>
+    </w:p>
+    <w:p>
+      <w:pPr>
+        <w:pStyle w:val="ListParagraph"/>
+        <w:numPr>
+          <w:ilvl w:val="0"/>
+          <w:numId w:val="18"/>
+        </w:numPr>
+        <w:rPr>
+          <w:color w:val="000000" w:themeColor="text1"/>
+          <w:sz w:val="22"/>
+          <w:szCs w:val="22"/>
+        </w:rPr>
+      </w:pPr>
+      <w:proofErr w:type="spellStart"/>
+      <w:proofErr w:type="gramStart"/>
+      <w:r>
+        <w:rPr>
+          <w:color w:val="000000" w:themeColor="text1"/>
+          <w:sz w:val="22"/>
+          <w:szCs w:val="22"/>
+        </w:rPr>
+        <w:t>express.static</w:t>
+      </w:r>
+      <w:proofErr w:type="spellEnd"/>
+      <w:proofErr w:type="gramEnd"/>
+      <w:r>
+        <w:rPr>
+          <w:color w:val="000000" w:themeColor="text1"/>
+          <w:sz w:val="22"/>
+          <w:szCs w:val="22"/>
+        </w:rPr>
+        <w:t> (Serving Static Files)</w:t>
+      </w:r>
+      <w:r>
+        <w:rPr>
+          <w:color w:val="000000" w:themeColor="text1"/>
+          <w:sz w:val="22"/>
+          <w:szCs w:val="22"/>
+        </w:rPr>
+        <w:t xml:space="preserve">: </w:t>
+      </w:r>
+      <w:r>
+        <w:rPr>
+          <w:color w:val="000000" w:themeColor="text1"/>
+          <w:sz w:val="22"/>
+          <w:szCs w:val="22"/>
+        </w:rPr>
+        <w:t>This middleware handles serving files like HTML, CSS, JavaScript images, and PDFs from a directory on your server. Instead of writing logic to read files (</w:t>
+      </w:r>
+      <w:proofErr w:type="spellStart"/>
+      <w:proofErr w:type="gramStart"/>
+      <w:r>
+        <w:rPr>
+          <w:color w:val="000000" w:themeColor="text1"/>
+          <w:sz w:val="22"/>
+          <w:szCs w:val="22"/>
+        </w:rPr>
+        <w:t>fs.readFile</w:t>
+      </w:r>
+      <w:proofErr w:type="spellEnd"/>
+      <w:proofErr w:type="gramEnd"/>
+      <w:r>
+        <w:rPr>
+          <w:color w:val="000000" w:themeColor="text1"/>
+          <w:sz w:val="22"/>
+          <w:szCs w:val="22"/>
+        </w:rPr>
+        <w:t>) for every asset, you delegate it to </w:t>
+      </w:r>
+      <w:proofErr w:type="spellStart"/>
+      <w:proofErr w:type="gramStart"/>
+      <w:r>
+        <w:rPr>
+          <w:color w:val="000000" w:themeColor="text1"/>
+          <w:sz w:val="22"/>
+          <w:szCs w:val="22"/>
+        </w:rPr>
+        <w:t>express.static</w:t>
+      </w:r>
+      <w:proofErr w:type="spellEnd"/>
+      <w:proofErr w:type="gramEnd"/>
+      <w:r>
+        <w:rPr>
+          <w:color w:val="000000" w:themeColor="text1"/>
+          <w:sz w:val="22"/>
+          <w:szCs w:val="22"/>
+        </w:rPr>
+        <w:t>.</w:t>
+      </w:r>
+    </w:p>
+    <w:p>
+      <w:pPr>
+        <w:pStyle w:val="ListParagraph"/>
+        <w:numPr>
+          <w:ilvl w:val="0"/>
+          <w:numId w:val="18"/>
+        </w:numPr>
+        <w:rPr>
+          <w:color w:val="000000" w:themeColor="text1"/>
+          <w:sz w:val="22"/>
+          <w:szCs w:val="22"/>
+        </w:rPr>
+      </w:pPr>
+      <w:r>
+        <w:rPr>
+          <w:color w:val="000000" w:themeColor="text1"/>
+          <w:sz w:val="22"/>
+          <w:szCs w:val="22"/>
+        </w:rPr>
+        <w:t>Built-in Middleware 2: </w:t>
+      </w:r>
+      <w:proofErr w:type="spellStart"/>
+      <w:proofErr w:type="gramStart"/>
+      <w:r>
+        <w:rPr>
+          <w:color w:val="000000" w:themeColor="text1"/>
+          <w:sz w:val="22"/>
+          <w:szCs w:val="22"/>
+        </w:rPr>
+        <w:t>express.json</w:t>
+      </w:r>
+      <w:proofErr w:type="spellEnd"/>
+      <w:proofErr w:type="gramEnd"/>
+      <w:r>
+        <w:rPr>
+          <w:color w:val="000000" w:themeColor="text1"/>
+          <w:sz w:val="22"/>
+          <w:szCs w:val="22"/>
+        </w:rPr>
+        <w:t> (Parsing JSON Bodies) &amp; </w:t>
+      </w:r>
+      <w:proofErr w:type="spellStart"/>
+      <w:proofErr w:type="gramStart"/>
+      <w:r>
+        <w:rPr>
+          <w:color w:val="000000" w:themeColor="text1"/>
+          <w:sz w:val="22"/>
+          <w:szCs w:val="22"/>
+        </w:rPr>
+        <w:t>req.body</w:t>
+      </w:r>
+      <w:proofErr w:type="spellEnd"/>
+      <w:proofErr w:type="gramEnd"/>
+      <w:r>
+        <w:rPr>
+          <w:color w:val="000000" w:themeColor="text1"/>
+          <w:sz w:val="22"/>
+          <w:szCs w:val="22"/>
+        </w:rPr>
+        <w:t xml:space="preserve">: </w:t>
+      </w:r>
+      <w:r>
+        <w:rPr>
+          <w:color w:val="000000" w:themeColor="text1"/>
+          <w:sz w:val="22"/>
+          <w:szCs w:val="22"/>
+        </w:rPr>
+        <w:t>When a client sends a POST/PUT/PATCH request with a JSON payload in the body, the raw data arrives as a string. </w:t>
+      </w:r>
+      <w:proofErr w:type="spellStart"/>
+      <w:proofErr w:type="gramStart"/>
+      <w:r>
+        <w:rPr>
+          <w:color w:val="000000" w:themeColor="text1"/>
+          <w:sz w:val="22"/>
+          <w:szCs w:val="22"/>
+        </w:rPr>
+        <w:t>express.json</w:t>
+      </w:r>
+      <w:proofErr w:type="spellEnd"/>
+      <w:proofErr w:type="gramEnd"/>
+      <w:r>
+        <w:rPr>
+          <w:color w:val="000000" w:themeColor="text1"/>
+          <w:sz w:val="22"/>
+          <w:szCs w:val="22"/>
+        </w:rPr>
+        <w:t>() parses that string into a JavaScript object and attaches it to </w:t>
+      </w:r>
+      <w:proofErr w:type="spellStart"/>
+      <w:proofErr w:type="gramStart"/>
+      <w:r>
+        <w:rPr>
+          <w:color w:val="000000" w:themeColor="text1"/>
+          <w:sz w:val="22"/>
+          <w:szCs w:val="22"/>
+        </w:rPr>
+        <w:t>req.body</w:t>
+      </w:r>
+      <w:proofErr w:type="spellEnd"/>
+      <w:proofErr w:type="gramEnd"/>
+      <w:r>
+        <w:rPr>
+          <w:color w:val="000000" w:themeColor="text1"/>
+          <w:sz w:val="22"/>
+          <w:szCs w:val="22"/>
+        </w:rPr>
+        <w:t>. Without it, </w:t>
+      </w:r>
+      <w:proofErr w:type="spellStart"/>
+      <w:proofErr w:type="gramStart"/>
+      <w:r>
+        <w:rPr>
+          <w:color w:val="000000" w:themeColor="text1"/>
+          <w:sz w:val="22"/>
+          <w:szCs w:val="22"/>
+        </w:rPr>
+        <w:t>req.body</w:t>
+      </w:r>
+      <w:proofErr w:type="spellEnd"/>
+      <w:proofErr w:type="gramEnd"/>
+      <w:r>
+        <w:rPr>
+          <w:color w:val="000000" w:themeColor="text1"/>
+          <w:sz w:val="22"/>
+          <w:szCs w:val="22"/>
+        </w:rPr>
+        <w:t> would be undefined.</w:t>
+      </w:r>
+    </w:p>
+    <w:p>
+      <w:pPr>
+        <w:pStyle w:val="ListParagraph"/>
+        <w:numPr>
+          <w:ilvl w:val="0"/>
+          <w:numId w:val="18"/>
+        </w:numPr>
+      </w:pPr>
+      <w:proofErr w:type="spellStart"/>
+      <w:proofErr w:type="gramStart"/>
+      <w:r>
+        <w:lastRenderedPageBreak/>
+        <w:t>express.static</w:t>
+      </w:r>
+      <w:proofErr w:type="spellEnd"/>
+      <w:proofErr w:type="gramEnd"/>
+      <w:r>
+        <w:br/>
+        <w:t>Built-in middleware that serves static files (HTML, CSS, images, client-side JS) from a given directory. Example: </w:t>
+      </w:r>
+      <w:proofErr w:type="spellStart"/>
+      <w:r>
+        <w:t>app.use</w:t>
+      </w:r>
+      <w:proofErr w:type="spellEnd"/>
+      <w:r>
+        <w:t>(</w:t>
+      </w:r>
+      <w:proofErr w:type="spellStart"/>
+      <w:proofErr w:type="gramStart"/>
+      <w:r>
+        <w:t>express.static</w:t>
+      </w:r>
+      <w:proofErr w:type="spellEnd"/>
+      <w:proofErr w:type="gramEnd"/>
+      <w:r>
+        <w:t>('public')) makes files in the /public folder accessible to the browser.</w:t>
+      </w:r>
+    </w:p>
+    <w:p>
+      <w:pPr>
+        <w:pStyle w:val="ListParagraph"/>
+        <w:numPr>
+          <w:ilvl w:val="0"/>
+          <w:numId w:val="18"/>
+        </w:numPr>
+      </w:pPr>
+      <w:proofErr w:type="spellStart"/>
+      <w:proofErr w:type="gramStart"/>
+      <w:r>
+        <w:t>req.body</w:t>
+      </w:r>
+      <w:proofErr w:type="spellEnd"/>
+      <w:proofErr w:type="gramEnd"/>
+      <w:r>
+        <w:br/>
+        <w:t>An object that contains the data sent by the client in the request body (e.g., from a form submission or JSON payload). </w:t>
+      </w:r>
+      <w:r>
+        <w:rPr>
+          <w:b/>
+          <w:bCs/>
+        </w:rPr>
+        <w:t>Note:</w:t>
+      </w:r>
+      <w:r>
+        <w:t> It starts out undefined—you must use body-parsing middleware to populate it.</w:t>
+      </w:r>
+    </w:p>
+    <w:p>
+      <w:pPr>
+        <w:pStyle w:val="ListParagraph"/>
+        <w:numPr>
+          <w:ilvl w:val="0"/>
+          <w:numId w:val="18"/>
+        </w:numPr>
+      </w:pPr>
+      <w:proofErr w:type="spellStart"/>
+      <w:proofErr w:type="gramStart"/>
+      <w:r>
+        <w:t>res.redirect</w:t>
+      </w:r>
+      <w:proofErr w:type="spellEnd"/>
+      <w:proofErr w:type="gramEnd"/>
+      <w:r>
+        <w:br/>
+        <w:t>A response method that sends an HTTP redirect (default status 302) to the client, telling the browser to navigate to a different URL. Example: </w:t>
+      </w:r>
+      <w:proofErr w:type="spellStart"/>
+      <w:proofErr w:type="gramStart"/>
+      <w:r>
+        <w:t>res.redirect</w:t>
+      </w:r>
+      <w:proofErr w:type="spellEnd"/>
+      <w:proofErr w:type="gramEnd"/>
+      <w:r>
+        <w:t>('/login').</w:t>
+      </w:r>
+    </w:p>
+    <w:p>
+      <w:pPr>
+        <w:pStyle w:val="ListParagraph"/>
+        <w:numPr>
+          <w:ilvl w:val="0"/>
+          <w:numId w:val="18"/>
+        </w:numPr>
+      </w:pPr>
+      <w:proofErr w:type="spellStart"/>
+      <w:proofErr w:type="gramStart"/>
+      <w:r>
+        <w:t>express.json</w:t>
+      </w:r>
+      <w:proofErr w:type="spellEnd"/>
+      <w:proofErr w:type="gramEnd"/>
+      <w:r>
+        <w:t>()</w:t>
+      </w:r>
+      <w:r>
+        <w:br/>
+        <w:t>Built-in middleware that parses incoming requests with a Content-Type: application/</w:t>
+      </w:r>
+      <w:proofErr w:type="spellStart"/>
+      <w:r>
+        <w:t>json</w:t>
+      </w:r>
+      <w:proofErr w:type="spellEnd"/>
+      <w:r>
+        <w:t> header. It automatically parses the JSON payload and populates </w:t>
+      </w:r>
+      <w:proofErr w:type="spellStart"/>
+      <w:proofErr w:type="gramStart"/>
+      <w:r>
+        <w:t>req.body</w:t>
+      </w:r>
+      <w:proofErr w:type="spellEnd"/>
+      <w:proofErr w:type="gramEnd"/>
+      <w:r>
+        <w:t> with the resulting JavaScript object.</w:t>
+      </w:r>
+    </w:p>
+    <w:p>
+      <w:pPr>
+        <w:pStyle w:val="ListParagraph"/>
+        <w:numPr>
+          <w:ilvl w:val="0"/>
+          <w:numId w:val="18"/>
+        </w:numPr>
+        <w:rPr>
+          <w:color w:val="000000" w:themeColor="text1"/>
+          <w:sz w:val="22"/>
+          <w:szCs w:val="22"/>
+        </w:rPr>
+      </w:pPr>
+    </w:p>
+    <w:p/>
     <w:sectPr>
       <w:pgSz w:w="12240" w:h="15840"/>
       <w:pgMar w:top="1417" w:right="1417" w:bottom="1134" w:left="1417" w:header="720" w:footer="720" w:gutter="0"/>
@@ -9654,6 +11185,268 @@
     </w:lvl>
   </w:abstractNum>
   <w:abstractNum w:abstractNumId="7" w15:restartNumberingAfterBreak="0">
+    <w:nsid w:val="2E9F5795"/>
+    <w:multiLevelType w:val="multilevel"/>
+    <w:tmpl w:val="5A607360"/>
+    <w:lvl w:ilvl="0">
+      <w:start w:val="1"/>
+      <w:numFmt w:val="bullet"/>
+      <w:lvlText w:val=""/>
+      <w:lvlJc w:val="left"/>
+      <w:pPr>
+        <w:tabs>
+          <w:tab w:val="num" w:pos="720"/>
+        </w:tabs>
+        <w:ind w:left="720" w:hanging="360"/>
+      </w:pPr>
+      <w:rPr>
+        <w:rFonts w:ascii="Symbol" w:hAnsi="Symbol" w:hint="default"/>
+        <w:sz w:val="20"/>
+      </w:rPr>
+    </w:lvl>
+    <w:lvl w:ilvl="1" w:tentative="1">
+      <w:start w:val="1"/>
+      <w:numFmt w:val="bullet"/>
+      <w:lvlText w:val="o"/>
+      <w:lvlJc w:val="left"/>
+      <w:pPr>
+        <w:tabs>
+          <w:tab w:val="num" w:pos="1440"/>
+        </w:tabs>
+        <w:ind w:left="1440" w:hanging="360"/>
+      </w:pPr>
+      <w:rPr>
+        <w:rFonts w:ascii="Courier New" w:hAnsi="Courier New" w:hint="default"/>
+        <w:sz w:val="20"/>
+      </w:rPr>
+    </w:lvl>
+    <w:lvl w:ilvl="2" w:tentative="1">
+      <w:start w:val="1"/>
+      <w:numFmt w:val="bullet"/>
+      <w:lvlText w:val=""/>
+      <w:lvlJc w:val="left"/>
+      <w:pPr>
+        <w:tabs>
+          <w:tab w:val="num" w:pos="2160"/>
+        </w:tabs>
+        <w:ind w:left="2160" w:hanging="360"/>
+      </w:pPr>
+      <w:rPr>
+        <w:rFonts w:ascii="Wingdings" w:hAnsi="Wingdings" w:hint="default"/>
+        <w:sz w:val="20"/>
+      </w:rPr>
+    </w:lvl>
+    <w:lvl w:ilvl="3" w:tentative="1">
+      <w:start w:val="1"/>
+      <w:numFmt w:val="bullet"/>
+      <w:lvlText w:val=""/>
+      <w:lvlJc w:val="left"/>
+      <w:pPr>
+        <w:tabs>
+          <w:tab w:val="num" w:pos="2880"/>
+        </w:tabs>
+        <w:ind w:left="2880" w:hanging="360"/>
+      </w:pPr>
+      <w:rPr>
+        <w:rFonts w:ascii="Wingdings" w:hAnsi="Wingdings" w:hint="default"/>
+        <w:sz w:val="20"/>
+      </w:rPr>
+    </w:lvl>
+    <w:lvl w:ilvl="4" w:tentative="1">
+      <w:start w:val="1"/>
+      <w:numFmt w:val="bullet"/>
+      <w:lvlText w:val=""/>
+      <w:lvlJc w:val="left"/>
+      <w:pPr>
+        <w:tabs>
+          <w:tab w:val="num" w:pos="3600"/>
+        </w:tabs>
+        <w:ind w:left="3600" w:hanging="360"/>
+      </w:pPr>
+      <w:rPr>
+        <w:rFonts w:ascii="Wingdings" w:hAnsi="Wingdings" w:hint="default"/>
+        <w:sz w:val="20"/>
+      </w:rPr>
+    </w:lvl>
+    <w:lvl w:ilvl="5" w:tentative="1">
+      <w:start w:val="1"/>
+      <w:numFmt w:val="bullet"/>
+      <w:lvlText w:val=""/>
+      <w:lvlJc w:val="left"/>
+      <w:pPr>
+        <w:tabs>
+          <w:tab w:val="num" w:pos="4320"/>
+        </w:tabs>
+        <w:ind w:left="4320" w:hanging="360"/>
+      </w:pPr>
+      <w:rPr>
+        <w:rFonts w:ascii="Wingdings" w:hAnsi="Wingdings" w:hint="default"/>
+        <w:sz w:val="20"/>
+      </w:rPr>
+    </w:lvl>
+    <w:lvl w:ilvl="6" w:tentative="1">
+      <w:start w:val="1"/>
+      <w:numFmt w:val="bullet"/>
+      <w:lvlText w:val=""/>
+      <w:lvlJc w:val="left"/>
+      <w:pPr>
+        <w:tabs>
+          <w:tab w:val="num" w:pos="5040"/>
+        </w:tabs>
+        <w:ind w:left="5040" w:hanging="360"/>
+      </w:pPr>
+      <w:rPr>
+        <w:rFonts w:ascii="Wingdings" w:hAnsi="Wingdings" w:hint="default"/>
+        <w:sz w:val="20"/>
+      </w:rPr>
+    </w:lvl>
+    <w:lvl w:ilvl="7" w:tentative="1">
+      <w:start w:val="1"/>
+      <w:numFmt w:val="bullet"/>
+      <w:lvlText w:val=""/>
+      <w:lvlJc w:val="left"/>
+      <w:pPr>
+        <w:tabs>
+          <w:tab w:val="num" w:pos="5760"/>
+        </w:tabs>
+        <w:ind w:left="5760" w:hanging="360"/>
+      </w:pPr>
+      <w:rPr>
+        <w:rFonts w:ascii="Wingdings" w:hAnsi="Wingdings" w:hint="default"/>
+        <w:sz w:val="20"/>
+      </w:rPr>
+    </w:lvl>
+    <w:lvl w:ilvl="8" w:tentative="1">
+      <w:start w:val="1"/>
+      <w:numFmt w:val="bullet"/>
+      <w:lvlText w:val=""/>
+      <w:lvlJc w:val="left"/>
+      <w:pPr>
+        <w:tabs>
+          <w:tab w:val="num" w:pos="6480"/>
+        </w:tabs>
+        <w:ind w:left="6480" w:hanging="360"/>
+      </w:pPr>
+      <w:rPr>
+        <w:rFonts w:ascii="Wingdings" w:hAnsi="Wingdings" w:hint="default"/>
+        <w:sz w:val="20"/>
+      </w:rPr>
+    </w:lvl>
+  </w:abstractNum>
+  <w:abstractNum w:abstractNumId="8" w15:restartNumberingAfterBreak="0">
+    <w:nsid w:val="2FF75F83"/>
+    <w:multiLevelType w:val="hybridMultilevel"/>
+    <w:tmpl w:val="854C207C"/>
+    <w:lvl w:ilvl="0" w:tplc="04090001">
+      <w:start w:val="1"/>
+      <w:numFmt w:val="bullet"/>
+      <w:lvlText w:val=""/>
+      <w:lvlJc w:val="left"/>
+      <w:pPr>
+        <w:ind w:left="720" w:hanging="360"/>
+      </w:pPr>
+      <w:rPr>
+        <w:rFonts w:ascii="Symbol" w:hAnsi="Symbol" w:hint="default"/>
+      </w:rPr>
+    </w:lvl>
+    <w:lvl w:ilvl="1" w:tplc="04090003" w:tentative="1">
+      <w:start w:val="1"/>
+      <w:numFmt w:val="bullet"/>
+      <w:lvlText w:val="o"/>
+      <w:lvlJc w:val="left"/>
+      <w:pPr>
+        <w:ind w:left="1440" w:hanging="360"/>
+      </w:pPr>
+      <w:rPr>
+        <w:rFonts w:ascii="Courier New" w:hAnsi="Courier New" w:cs="Courier New" w:hint="default"/>
+      </w:rPr>
+    </w:lvl>
+    <w:lvl w:ilvl="2" w:tplc="04090005" w:tentative="1">
+      <w:start w:val="1"/>
+      <w:numFmt w:val="bullet"/>
+      <w:lvlText w:val=""/>
+      <w:lvlJc w:val="left"/>
+      <w:pPr>
+        <w:ind w:left="2160" w:hanging="360"/>
+      </w:pPr>
+      <w:rPr>
+        <w:rFonts w:ascii="Wingdings" w:hAnsi="Wingdings" w:hint="default"/>
+      </w:rPr>
+    </w:lvl>
+    <w:lvl w:ilvl="3" w:tplc="04090001" w:tentative="1">
+      <w:start w:val="1"/>
+      <w:numFmt w:val="bullet"/>
+      <w:lvlText w:val=""/>
+      <w:lvlJc w:val="left"/>
+      <w:pPr>
+        <w:ind w:left="2880" w:hanging="360"/>
+      </w:pPr>
+      <w:rPr>
+        <w:rFonts w:ascii="Symbol" w:hAnsi="Symbol" w:hint="default"/>
+      </w:rPr>
+    </w:lvl>
+    <w:lvl w:ilvl="4" w:tplc="04090003" w:tentative="1">
+      <w:start w:val="1"/>
+      <w:numFmt w:val="bullet"/>
+      <w:lvlText w:val="o"/>
+      <w:lvlJc w:val="left"/>
+      <w:pPr>
+        <w:ind w:left="3600" w:hanging="360"/>
+      </w:pPr>
+      <w:rPr>
+        <w:rFonts w:ascii="Courier New" w:hAnsi="Courier New" w:cs="Courier New" w:hint="default"/>
+      </w:rPr>
+    </w:lvl>
+    <w:lvl w:ilvl="5" w:tplc="04090005" w:tentative="1">
+      <w:start w:val="1"/>
+      <w:numFmt w:val="bullet"/>
+      <w:lvlText w:val=""/>
+      <w:lvlJc w:val="left"/>
+      <w:pPr>
+        <w:ind w:left="4320" w:hanging="360"/>
+      </w:pPr>
+      <w:rPr>
+        <w:rFonts w:ascii="Wingdings" w:hAnsi="Wingdings" w:hint="default"/>
+      </w:rPr>
+    </w:lvl>
+    <w:lvl w:ilvl="6" w:tplc="04090001" w:tentative="1">
+      <w:start w:val="1"/>
+      <w:numFmt w:val="bullet"/>
+      <w:lvlText w:val=""/>
+      <w:lvlJc w:val="left"/>
+      <w:pPr>
+        <w:ind w:left="5040" w:hanging="360"/>
+      </w:pPr>
+      <w:rPr>
+        <w:rFonts w:ascii="Symbol" w:hAnsi="Symbol" w:hint="default"/>
+      </w:rPr>
+    </w:lvl>
+    <w:lvl w:ilvl="7" w:tplc="04090003" w:tentative="1">
+      <w:start w:val="1"/>
+      <w:numFmt w:val="bullet"/>
+      <w:lvlText w:val="o"/>
+      <w:lvlJc w:val="left"/>
+      <w:pPr>
+        <w:ind w:left="5760" w:hanging="360"/>
+      </w:pPr>
+      <w:rPr>
+        <w:rFonts w:ascii="Courier New" w:hAnsi="Courier New" w:cs="Courier New" w:hint="default"/>
+      </w:rPr>
+    </w:lvl>
+    <w:lvl w:ilvl="8" w:tplc="04090005" w:tentative="1">
+      <w:start w:val="1"/>
+      <w:numFmt w:val="bullet"/>
+      <w:lvlText w:val=""/>
+      <w:lvlJc w:val="left"/>
+      <w:pPr>
+        <w:ind w:left="6480" w:hanging="360"/>
+      </w:pPr>
+      <w:rPr>
+        <w:rFonts w:ascii="Wingdings" w:hAnsi="Wingdings" w:hint="default"/>
+      </w:rPr>
+    </w:lvl>
+  </w:abstractNum>
+  <w:abstractNum w:abstractNumId="9" w15:restartNumberingAfterBreak="0">
     <w:nsid w:val="309453B7"/>
     <w:multiLevelType w:val="hybridMultilevel"/>
     <w:tmpl w:val="DA42B9D6"/>
@@ -9766,7 +11559,7 @@
       </w:rPr>
     </w:lvl>
   </w:abstractNum>
-  <w:abstractNum w:abstractNumId="8" w15:restartNumberingAfterBreak="0">
+  <w:abstractNum w:abstractNumId="10" w15:restartNumberingAfterBreak="0">
     <w:nsid w:val="44FE0155"/>
     <w:multiLevelType w:val="hybridMultilevel"/>
     <w:tmpl w:val="DFB0041E"/>
@@ -9879,7 +11672,7 @@
       </w:rPr>
     </w:lvl>
   </w:abstractNum>
-  <w:abstractNum w:abstractNumId="9" w15:restartNumberingAfterBreak="0">
+  <w:abstractNum w:abstractNumId="11" w15:restartNumberingAfterBreak="0">
     <w:nsid w:val="55DC1621"/>
     <w:multiLevelType w:val="hybridMultilevel"/>
     <w:tmpl w:val="3196C1F0"/>
@@ -9992,7 +11785,7 @@
       </w:rPr>
     </w:lvl>
   </w:abstractNum>
-  <w:abstractNum w:abstractNumId="10" w15:restartNumberingAfterBreak="0">
+  <w:abstractNum w:abstractNumId="12" w15:restartNumberingAfterBreak="0">
     <w:nsid w:val="5F3420C3"/>
     <w:multiLevelType w:val="multilevel"/>
     <w:tmpl w:val="148CB8AC"/>
@@ -10141,7 +11934,7 @@
       </w:rPr>
     </w:lvl>
   </w:abstractNum>
-  <w:abstractNum w:abstractNumId="11" w15:restartNumberingAfterBreak="0">
+  <w:abstractNum w:abstractNumId="13" w15:restartNumberingAfterBreak="0">
     <w:nsid w:val="65CA4ADB"/>
     <w:multiLevelType w:val="hybridMultilevel"/>
     <w:tmpl w:val="2CA04056"/>
@@ -10254,7 +12047,7 @@
       </w:rPr>
     </w:lvl>
   </w:abstractNum>
-  <w:abstractNum w:abstractNumId="12" w15:restartNumberingAfterBreak="0">
+  <w:abstractNum w:abstractNumId="14" w15:restartNumberingAfterBreak="0">
     <w:nsid w:val="685F64C5"/>
     <w:multiLevelType w:val="hybridMultilevel"/>
     <w:tmpl w:val="D95C4462"/>
@@ -10367,7 +12160,7 @@
       </w:rPr>
     </w:lvl>
   </w:abstractNum>
-  <w:abstractNum w:abstractNumId="13" w15:restartNumberingAfterBreak="0">
+  <w:abstractNum w:abstractNumId="15" w15:restartNumberingAfterBreak="0">
     <w:nsid w:val="6BC479C5"/>
     <w:multiLevelType w:val="hybridMultilevel"/>
     <w:tmpl w:val="AC2E0260"/>
@@ -10480,7 +12273,7 @@
       </w:rPr>
     </w:lvl>
   </w:abstractNum>
-  <w:abstractNum w:abstractNumId="14" w15:restartNumberingAfterBreak="0">
+  <w:abstractNum w:abstractNumId="16" w15:restartNumberingAfterBreak="0">
     <w:nsid w:val="6EBB3E08"/>
     <w:multiLevelType w:val="hybridMultilevel"/>
     <w:tmpl w:val="F120050C"/>
@@ -10593,10 +12386,272 @@
       </w:rPr>
     </w:lvl>
   </w:abstractNum>
-  <w:abstractNum w:abstractNumId="15" w15:restartNumberingAfterBreak="0">
+  <w:abstractNum w:abstractNumId="17" w15:restartNumberingAfterBreak="0">
+    <w:nsid w:val="75690130"/>
+    <w:multiLevelType w:val="multilevel"/>
+    <w:tmpl w:val="69988C80"/>
+    <w:lvl w:ilvl="0">
+      <w:start w:val="1"/>
+      <w:numFmt w:val="bullet"/>
+      <w:lvlText w:val=""/>
+      <w:lvlJc w:val="left"/>
+      <w:pPr>
+        <w:tabs>
+          <w:tab w:val="num" w:pos="720"/>
+        </w:tabs>
+        <w:ind w:left="720" w:hanging="360"/>
+      </w:pPr>
+      <w:rPr>
+        <w:rFonts w:ascii="Symbol" w:hAnsi="Symbol" w:hint="default"/>
+        <w:sz w:val="20"/>
+      </w:rPr>
+    </w:lvl>
+    <w:lvl w:ilvl="1" w:tentative="1">
+      <w:start w:val="1"/>
+      <w:numFmt w:val="bullet"/>
+      <w:lvlText w:val="o"/>
+      <w:lvlJc w:val="left"/>
+      <w:pPr>
+        <w:tabs>
+          <w:tab w:val="num" w:pos="1440"/>
+        </w:tabs>
+        <w:ind w:left="1440" w:hanging="360"/>
+      </w:pPr>
+      <w:rPr>
+        <w:rFonts w:ascii="Courier New" w:hAnsi="Courier New" w:hint="default"/>
+        <w:sz w:val="20"/>
+      </w:rPr>
+    </w:lvl>
+    <w:lvl w:ilvl="2" w:tentative="1">
+      <w:start w:val="1"/>
+      <w:numFmt w:val="bullet"/>
+      <w:lvlText w:val=""/>
+      <w:lvlJc w:val="left"/>
+      <w:pPr>
+        <w:tabs>
+          <w:tab w:val="num" w:pos="2160"/>
+        </w:tabs>
+        <w:ind w:left="2160" w:hanging="360"/>
+      </w:pPr>
+      <w:rPr>
+        <w:rFonts w:ascii="Wingdings" w:hAnsi="Wingdings" w:hint="default"/>
+        <w:sz w:val="20"/>
+      </w:rPr>
+    </w:lvl>
+    <w:lvl w:ilvl="3" w:tentative="1">
+      <w:start w:val="1"/>
+      <w:numFmt w:val="bullet"/>
+      <w:lvlText w:val=""/>
+      <w:lvlJc w:val="left"/>
+      <w:pPr>
+        <w:tabs>
+          <w:tab w:val="num" w:pos="2880"/>
+        </w:tabs>
+        <w:ind w:left="2880" w:hanging="360"/>
+      </w:pPr>
+      <w:rPr>
+        <w:rFonts w:ascii="Wingdings" w:hAnsi="Wingdings" w:hint="default"/>
+        <w:sz w:val="20"/>
+      </w:rPr>
+    </w:lvl>
+    <w:lvl w:ilvl="4" w:tentative="1">
+      <w:start w:val="1"/>
+      <w:numFmt w:val="bullet"/>
+      <w:lvlText w:val=""/>
+      <w:lvlJc w:val="left"/>
+      <w:pPr>
+        <w:tabs>
+          <w:tab w:val="num" w:pos="3600"/>
+        </w:tabs>
+        <w:ind w:left="3600" w:hanging="360"/>
+      </w:pPr>
+      <w:rPr>
+        <w:rFonts w:ascii="Wingdings" w:hAnsi="Wingdings" w:hint="default"/>
+        <w:sz w:val="20"/>
+      </w:rPr>
+    </w:lvl>
+    <w:lvl w:ilvl="5" w:tentative="1">
+      <w:start w:val="1"/>
+      <w:numFmt w:val="bullet"/>
+      <w:lvlText w:val=""/>
+      <w:lvlJc w:val="left"/>
+      <w:pPr>
+        <w:tabs>
+          <w:tab w:val="num" w:pos="4320"/>
+        </w:tabs>
+        <w:ind w:left="4320" w:hanging="360"/>
+      </w:pPr>
+      <w:rPr>
+        <w:rFonts w:ascii="Wingdings" w:hAnsi="Wingdings" w:hint="default"/>
+        <w:sz w:val="20"/>
+      </w:rPr>
+    </w:lvl>
+    <w:lvl w:ilvl="6" w:tentative="1">
+      <w:start w:val="1"/>
+      <w:numFmt w:val="bullet"/>
+      <w:lvlText w:val=""/>
+      <w:lvlJc w:val="left"/>
+      <w:pPr>
+        <w:tabs>
+          <w:tab w:val="num" w:pos="5040"/>
+        </w:tabs>
+        <w:ind w:left="5040" w:hanging="360"/>
+      </w:pPr>
+      <w:rPr>
+        <w:rFonts w:ascii="Wingdings" w:hAnsi="Wingdings" w:hint="default"/>
+        <w:sz w:val="20"/>
+      </w:rPr>
+    </w:lvl>
+    <w:lvl w:ilvl="7" w:tentative="1">
+      <w:start w:val="1"/>
+      <w:numFmt w:val="bullet"/>
+      <w:lvlText w:val=""/>
+      <w:lvlJc w:val="left"/>
+      <w:pPr>
+        <w:tabs>
+          <w:tab w:val="num" w:pos="5760"/>
+        </w:tabs>
+        <w:ind w:left="5760" w:hanging="360"/>
+      </w:pPr>
+      <w:rPr>
+        <w:rFonts w:ascii="Wingdings" w:hAnsi="Wingdings" w:hint="default"/>
+        <w:sz w:val="20"/>
+      </w:rPr>
+    </w:lvl>
+    <w:lvl w:ilvl="8" w:tentative="1">
+      <w:start w:val="1"/>
+      <w:numFmt w:val="bullet"/>
+      <w:lvlText w:val=""/>
+      <w:lvlJc w:val="left"/>
+      <w:pPr>
+        <w:tabs>
+          <w:tab w:val="num" w:pos="6480"/>
+        </w:tabs>
+        <w:ind w:left="6480" w:hanging="360"/>
+      </w:pPr>
+      <w:rPr>
+        <w:rFonts w:ascii="Wingdings" w:hAnsi="Wingdings" w:hint="default"/>
+        <w:sz w:val="20"/>
+      </w:rPr>
+    </w:lvl>
+  </w:abstractNum>
+  <w:abstractNum w:abstractNumId="18" w15:restartNumberingAfterBreak="0">
     <w:nsid w:val="77721F32"/>
     <w:multiLevelType w:val="hybridMultilevel"/>
     <w:tmpl w:val="13760090"/>
+    <w:lvl w:ilvl="0" w:tplc="04090001">
+      <w:start w:val="1"/>
+      <w:numFmt w:val="bullet"/>
+      <w:lvlText w:val=""/>
+      <w:lvlJc w:val="left"/>
+      <w:pPr>
+        <w:ind w:left="720" w:hanging="360"/>
+      </w:pPr>
+      <w:rPr>
+        <w:rFonts w:ascii="Symbol" w:hAnsi="Symbol" w:hint="default"/>
+      </w:rPr>
+    </w:lvl>
+    <w:lvl w:ilvl="1" w:tplc="04090003" w:tentative="1">
+      <w:start w:val="1"/>
+      <w:numFmt w:val="bullet"/>
+      <w:lvlText w:val="o"/>
+      <w:lvlJc w:val="left"/>
+      <w:pPr>
+        <w:ind w:left="1440" w:hanging="360"/>
+      </w:pPr>
+      <w:rPr>
+        <w:rFonts w:ascii="Courier New" w:hAnsi="Courier New" w:cs="Courier New" w:hint="default"/>
+      </w:rPr>
+    </w:lvl>
+    <w:lvl w:ilvl="2" w:tplc="04090005" w:tentative="1">
+      <w:start w:val="1"/>
+      <w:numFmt w:val="bullet"/>
+      <w:lvlText w:val=""/>
+      <w:lvlJc w:val="left"/>
+      <w:pPr>
+        <w:ind w:left="2160" w:hanging="360"/>
+      </w:pPr>
+      <w:rPr>
+        <w:rFonts w:ascii="Wingdings" w:hAnsi="Wingdings" w:hint="default"/>
+      </w:rPr>
+    </w:lvl>
+    <w:lvl w:ilvl="3" w:tplc="04090001" w:tentative="1">
+      <w:start w:val="1"/>
+      <w:numFmt w:val="bullet"/>
+      <w:lvlText w:val=""/>
+      <w:lvlJc w:val="left"/>
+      <w:pPr>
+        <w:ind w:left="2880" w:hanging="360"/>
+      </w:pPr>
+      <w:rPr>
+        <w:rFonts w:ascii="Symbol" w:hAnsi="Symbol" w:hint="default"/>
+      </w:rPr>
+    </w:lvl>
+    <w:lvl w:ilvl="4" w:tplc="04090003" w:tentative="1">
+      <w:start w:val="1"/>
+      <w:numFmt w:val="bullet"/>
+      <w:lvlText w:val="o"/>
+      <w:lvlJc w:val="left"/>
+      <w:pPr>
+        <w:ind w:left="3600" w:hanging="360"/>
+      </w:pPr>
+      <w:rPr>
+        <w:rFonts w:ascii="Courier New" w:hAnsi="Courier New" w:cs="Courier New" w:hint="default"/>
+      </w:rPr>
+    </w:lvl>
+    <w:lvl w:ilvl="5" w:tplc="04090005" w:tentative="1">
+      <w:start w:val="1"/>
+      <w:numFmt w:val="bullet"/>
+      <w:lvlText w:val=""/>
+      <w:lvlJc w:val="left"/>
+      <w:pPr>
+        <w:ind w:left="4320" w:hanging="360"/>
+      </w:pPr>
+      <w:rPr>
+        <w:rFonts w:ascii="Wingdings" w:hAnsi="Wingdings" w:hint="default"/>
+      </w:rPr>
+    </w:lvl>
+    <w:lvl w:ilvl="6" w:tplc="04090001" w:tentative="1">
+      <w:start w:val="1"/>
+      <w:numFmt w:val="bullet"/>
+      <w:lvlText w:val=""/>
+      <w:lvlJc w:val="left"/>
+      <w:pPr>
+        <w:ind w:left="5040" w:hanging="360"/>
+      </w:pPr>
+      <w:rPr>
+        <w:rFonts w:ascii="Symbol" w:hAnsi="Symbol" w:hint="default"/>
+      </w:rPr>
+    </w:lvl>
+    <w:lvl w:ilvl="7" w:tplc="04090003" w:tentative="1">
+      <w:start w:val="1"/>
+      <w:numFmt w:val="bullet"/>
+      <w:lvlText w:val="o"/>
+      <w:lvlJc w:val="left"/>
+      <w:pPr>
+        <w:ind w:left="5760" w:hanging="360"/>
+      </w:pPr>
+      <w:rPr>
+        <w:rFonts w:ascii="Courier New" w:hAnsi="Courier New" w:cs="Courier New" w:hint="default"/>
+      </w:rPr>
+    </w:lvl>
+    <w:lvl w:ilvl="8" w:tplc="04090005" w:tentative="1">
+      <w:start w:val="1"/>
+      <w:numFmt w:val="bullet"/>
+      <w:lvlText w:val=""/>
+      <w:lvlJc w:val="left"/>
+      <w:pPr>
+        <w:ind w:left="6480" w:hanging="360"/>
+      </w:pPr>
+      <w:rPr>
+        <w:rFonts w:ascii="Wingdings" w:hAnsi="Wingdings" w:hint="default"/>
+      </w:rPr>
+    </w:lvl>
+  </w:abstractNum>
+  <w:abstractNum w:abstractNumId="19" w15:restartNumberingAfterBreak="0">
+    <w:nsid w:val="7CA04BBF"/>
+    <w:multiLevelType w:val="hybridMultilevel"/>
+    <w:tmpl w:val="38D0F72C"/>
     <w:lvl w:ilvl="0" w:tplc="04090001">
       <w:start w:val="1"/>
       <w:numFmt w:val="bullet"/>
@@ -10710,10 +12765,10 @@
     <w:abstractNumId w:val="1"/>
   </w:num>
   <w:num w:numId="2" w16cid:durableId="1724061926">
-    <w:abstractNumId w:val="9"/>
+    <w:abstractNumId w:val="11"/>
   </w:num>
   <w:num w:numId="3" w16cid:durableId="2060085104">
-    <w:abstractNumId w:val="14"/>
+    <w:abstractNumId w:val="16"/>
   </w:num>
   <w:num w:numId="4" w16cid:durableId="789473921">
     <w:abstractNumId w:val="5"/>
@@ -10725,16 +12780,16 @@
     <w:abstractNumId w:val="2"/>
   </w:num>
   <w:num w:numId="7" w16cid:durableId="1410300980">
-    <w:abstractNumId w:val="7"/>
+    <w:abstractNumId w:val="9"/>
   </w:num>
   <w:num w:numId="8" w16cid:durableId="518586853">
-    <w:abstractNumId w:val="11"/>
+    <w:abstractNumId w:val="13"/>
   </w:num>
   <w:num w:numId="9" w16cid:durableId="784807550">
-    <w:abstractNumId w:val="8"/>
+    <w:abstractNumId w:val="10"/>
   </w:num>
   <w:num w:numId="10" w16cid:durableId="608506301">
-    <w:abstractNumId w:val="10"/>
+    <w:abstractNumId w:val="12"/>
   </w:num>
   <w:num w:numId="11" w16cid:durableId="1173715416">
     <w:abstractNumId w:val="4"/>
@@ -10746,13 +12801,25 @@
     <w:abstractNumId w:val="3"/>
   </w:num>
   <w:num w:numId="14" w16cid:durableId="167141314">
-    <w:abstractNumId w:val="13"/>
+    <w:abstractNumId w:val="15"/>
   </w:num>
   <w:num w:numId="15" w16cid:durableId="1711104382">
-    <w:abstractNumId w:val="15"/>
+    <w:abstractNumId w:val="18"/>
   </w:num>
   <w:num w:numId="16" w16cid:durableId="70083866">
-    <w:abstractNumId w:val="12"/>
+    <w:abstractNumId w:val="14"/>
+  </w:num>
+  <w:num w:numId="17" w16cid:durableId="1955014208">
+    <w:abstractNumId w:val="8"/>
+  </w:num>
+  <w:num w:numId="18" w16cid:durableId="330568974">
+    <w:abstractNumId w:val="19"/>
+  </w:num>
+  <w:num w:numId="19" w16cid:durableId="1583104091">
+    <w:abstractNumId w:val="7"/>
+  </w:num>
+  <w:num w:numId="20" w16cid:durableId="1486504874">
+    <w:abstractNumId w:val="17"/>
   </w:num>
 </w:numbering>
 </file>
@@ -11208,7 +13275,6 @@
     <w:next w:val="Normal"/>
     <w:link w:val="Heading3Char"/>
     <w:uiPriority w:val="9"/>
-    <w:semiHidden/>
     <w:unhideWhenUsed/>
     <w:qFormat/>
     <w:rsid w:val="0049230E"/>
@@ -11415,7 +13481,6 @@
     <w:basedOn w:val="DefaultParagraphFont"/>
     <w:link w:val="Heading3"/>
     <w:uiPriority w:val="9"/>
-    <w:semiHidden/>
     <w:rsid w:val="0049230E"/>
     <w:rPr>
       <w:rFonts w:eastAsiaTheme="majorEastAsia" w:cstheme="majorBidi"/>
@@ -11788,6 +13853,19 @@
     <w:basedOn w:val="DefaultParagraphFont"/>
     <w:rsid w:val="00FF725D"/>
   </w:style>
+  <w:style w:type="paragraph" w:customStyle="1" w:styleId="ds-markdown-paragraph">
+    <w:name w:val="ds-markdown-paragraph"/>
+    <w:basedOn w:val="Normal"/>
+    <w:rsid w:val="0030775D"/>
+    <w:pPr>
+      <w:spacing w:before="100" w:beforeAutospacing="1" w:after="100" w:afterAutospacing="1" w:line="240" w:lineRule="auto"/>
+    </w:pPr>
+    <w:rPr>
+      <w:rFonts w:ascii="Times New Roman" w:eastAsia="Times New Roman" w:hAnsi="Times New Roman" w:cs="Times New Roman"/>
+      <w:kern w:val="0"/>
+      <w14:ligatures w14:val="none"/>
+    </w:rPr>
+  </w:style>
 </w:styles>
 </file>
 

</xml_diff>

<commit_message>
finish this week's notes
</commit_message>
<xml_diff>
--- a/Javascript/NodeJs Notes.docx
+++ b/Javascript/NodeJs Notes.docx
@@ -10372,6 +10372,993 @@
         <w:numPr>
           <w:ilvl w:val="0"/>
           <w:numId w:val="18"/>
+        </w:numPr>
+        <w:rPr>
+          <w:color w:val="000000" w:themeColor="text1"/>
+          <w:sz w:val="22"/>
+          <w:szCs w:val="22"/>
+        </w:rPr>
+      </w:pPr>
+      <w:r>
+        <w:rPr>
+          <w:color w:val="000000" w:themeColor="text1"/>
+          <w:sz w:val="22"/>
+          <w:szCs w:val="22"/>
+        </w:rPr>
+        <w:t>In the path parameter in express we can pass a regex</w:t>
+      </w:r>
+      <w:r>
+        <w:rPr>
+          <w:color w:val="000000" w:themeColor="text1"/>
+          <w:sz w:val="22"/>
+          <w:szCs w:val="22"/>
+        </w:rPr>
+        <w:t xml:space="preserve">, details of regex </w:t>
+      </w:r>
+      <w:proofErr w:type="gramStart"/>
+      <w:r>
+        <w:rPr>
+          <w:color w:val="000000" w:themeColor="text1"/>
+          <w:sz w:val="22"/>
+          <w:szCs w:val="22"/>
+        </w:rPr>
+        <w:t>is</w:t>
+      </w:r>
+      <w:proofErr w:type="gramEnd"/>
+      <w:r>
+        <w:rPr>
+          <w:color w:val="000000" w:themeColor="text1"/>
+          <w:sz w:val="22"/>
+          <w:szCs w:val="22"/>
+        </w:rPr>
+        <w:t xml:space="preserve"> not relevant to the notes</w:t>
+      </w:r>
+    </w:p>
+    <w:p>
+      <w:pPr>
+        <w:pStyle w:val="ListParagraph"/>
+        <w:numPr>
+          <w:ilvl w:val="0"/>
+          <w:numId w:val="18"/>
+        </w:numPr>
+        <w:rPr>
+          <w:color w:val="000000" w:themeColor="text1"/>
+          <w:sz w:val="22"/>
+          <w:szCs w:val="22"/>
+        </w:rPr>
+      </w:pPr>
+      <w:proofErr w:type="spellStart"/>
+      <w:proofErr w:type="gramStart"/>
+      <w:r>
+        <w:rPr>
+          <w:color w:val="000000" w:themeColor="text1"/>
+          <w:sz w:val="22"/>
+          <w:szCs w:val="22"/>
+        </w:rPr>
+        <w:t>app.use</w:t>
+      </w:r>
+      <w:proofErr w:type="spellEnd"/>
+      <w:r>
+        <w:rPr>
+          <w:color w:val="000000" w:themeColor="text1"/>
+          <w:sz w:val="22"/>
+          <w:szCs w:val="22"/>
+        </w:rPr>
+        <w:t>(</w:t>
+      </w:r>
+      <w:proofErr w:type="spellStart"/>
+      <w:r>
+        <w:rPr>
+          <w:color w:val="000000" w:themeColor="text1"/>
+          <w:sz w:val="22"/>
+          <w:szCs w:val="22"/>
+        </w:rPr>
+        <w:t>express.urlencoded</w:t>
+      </w:r>
+      <w:proofErr w:type="spellEnd"/>
+      <w:r>
+        <w:rPr>
+          <w:color w:val="000000" w:themeColor="text1"/>
+          <w:sz w:val="22"/>
+          <w:szCs w:val="22"/>
+        </w:rPr>
+        <w:t>({ extended</w:t>
+      </w:r>
+      <w:proofErr w:type="gramEnd"/>
+      <w:r>
+        <w:rPr>
+          <w:color w:val="000000" w:themeColor="text1"/>
+          <w:sz w:val="22"/>
+          <w:szCs w:val="22"/>
+        </w:rPr>
+        <w:t xml:space="preserve">: </w:t>
+      </w:r>
+      <w:proofErr w:type="gramStart"/>
+      <w:r>
+        <w:rPr>
+          <w:color w:val="000000" w:themeColor="text1"/>
+          <w:sz w:val="22"/>
+          <w:szCs w:val="22"/>
+        </w:rPr>
+        <w:t>false }</w:t>
+      </w:r>
+      <w:proofErr w:type="gramEnd"/>
+      <w:r>
+        <w:rPr>
+          <w:color w:val="000000" w:themeColor="text1"/>
+          <w:sz w:val="22"/>
+          <w:szCs w:val="22"/>
+        </w:rPr>
+        <w:t>))</w:t>
+      </w:r>
+      <w:proofErr w:type="gramStart"/>
+      <w:r>
+        <w:rPr>
+          <w:color w:val="000000" w:themeColor="text1"/>
+          <w:sz w:val="22"/>
+          <w:szCs w:val="22"/>
+        </w:rPr>
+        <w:t>;</w:t>
+      </w:r>
+      <w:r>
+        <w:rPr>
+          <w:color w:val="000000" w:themeColor="text1"/>
+          <w:sz w:val="22"/>
+          <w:szCs w:val="22"/>
+        </w:rPr>
+        <w:t xml:space="preserve"> :</w:t>
+      </w:r>
+      <w:proofErr w:type="gramEnd"/>
+      <w:r>
+        <w:rPr>
+          <w:color w:val="000000" w:themeColor="text1"/>
+          <w:sz w:val="22"/>
+          <w:szCs w:val="22"/>
+        </w:rPr>
+        <w:t xml:space="preserve"> i</w:t>
+      </w:r>
+      <w:r>
+        <w:rPr>
+          <w:color w:val="000000" w:themeColor="text1"/>
+          <w:sz w:val="22"/>
+          <w:szCs w:val="22"/>
+        </w:rPr>
+        <w:t xml:space="preserve">f the client sends form data using URL-encoded format, parse it and put the result into </w:t>
+      </w:r>
+      <w:proofErr w:type="spellStart"/>
+      <w:proofErr w:type="gramStart"/>
+      <w:r>
+        <w:rPr>
+          <w:color w:val="000000" w:themeColor="text1"/>
+          <w:sz w:val="22"/>
+          <w:szCs w:val="22"/>
+        </w:rPr>
+        <w:t>req.body</w:t>
+      </w:r>
+      <w:proofErr w:type="spellEnd"/>
+      <w:proofErr w:type="gramEnd"/>
+      <w:r>
+        <w:rPr>
+          <w:color w:val="000000" w:themeColor="text1"/>
+          <w:sz w:val="22"/>
+          <w:szCs w:val="22"/>
+        </w:rPr>
+        <w:t>.</w:t>
+      </w:r>
+      <w:r>
+        <w:rPr>
+          <w:color w:val="000000" w:themeColor="text1"/>
+          <w:sz w:val="22"/>
+          <w:szCs w:val="22"/>
+        </w:rPr>
+        <w:t xml:space="preserve"> </w:t>
+      </w:r>
+      <w:r>
+        <w:rPr>
+          <w:color w:val="000000" w:themeColor="text1"/>
+          <w:sz w:val="22"/>
+          <w:szCs w:val="22"/>
+        </w:rPr>
+        <w:t>With extended: true, Express can handle more complex/nested objects.</w:t>
+      </w:r>
+    </w:p>
+    <w:p>
+      <w:pPr>
+        <w:pStyle w:val="ListParagraph"/>
+        <w:numPr>
+          <w:ilvl w:val="0"/>
+          <w:numId w:val="18"/>
+        </w:numPr>
+        <w:rPr>
+          <w:color w:val="000000" w:themeColor="text1"/>
+          <w:sz w:val="22"/>
+          <w:szCs w:val="22"/>
+        </w:rPr>
+      </w:pPr>
+      <w:r>
+        <w:rPr>
+          <w:color w:val="000000" w:themeColor="text1"/>
+          <w:sz w:val="22"/>
+          <w:szCs w:val="22"/>
+        </w:rPr>
+        <w:t>It reads the raw URL-encoded data from the request body (e.g., </w:t>
+      </w:r>
+      <w:r>
+        <w:rPr>
+          <w:color w:val="000000" w:themeColor="text1"/>
+          <w:sz w:val="22"/>
+          <w:szCs w:val="22"/>
+        </w:rPr>
+        <w:t>name=</w:t>
+      </w:r>
+      <w:proofErr w:type="spellStart"/>
+      <w:r>
+        <w:rPr>
+          <w:color w:val="000000" w:themeColor="text1"/>
+          <w:sz w:val="22"/>
+          <w:szCs w:val="22"/>
+        </w:rPr>
+        <w:t>John&amp;age</w:t>
+      </w:r>
+      <w:proofErr w:type="spellEnd"/>
+      <w:r>
+        <w:rPr>
+          <w:color w:val="000000" w:themeColor="text1"/>
+          <w:sz w:val="22"/>
+          <w:szCs w:val="22"/>
+        </w:rPr>
+        <w:t>=30</w:t>
+      </w:r>
+      <w:r>
+        <w:rPr>
+          <w:color w:val="000000" w:themeColor="text1"/>
+          <w:sz w:val="22"/>
+          <w:szCs w:val="22"/>
+        </w:rPr>
+        <w:t>).</w:t>
+      </w:r>
+      <w:r>
+        <w:rPr>
+          <w:color w:val="000000" w:themeColor="text1"/>
+          <w:sz w:val="22"/>
+          <w:szCs w:val="22"/>
+        </w:rPr>
+        <w:t xml:space="preserve"> </w:t>
+      </w:r>
+      <w:r>
+        <w:rPr>
+          <w:color w:val="000000" w:themeColor="text1"/>
+          <w:sz w:val="22"/>
+          <w:szCs w:val="22"/>
+        </w:rPr>
+        <w:t>It converts that string into a JavaScript object and attaches it to </w:t>
+      </w:r>
+      <w:proofErr w:type="spellStart"/>
+      <w:proofErr w:type="gramStart"/>
+      <w:r>
+        <w:rPr>
+          <w:color w:val="000000" w:themeColor="text1"/>
+          <w:sz w:val="22"/>
+          <w:szCs w:val="22"/>
+        </w:rPr>
+        <w:t>req.body</w:t>
+      </w:r>
+      <w:proofErr w:type="spellEnd"/>
+      <w:proofErr w:type="gramEnd"/>
+      <w:r>
+        <w:rPr>
+          <w:color w:val="000000" w:themeColor="text1"/>
+          <w:sz w:val="22"/>
+          <w:szCs w:val="22"/>
+        </w:rPr>
+        <w:t> so you can access the form fields.</w:t>
+      </w:r>
+      <w:r>
+        <w:rPr>
+          <w:color w:val="000000" w:themeColor="text1"/>
+          <w:sz w:val="22"/>
+          <w:szCs w:val="22"/>
+        </w:rPr>
+        <w:t xml:space="preserve"> And since we did not specify any path in the </w:t>
+      </w:r>
+      <w:proofErr w:type="spellStart"/>
+      <w:proofErr w:type="gramStart"/>
+      <w:r>
+        <w:rPr>
+          <w:color w:val="000000" w:themeColor="text1"/>
+          <w:sz w:val="22"/>
+          <w:szCs w:val="22"/>
+        </w:rPr>
+        <w:t>app,use</w:t>
+      </w:r>
+      <w:proofErr w:type="spellEnd"/>
+      <w:proofErr w:type="gramEnd"/>
+      <w:r>
+        <w:rPr>
+          <w:color w:val="000000" w:themeColor="text1"/>
+          <w:sz w:val="22"/>
+          <w:szCs w:val="22"/>
+        </w:rPr>
+        <w:t xml:space="preserve"> this function will be executed for every path and request that is applicable</w:t>
+      </w:r>
+    </w:p>
+    <w:p>
+      <w:pPr>
+        <w:pStyle w:val="ListParagraph"/>
+        <w:numPr>
+          <w:ilvl w:val="0"/>
+          <w:numId w:val="18"/>
+        </w:numPr>
+        <w:rPr>
+          <w:color w:val="000000" w:themeColor="text1"/>
+          <w:sz w:val="22"/>
+          <w:szCs w:val="22"/>
+        </w:rPr>
+      </w:pPr>
+      <w:r>
+        <w:rPr>
+          <w:color w:val="000000" w:themeColor="text1"/>
+          <w:sz w:val="22"/>
+          <w:szCs w:val="22"/>
+        </w:rPr>
+        <w:t xml:space="preserve">Another built in middleware is </w:t>
+      </w:r>
+      <w:proofErr w:type="spellStart"/>
+      <w:proofErr w:type="gramStart"/>
+      <w:r>
+        <w:rPr>
+          <w:color w:val="000000" w:themeColor="text1"/>
+          <w:sz w:val="22"/>
+          <w:szCs w:val="22"/>
+        </w:rPr>
+        <w:t>express.json</w:t>
+      </w:r>
+      <w:proofErr w:type="spellEnd"/>
+      <w:proofErr w:type="gramEnd"/>
+      <w:r>
+        <w:rPr>
+          <w:color w:val="000000" w:themeColor="text1"/>
+          <w:sz w:val="22"/>
+          <w:szCs w:val="22"/>
+        </w:rPr>
+        <w:t xml:space="preserve">(): </w:t>
+      </w:r>
+      <w:r>
+        <w:rPr>
+          <w:color w:val="000000" w:themeColor="text1"/>
+          <w:sz w:val="22"/>
+          <w:szCs w:val="22"/>
+        </w:rPr>
+        <w:t>It looks for incoming requests with the Content-Type: application/</w:t>
+      </w:r>
+      <w:proofErr w:type="spellStart"/>
+      <w:r>
+        <w:rPr>
+          <w:color w:val="000000" w:themeColor="text1"/>
+          <w:sz w:val="22"/>
+          <w:szCs w:val="22"/>
+        </w:rPr>
+        <w:t>json</w:t>
+      </w:r>
+      <w:proofErr w:type="spellEnd"/>
+      <w:r>
+        <w:rPr>
+          <w:color w:val="000000" w:themeColor="text1"/>
+          <w:sz w:val="22"/>
+          <w:szCs w:val="22"/>
+        </w:rPr>
+        <w:t> header.</w:t>
+      </w:r>
+      <w:r>
+        <w:rPr>
+          <w:color w:val="000000" w:themeColor="text1"/>
+          <w:sz w:val="22"/>
+          <w:szCs w:val="22"/>
+        </w:rPr>
+        <w:t xml:space="preserve"> </w:t>
+      </w:r>
+      <w:r>
+        <w:rPr>
+          <w:color w:val="000000" w:themeColor="text1"/>
+          <w:sz w:val="22"/>
+          <w:szCs w:val="22"/>
+        </w:rPr>
+        <w:t>If it finds one, it reads the raw JSON string from the request body (e.g., {"name":"Alice","age":30}), parses it into a JavaScript object, and attaches that object to </w:t>
+      </w:r>
+      <w:proofErr w:type="spellStart"/>
+      <w:proofErr w:type="gramStart"/>
+      <w:r>
+        <w:rPr>
+          <w:color w:val="000000" w:themeColor="text1"/>
+          <w:sz w:val="22"/>
+          <w:szCs w:val="22"/>
+        </w:rPr>
+        <w:t>req.body</w:t>
+      </w:r>
+      <w:proofErr w:type="spellEnd"/>
+      <w:proofErr w:type="gramEnd"/>
+      <w:r>
+        <w:rPr>
+          <w:color w:val="000000" w:themeColor="text1"/>
+          <w:sz w:val="22"/>
+          <w:szCs w:val="22"/>
+        </w:rPr>
+        <w:t xml:space="preserve">  </w:t>
+      </w:r>
+      <w:r>
+        <w:rPr>
+          <w:color w:val="000000" w:themeColor="text1"/>
+          <w:sz w:val="22"/>
+          <w:szCs w:val="22"/>
+        </w:rPr>
+        <w:t>If the request doesn't have that header (or has no body), it simply calls </w:t>
+      </w:r>
+      <w:proofErr w:type="gramStart"/>
+      <w:r>
+        <w:rPr>
+          <w:color w:val="000000" w:themeColor="text1"/>
+          <w:sz w:val="22"/>
+          <w:szCs w:val="22"/>
+        </w:rPr>
+        <w:t>next(</w:t>
+      </w:r>
+      <w:proofErr w:type="gramEnd"/>
+      <w:r>
+        <w:rPr>
+          <w:color w:val="000000" w:themeColor="text1"/>
+          <w:sz w:val="22"/>
+          <w:szCs w:val="22"/>
+        </w:rPr>
+        <w:t>) and does nothing.</w:t>
+      </w:r>
+    </w:p>
+    <w:p>
+      <w:pPr>
+        <w:pStyle w:val="ListParagraph"/>
+        <w:numPr>
+          <w:ilvl w:val="0"/>
+          <w:numId w:val="18"/>
+        </w:numPr>
+        <w:rPr>
+          <w:color w:val="000000" w:themeColor="text1"/>
+          <w:sz w:val="22"/>
+          <w:szCs w:val="22"/>
+        </w:rPr>
+      </w:pPr>
+      <w:r>
+        <w:rPr>
+          <w:color w:val="000000" w:themeColor="text1"/>
+          <w:sz w:val="22"/>
+          <w:szCs w:val="22"/>
+        </w:rPr>
+        <w:t>By using the static express middleware: B</w:t>
+      </w:r>
+      <w:r>
+        <w:rPr>
+          <w:color w:val="000000" w:themeColor="text1"/>
+          <w:sz w:val="22"/>
+          <w:szCs w:val="22"/>
+        </w:rPr>
+        <w:t>y doing this, you </w:t>
+      </w:r>
+      <w:r>
+        <w:rPr>
+          <w:b/>
+          <w:bCs/>
+          <w:color w:val="000000" w:themeColor="text1"/>
+          <w:sz w:val="22"/>
+          <w:szCs w:val="22"/>
+        </w:rPr>
+        <w:t>only expose</w:t>
+      </w:r>
+      <w:r>
+        <w:rPr>
+          <w:color w:val="000000" w:themeColor="text1"/>
+          <w:sz w:val="22"/>
+          <w:szCs w:val="22"/>
+        </w:rPr>
+        <w:t> the files in the public folder. No one can request server.js or .env files higher up in your directory tree because </w:t>
+      </w:r>
+      <w:proofErr w:type="spellStart"/>
+      <w:proofErr w:type="gramStart"/>
+      <w:r>
+        <w:rPr>
+          <w:color w:val="000000" w:themeColor="text1"/>
+          <w:sz w:val="22"/>
+          <w:szCs w:val="22"/>
+        </w:rPr>
+        <w:t>express.static</w:t>
+      </w:r>
+      <w:proofErr w:type="spellEnd"/>
+      <w:proofErr w:type="gramEnd"/>
+      <w:r>
+        <w:rPr>
+          <w:color w:val="000000" w:themeColor="text1"/>
+          <w:sz w:val="22"/>
+          <w:szCs w:val="22"/>
+        </w:rPr>
+        <w:t> specifically locks the root of the filesystem search to that single folder.</w:t>
+      </w:r>
+    </w:p>
+    <w:p>
+      <w:pPr>
+        <w:rPr>
+          <w:color w:val="000000" w:themeColor="text1"/>
+          <w:sz w:val="22"/>
+          <w:szCs w:val="22"/>
+        </w:rPr>
+      </w:pPr>
+    </w:p>
+    <w:p>
+      <w:pPr>
+        <w:rPr>
+          <w:b/>
+          <w:bCs/>
+          <w:color w:val="000000" w:themeColor="text1"/>
+          <w:u w:val="single"/>
+        </w:rPr>
+      </w:pPr>
+      <w:r>
+        <w:rPr>
+          <w:b/>
+          <w:bCs/>
+          <w:color w:val="000000" w:themeColor="text1"/>
+          <w:u w:val="single"/>
+        </w:rPr>
+        <w:t>The CORS</w:t>
+      </w:r>
+      <w:r>
+        <w:rPr>
+          <w:b/>
+          <w:bCs/>
+          <w:color w:val="000000" w:themeColor="text1"/>
+          <w:u w:val="single"/>
+        </w:rPr>
+        <w:t>:</w:t>
+      </w:r>
+    </w:p>
+    <w:p>
+      <w:pPr>
+        <w:pStyle w:val="ListParagraph"/>
+        <w:numPr>
+          <w:ilvl w:val="0"/>
+          <w:numId w:val="23"/>
+        </w:numPr>
+        <w:rPr>
+          <w:color w:val="000000" w:themeColor="text1"/>
+          <w:sz w:val="22"/>
+          <w:szCs w:val="22"/>
+        </w:rPr>
+      </w:pPr>
+      <w:r>
+        <w:rPr>
+          <w:color w:val="000000" w:themeColor="text1"/>
+          <w:sz w:val="22"/>
+          <w:szCs w:val="22"/>
+        </w:rPr>
+        <w:t>By default, web browsers enforce a strict security rule called the </w:t>
+      </w:r>
+      <w:r>
+        <w:rPr>
+          <w:color w:val="000000" w:themeColor="text1"/>
+          <w:sz w:val="22"/>
+          <w:szCs w:val="22"/>
+        </w:rPr>
+        <w:t>Same-Origin Policy</w:t>
+      </w:r>
+      <w:r>
+        <w:rPr>
+          <w:color w:val="000000" w:themeColor="text1"/>
+          <w:sz w:val="22"/>
+          <w:szCs w:val="22"/>
+        </w:rPr>
+        <w:t>. This means a website loaded from http://myfrontend.com </w:t>
+      </w:r>
+      <w:r>
+        <w:rPr>
+          <w:color w:val="000000" w:themeColor="text1"/>
+          <w:sz w:val="22"/>
+          <w:szCs w:val="22"/>
+        </w:rPr>
+        <w:t>cannot</w:t>
+      </w:r>
+      <w:r>
+        <w:rPr>
+          <w:color w:val="000000" w:themeColor="text1"/>
+          <w:sz w:val="22"/>
+          <w:szCs w:val="22"/>
+        </w:rPr>
+        <w:t> make an AJAX/fetch request to http://mybackend.com unless the backend explicitly gives permission. The browser will block the response, throwing a scary red CORS error in the console.</w:t>
+      </w:r>
+    </w:p>
+    <w:p>
+      <w:pPr>
+        <w:pStyle w:val="ListParagraph"/>
+        <w:numPr>
+          <w:ilvl w:val="0"/>
+          <w:numId w:val="23"/>
+        </w:numPr>
+        <w:rPr>
+          <w:color w:val="000000" w:themeColor="text1"/>
+          <w:sz w:val="22"/>
+          <w:szCs w:val="22"/>
+        </w:rPr>
+      </w:pPr>
+      <w:r>
+        <w:rPr>
+          <w:color w:val="000000" w:themeColor="text1"/>
+          <w:sz w:val="22"/>
+          <w:szCs w:val="22"/>
+        </w:rPr>
+        <w:lastRenderedPageBreak/>
+        <w:t>The CORS dependency gives access to which domains can make requests to our backend</w:t>
+      </w:r>
+    </w:p>
+    <w:p>
+      <w:pPr>
+        <w:pStyle w:val="ListParagraph"/>
+        <w:numPr>
+          <w:ilvl w:val="0"/>
+          <w:numId w:val="23"/>
+        </w:numPr>
+        <w:rPr>
+          <w:color w:val="000000" w:themeColor="text1"/>
+          <w:sz w:val="22"/>
+          <w:szCs w:val="22"/>
+        </w:rPr>
+      </w:pPr>
+      <w:r>
+        <w:rPr>
+          <w:color w:val="000000" w:themeColor="text1"/>
+          <w:sz w:val="22"/>
+          <w:szCs w:val="22"/>
+        </w:rPr>
+        <w:t xml:space="preserve">If we used the </w:t>
+      </w:r>
+      <w:proofErr w:type="spellStart"/>
+      <w:r>
+        <w:rPr>
+          <w:color w:val="000000" w:themeColor="text1"/>
+          <w:sz w:val="22"/>
+          <w:szCs w:val="22"/>
+        </w:rPr>
+        <w:t>cors</w:t>
+      </w:r>
+      <w:proofErr w:type="spellEnd"/>
+      <w:r>
+        <w:rPr>
+          <w:color w:val="000000" w:themeColor="text1"/>
+          <w:sz w:val="22"/>
+          <w:szCs w:val="22"/>
+        </w:rPr>
+        <w:t xml:space="preserve"> dependency with </w:t>
+      </w:r>
+      <w:proofErr w:type="spellStart"/>
+      <w:r>
+        <w:rPr>
+          <w:color w:val="000000" w:themeColor="text1"/>
+          <w:sz w:val="22"/>
+          <w:szCs w:val="22"/>
+        </w:rPr>
+        <w:t>app.use</w:t>
+      </w:r>
+      <w:proofErr w:type="spellEnd"/>
+      <w:r>
+        <w:rPr>
+          <w:color w:val="000000" w:themeColor="text1"/>
+          <w:sz w:val="22"/>
+          <w:szCs w:val="22"/>
+        </w:rPr>
+        <w:t xml:space="preserve"> without specifying any end points we give the origin domain: x access to all the end points, if we want to apply it to a certain end </w:t>
+      </w:r>
+      <w:proofErr w:type="gramStart"/>
+      <w:r>
+        <w:rPr>
+          <w:color w:val="000000" w:themeColor="text1"/>
+          <w:sz w:val="22"/>
+          <w:szCs w:val="22"/>
+        </w:rPr>
+        <w:t>point</w:t>
+      </w:r>
+      <w:proofErr w:type="gramEnd"/>
+      <w:r>
+        <w:rPr>
+          <w:color w:val="000000" w:themeColor="text1"/>
+          <w:sz w:val="22"/>
+          <w:szCs w:val="22"/>
+        </w:rPr>
+        <w:t xml:space="preserve"> we use this: </w:t>
+      </w:r>
+      <w:proofErr w:type="spellStart"/>
+      <w:proofErr w:type="gramStart"/>
+      <w:r>
+        <w:rPr>
+          <w:color w:val="000000" w:themeColor="text1"/>
+          <w:sz w:val="22"/>
+          <w:szCs w:val="22"/>
+        </w:rPr>
+        <w:t>app.use</w:t>
+      </w:r>
+      <w:proofErr w:type="spellEnd"/>
+      <w:r>
+        <w:rPr>
+          <w:color w:val="000000" w:themeColor="text1"/>
+          <w:sz w:val="22"/>
+          <w:szCs w:val="22"/>
+        </w:rPr>
+        <w:t>(</w:t>
+      </w:r>
+      <w:proofErr w:type="gramEnd"/>
+      <w:r>
+        <w:rPr>
+          <w:color w:val="000000" w:themeColor="text1"/>
+          <w:sz w:val="22"/>
+          <w:szCs w:val="22"/>
+        </w:rPr>
+        <w:t xml:space="preserve">‘endpoint path’), </w:t>
+      </w:r>
+      <w:proofErr w:type="spellStart"/>
+      <w:proofErr w:type="gramStart"/>
+      <w:r>
+        <w:rPr>
+          <w:color w:val="000000" w:themeColor="text1"/>
+          <w:sz w:val="22"/>
+          <w:szCs w:val="22"/>
+        </w:rPr>
+        <w:t>cors</w:t>
+      </w:r>
+      <w:proofErr w:type="spellEnd"/>
+      <w:r>
+        <w:rPr>
+          <w:color w:val="000000" w:themeColor="text1"/>
+          <w:sz w:val="22"/>
+          <w:szCs w:val="22"/>
+        </w:rPr>
+        <w:t>({ origin</w:t>
+      </w:r>
+      <w:proofErr w:type="gramEnd"/>
+      <w:r>
+        <w:rPr>
+          <w:color w:val="000000" w:themeColor="text1"/>
+          <w:sz w:val="22"/>
+          <w:szCs w:val="22"/>
+        </w:rPr>
+        <w:t>: x}), callback); now this path is only for x</w:t>
+      </w:r>
+    </w:p>
+    <w:p>
+      <w:pPr>
+        <w:pStyle w:val="ListParagraph"/>
+        <w:numPr>
+          <w:ilvl w:val="0"/>
+          <w:numId w:val="23"/>
+        </w:numPr>
+        <w:rPr>
+          <w:color w:val="000000" w:themeColor="text1"/>
+          <w:sz w:val="22"/>
+          <w:szCs w:val="22"/>
+        </w:rPr>
+      </w:pPr>
+      <w:r>
+        <w:rPr>
+          <w:color w:val="000000" w:themeColor="text1"/>
+          <w:sz w:val="22"/>
+          <w:szCs w:val="22"/>
+        </w:rPr>
+        <w:t xml:space="preserve">We can store the allowed domains into an array and pass </w:t>
+      </w:r>
+      <w:proofErr w:type="gramStart"/>
+      <w:r>
+        <w:rPr>
+          <w:color w:val="000000" w:themeColor="text1"/>
+          <w:sz w:val="22"/>
+          <w:szCs w:val="22"/>
+        </w:rPr>
+        <w:t>it</w:t>
+      </w:r>
+      <w:proofErr w:type="gramEnd"/>
+      <w:r>
+        <w:rPr>
+          <w:color w:val="000000" w:themeColor="text1"/>
+          <w:sz w:val="22"/>
+          <w:szCs w:val="22"/>
+        </w:rPr>
+        <w:t xml:space="preserve"> to the </w:t>
+      </w:r>
+      <w:proofErr w:type="spellStart"/>
+      <w:proofErr w:type="gramStart"/>
+      <w:r>
+        <w:rPr>
+          <w:color w:val="000000" w:themeColor="text1"/>
+          <w:sz w:val="22"/>
+          <w:szCs w:val="22"/>
+        </w:rPr>
+        <w:t>cors</w:t>
+      </w:r>
+      <w:proofErr w:type="spellEnd"/>
+      <w:r>
+        <w:rPr>
+          <w:color w:val="000000" w:themeColor="text1"/>
+          <w:sz w:val="22"/>
+          <w:szCs w:val="22"/>
+        </w:rPr>
+        <w:t>(</w:t>
+      </w:r>
+      <w:proofErr w:type="gramEnd"/>
+      <w:r>
+        <w:rPr>
+          <w:color w:val="000000" w:themeColor="text1"/>
+          <w:sz w:val="22"/>
+          <w:szCs w:val="22"/>
+        </w:rPr>
+        <w:t xml:space="preserve">) in the origin property </w:t>
+      </w:r>
+    </w:p>
+    <w:p>
+      <w:pPr>
+        <w:pStyle w:val="ListParagraph"/>
+        <w:numPr>
+          <w:ilvl w:val="0"/>
+          <w:numId w:val="23"/>
+        </w:numPr>
+        <w:rPr>
+          <w:color w:val="000000" w:themeColor="text1"/>
+          <w:sz w:val="22"/>
+          <w:szCs w:val="22"/>
+        </w:rPr>
+      </w:pPr>
+      <w:proofErr w:type="spellStart"/>
+      <w:proofErr w:type="gramStart"/>
+      <w:r>
+        <w:rPr>
+          <w:color w:val="000000" w:themeColor="text1"/>
+          <w:sz w:val="22"/>
+          <w:szCs w:val="22"/>
+        </w:rPr>
+        <w:t>app.all</w:t>
+      </w:r>
+      <w:proofErr w:type="spellEnd"/>
+      <w:r>
+        <w:rPr>
+          <w:color w:val="000000" w:themeColor="text1"/>
+          <w:sz w:val="22"/>
+          <w:szCs w:val="22"/>
+        </w:rPr>
+        <w:t>(</w:t>
+      </w:r>
+      <w:proofErr w:type="gramEnd"/>
+      <w:r>
+        <w:rPr>
+          <w:color w:val="000000" w:themeColor="text1"/>
+          <w:sz w:val="22"/>
+          <w:szCs w:val="22"/>
+        </w:rPr>
+        <w:t xml:space="preserve">) is mainly used when you want </w:t>
+      </w:r>
+      <w:r>
+        <w:rPr>
+          <w:color w:val="000000" w:themeColor="text1"/>
+          <w:sz w:val="22"/>
+          <w:szCs w:val="22"/>
+        </w:rPr>
+        <w:t>one route handler to respond to every HTTP method</w:t>
+      </w:r>
+      <w:r>
+        <w:rPr>
+          <w:color w:val="000000" w:themeColor="text1"/>
+          <w:sz w:val="22"/>
+          <w:szCs w:val="22"/>
+        </w:rPr>
+        <w:t xml:space="preserve"> for a particular path.</w:t>
+      </w:r>
+      <w:r>
+        <w:rPr>
+          <w:color w:val="000000" w:themeColor="text1"/>
+          <w:sz w:val="22"/>
+          <w:szCs w:val="22"/>
+        </w:rPr>
+        <w:t xml:space="preserve"> It takes a path and a callback function</w:t>
+      </w:r>
+    </w:p>
+    <w:p>
+      <w:pPr>
+        <w:pStyle w:val="pdq2pgselectionanchorcontainer"/>
+        <w:numPr>
+          <w:ilvl w:val="0"/>
+          <w:numId w:val="23"/>
+        </w:numPr>
+        <w:rPr>
+          <w:rFonts w:asciiTheme="minorHAnsi" w:eastAsiaTheme="minorHAnsi" w:hAnsiTheme="minorHAnsi" w:cstheme="minorBidi"/>
+          <w:color w:val="000000" w:themeColor="text1"/>
+          <w:kern w:val="2"/>
+          <w:sz w:val="22"/>
+          <w:szCs w:val="22"/>
+          <w14:ligatures w14:val="standardContextual"/>
+        </w:rPr>
+      </w:pPr>
+      <w:r>
+        <w:rPr>
+          <w:rFonts w:asciiTheme="minorHAnsi" w:eastAsiaTheme="minorHAnsi" w:hAnsiTheme="minorHAnsi" w:cstheme="minorBidi"/>
+          <w:color w:val="000000" w:themeColor="text1"/>
+          <w:kern w:val="2"/>
+          <w:sz w:val="22"/>
+          <w:szCs w:val="22"/>
+          <w14:ligatures w14:val="standardContextual"/>
+        </w:rPr>
+        <w:t xml:space="preserve">One of the most useful purposes of </w:t>
+      </w:r>
+      <w:proofErr w:type="spellStart"/>
+      <w:proofErr w:type="gramStart"/>
+      <w:r>
+        <w:rPr>
+          <w:rFonts w:asciiTheme="minorHAnsi" w:eastAsiaTheme="minorHAnsi" w:hAnsiTheme="minorHAnsi" w:cstheme="minorBidi"/>
+          <w:color w:val="000000" w:themeColor="text1"/>
+          <w:kern w:val="2"/>
+          <w:sz w:val="22"/>
+          <w:szCs w:val="22"/>
+          <w14:ligatures w14:val="standardContextual"/>
+        </w:rPr>
+        <w:t>app.all</w:t>
+      </w:r>
+      <w:proofErr w:type="spellEnd"/>
+      <w:r>
+        <w:rPr>
+          <w:rFonts w:asciiTheme="minorHAnsi" w:eastAsiaTheme="minorHAnsi" w:hAnsiTheme="minorHAnsi" w:cstheme="minorBidi"/>
+          <w:color w:val="000000" w:themeColor="text1"/>
+          <w:kern w:val="2"/>
+          <w:sz w:val="22"/>
+          <w:szCs w:val="22"/>
+          <w14:ligatures w14:val="standardContextual"/>
+        </w:rPr>
+        <w:t>(</w:t>
+      </w:r>
+      <w:proofErr w:type="gramEnd"/>
+      <w:r>
+        <w:rPr>
+          <w:rFonts w:asciiTheme="minorHAnsi" w:eastAsiaTheme="minorHAnsi" w:hAnsiTheme="minorHAnsi" w:cstheme="minorBidi"/>
+          <w:color w:val="000000" w:themeColor="text1"/>
+          <w:kern w:val="2"/>
+          <w:sz w:val="22"/>
+          <w:szCs w:val="22"/>
+          <w14:ligatures w14:val="standardContextual"/>
+        </w:rPr>
+        <w:t>) is applying some logic regardless of HTTP method:</w:t>
+      </w:r>
+    </w:p>
+    <w:p>
+      <w:pPr>
+        <w:rPr>
+          <w:color w:val="000000" w:themeColor="text1"/>
+          <w:sz w:val="22"/>
+          <w:szCs w:val="22"/>
+        </w:rPr>
+      </w:pPr>
+    </w:p>
+    <w:p>
+      <w:pPr>
+        <w:rPr>
+          <w:b/>
+          <w:bCs/>
+          <w:color w:val="000000" w:themeColor="text1"/>
+          <w:u w:val="single"/>
+        </w:rPr>
+      </w:pPr>
+      <w:r>
+        <w:rPr>
+          <w:b/>
+          <w:bCs/>
+          <w:color w:val="000000" w:themeColor="text1"/>
+          <w:u w:val="single"/>
+        </w:rPr>
+        <w:t>REST API in Express:</w:t>
+      </w:r>
+    </w:p>
+    <w:p>
+      <w:pPr>
+        <w:pStyle w:val="ListParagraph"/>
+        <w:numPr>
+          <w:ilvl w:val="0"/>
+          <w:numId w:val="24"/>
         </w:numPr>
         <w:rPr>
           <w:color w:val="000000" w:themeColor="text1"/>
@@ -10959,6 +11946,119 @@
     </w:lvl>
   </w:abstractNum>
   <w:abstractNum w:abstractNumId="5" w15:restartNumberingAfterBreak="0">
+    <w:nsid w:val="23CD221A"/>
+    <w:multiLevelType w:val="hybridMultilevel"/>
+    <w:tmpl w:val="D044618E"/>
+    <w:lvl w:ilvl="0" w:tplc="04090001">
+      <w:start w:val="1"/>
+      <w:numFmt w:val="bullet"/>
+      <w:lvlText w:val=""/>
+      <w:lvlJc w:val="left"/>
+      <w:pPr>
+        <w:ind w:left="720" w:hanging="360"/>
+      </w:pPr>
+      <w:rPr>
+        <w:rFonts w:ascii="Symbol" w:hAnsi="Symbol" w:hint="default"/>
+      </w:rPr>
+    </w:lvl>
+    <w:lvl w:ilvl="1" w:tplc="04090003" w:tentative="1">
+      <w:start w:val="1"/>
+      <w:numFmt w:val="bullet"/>
+      <w:lvlText w:val="o"/>
+      <w:lvlJc w:val="left"/>
+      <w:pPr>
+        <w:ind w:left="1440" w:hanging="360"/>
+      </w:pPr>
+      <w:rPr>
+        <w:rFonts w:ascii="Courier New" w:hAnsi="Courier New" w:cs="Courier New" w:hint="default"/>
+      </w:rPr>
+    </w:lvl>
+    <w:lvl w:ilvl="2" w:tplc="04090005" w:tentative="1">
+      <w:start w:val="1"/>
+      <w:numFmt w:val="bullet"/>
+      <w:lvlText w:val=""/>
+      <w:lvlJc w:val="left"/>
+      <w:pPr>
+        <w:ind w:left="2160" w:hanging="360"/>
+      </w:pPr>
+      <w:rPr>
+        <w:rFonts w:ascii="Wingdings" w:hAnsi="Wingdings" w:hint="default"/>
+      </w:rPr>
+    </w:lvl>
+    <w:lvl w:ilvl="3" w:tplc="04090001" w:tentative="1">
+      <w:start w:val="1"/>
+      <w:numFmt w:val="bullet"/>
+      <w:lvlText w:val=""/>
+      <w:lvlJc w:val="left"/>
+      <w:pPr>
+        <w:ind w:left="2880" w:hanging="360"/>
+      </w:pPr>
+      <w:rPr>
+        <w:rFonts w:ascii="Symbol" w:hAnsi="Symbol" w:hint="default"/>
+      </w:rPr>
+    </w:lvl>
+    <w:lvl w:ilvl="4" w:tplc="04090003" w:tentative="1">
+      <w:start w:val="1"/>
+      <w:numFmt w:val="bullet"/>
+      <w:lvlText w:val="o"/>
+      <w:lvlJc w:val="left"/>
+      <w:pPr>
+        <w:ind w:left="3600" w:hanging="360"/>
+      </w:pPr>
+      <w:rPr>
+        <w:rFonts w:ascii="Courier New" w:hAnsi="Courier New" w:cs="Courier New" w:hint="default"/>
+      </w:rPr>
+    </w:lvl>
+    <w:lvl w:ilvl="5" w:tplc="04090005" w:tentative="1">
+      <w:start w:val="1"/>
+      <w:numFmt w:val="bullet"/>
+      <w:lvlText w:val=""/>
+      <w:lvlJc w:val="left"/>
+      <w:pPr>
+        <w:ind w:left="4320" w:hanging="360"/>
+      </w:pPr>
+      <w:rPr>
+        <w:rFonts w:ascii="Wingdings" w:hAnsi="Wingdings" w:hint="default"/>
+      </w:rPr>
+    </w:lvl>
+    <w:lvl w:ilvl="6" w:tplc="04090001" w:tentative="1">
+      <w:start w:val="1"/>
+      <w:numFmt w:val="bullet"/>
+      <w:lvlText w:val=""/>
+      <w:lvlJc w:val="left"/>
+      <w:pPr>
+        <w:ind w:left="5040" w:hanging="360"/>
+      </w:pPr>
+      <w:rPr>
+        <w:rFonts w:ascii="Symbol" w:hAnsi="Symbol" w:hint="default"/>
+      </w:rPr>
+    </w:lvl>
+    <w:lvl w:ilvl="7" w:tplc="04090003" w:tentative="1">
+      <w:start w:val="1"/>
+      <w:numFmt w:val="bullet"/>
+      <w:lvlText w:val="o"/>
+      <w:lvlJc w:val="left"/>
+      <w:pPr>
+        <w:ind w:left="5760" w:hanging="360"/>
+      </w:pPr>
+      <w:rPr>
+        <w:rFonts w:ascii="Courier New" w:hAnsi="Courier New" w:cs="Courier New" w:hint="default"/>
+      </w:rPr>
+    </w:lvl>
+    <w:lvl w:ilvl="8" w:tplc="04090005" w:tentative="1">
+      <w:start w:val="1"/>
+      <w:numFmt w:val="bullet"/>
+      <w:lvlText w:val=""/>
+      <w:lvlJc w:val="left"/>
+      <w:pPr>
+        <w:ind w:left="6480" w:hanging="360"/>
+      </w:pPr>
+      <w:rPr>
+        <w:rFonts w:ascii="Wingdings" w:hAnsi="Wingdings" w:hint="default"/>
+      </w:rPr>
+    </w:lvl>
+  </w:abstractNum>
+  <w:abstractNum w:abstractNumId="6" w15:restartNumberingAfterBreak="0">
     <w:nsid w:val="27A477B3"/>
     <w:multiLevelType w:val="hybridMultilevel"/>
     <w:tmpl w:val="B5866532"/>
@@ -11071,7 +12171,7 @@
       </w:rPr>
     </w:lvl>
   </w:abstractNum>
-  <w:abstractNum w:abstractNumId="6" w15:restartNumberingAfterBreak="0">
+  <w:abstractNum w:abstractNumId="7" w15:restartNumberingAfterBreak="0">
     <w:nsid w:val="2AEB4780"/>
     <w:multiLevelType w:val="hybridMultilevel"/>
     <w:tmpl w:val="853E2C7E"/>
@@ -11184,7 +12284,7 @@
       </w:rPr>
     </w:lvl>
   </w:abstractNum>
-  <w:abstractNum w:abstractNumId="7" w15:restartNumberingAfterBreak="0">
+  <w:abstractNum w:abstractNumId="8" w15:restartNumberingAfterBreak="0">
     <w:nsid w:val="2E9F5795"/>
     <w:multiLevelType w:val="multilevel"/>
     <w:tmpl w:val="5A607360"/>
@@ -11333,7 +12433,7 @@
       </w:rPr>
     </w:lvl>
   </w:abstractNum>
-  <w:abstractNum w:abstractNumId="8" w15:restartNumberingAfterBreak="0">
+  <w:abstractNum w:abstractNumId="9" w15:restartNumberingAfterBreak="0">
     <w:nsid w:val="2FF75F83"/>
     <w:multiLevelType w:val="hybridMultilevel"/>
     <w:tmpl w:val="854C207C"/>
@@ -11446,7 +12546,7 @@
       </w:rPr>
     </w:lvl>
   </w:abstractNum>
-  <w:abstractNum w:abstractNumId="9" w15:restartNumberingAfterBreak="0">
+  <w:abstractNum w:abstractNumId="10" w15:restartNumberingAfterBreak="0">
     <w:nsid w:val="309453B7"/>
     <w:multiLevelType w:val="hybridMultilevel"/>
     <w:tmpl w:val="DA42B9D6"/>
@@ -11559,7 +12659,120 @@
       </w:rPr>
     </w:lvl>
   </w:abstractNum>
-  <w:abstractNum w:abstractNumId="10" w15:restartNumberingAfterBreak="0">
+  <w:abstractNum w:abstractNumId="11" w15:restartNumberingAfterBreak="0">
+    <w:nsid w:val="3ED0730B"/>
+    <w:multiLevelType w:val="hybridMultilevel"/>
+    <w:tmpl w:val="89B42724"/>
+    <w:lvl w:ilvl="0" w:tplc="04090001">
+      <w:start w:val="1"/>
+      <w:numFmt w:val="bullet"/>
+      <w:lvlText w:val=""/>
+      <w:lvlJc w:val="left"/>
+      <w:pPr>
+        <w:ind w:left="720" w:hanging="360"/>
+      </w:pPr>
+      <w:rPr>
+        <w:rFonts w:ascii="Symbol" w:hAnsi="Symbol" w:hint="default"/>
+      </w:rPr>
+    </w:lvl>
+    <w:lvl w:ilvl="1" w:tplc="04090003" w:tentative="1">
+      <w:start w:val="1"/>
+      <w:numFmt w:val="bullet"/>
+      <w:lvlText w:val="o"/>
+      <w:lvlJc w:val="left"/>
+      <w:pPr>
+        <w:ind w:left="1440" w:hanging="360"/>
+      </w:pPr>
+      <w:rPr>
+        <w:rFonts w:ascii="Courier New" w:hAnsi="Courier New" w:cs="Courier New" w:hint="default"/>
+      </w:rPr>
+    </w:lvl>
+    <w:lvl w:ilvl="2" w:tplc="04090005" w:tentative="1">
+      <w:start w:val="1"/>
+      <w:numFmt w:val="bullet"/>
+      <w:lvlText w:val=""/>
+      <w:lvlJc w:val="left"/>
+      <w:pPr>
+        <w:ind w:left="2160" w:hanging="360"/>
+      </w:pPr>
+      <w:rPr>
+        <w:rFonts w:ascii="Wingdings" w:hAnsi="Wingdings" w:hint="default"/>
+      </w:rPr>
+    </w:lvl>
+    <w:lvl w:ilvl="3" w:tplc="04090001" w:tentative="1">
+      <w:start w:val="1"/>
+      <w:numFmt w:val="bullet"/>
+      <w:lvlText w:val=""/>
+      <w:lvlJc w:val="left"/>
+      <w:pPr>
+        <w:ind w:left="2880" w:hanging="360"/>
+      </w:pPr>
+      <w:rPr>
+        <w:rFonts w:ascii="Symbol" w:hAnsi="Symbol" w:hint="default"/>
+      </w:rPr>
+    </w:lvl>
+    <w:lvl w:ilvl="4" w:tplc="04090003" w:tentative="1">
+      <w:start w:val="1"/>
+      <w:numFmt w:val="bullet"/>
+      <w:lvlText w:val="o"/>
+      <w:lvlJc w:val="left"/>
+      <w:pPr>
+        <w:ind w:left="3600" w:hanging="360"/>
+      </w:pPr>
+      <w:rPr>
+        <w:rFonts w:ascii="Courier New" w:hAnsi="Courier New" w:cs="Courier New" w:hint="default"/>
+      </w:rPr>
+    </w:lvl>
+    <w:lvl w:ilvl="5" w:tplc="04090005" w:tentative="1">
+      <w:start w:val="1"/>
+      <w:numFmt w:val="bullet"/>
+      <w:lvlText w:val=""/>
+      <w:lvlJc w:val="left"/>
+      <w:pPr>
+        <w:ind w:left="4320" w:hanging="360"/>
+      </w:pPr>
+      <w:rPr>
+        <w:rFonts w:ascii="Wingdings" w:hAnsi="Wingdings" w:hint="default"/>
+      </w:rPr>
+    </w:lvl>
+    <w:lvl w:ilvl="6" w:tplc="04090001" w:tentative="1">
+      <w:start w:val="1"/>
+      <w:numFmt w:val="bullet"/>
+      <w:lvlText w:val=""/>
+      <w:lvlJc w:val="left"/>
+      <w:pPr>
+        <w:ind w:left="5040" w:hanging="360"/>
+      </w:pPr>
+      <w:rPr>
+        <w:rFonts w:ascii="Symbol" w:hAnsi="Symbol" w:hint="default"/>
+      </w:rPr>
+    </w:lvl>
+    <w:lvl w:ilvl="7" w:tplc="04090003" w:tentative="1">
+      <w:start w:val="1"/>
+      <w:numFmt w:val="bullet"/>
+      <w:lvlText w:val="o"/>
+      <w:lvlJc w:val="left"/>
+      <w:pPr>
+        <w:ind w:left="5760" w:hanging="360"/>
+      </w:pPr>
+      <w:rPr>
+        <w:rFonts w:ascii="Courier New" w:hAnsi="Courier New" w:cs="Courier New" w:hint="default"/>
+      </w:rPr>
+    </w:lvl>
+    <w:lvl w:ilvl="8" w:tplc="04090005" w:tentative="1">
+      <w:start w:val="1"/>
+      <w:numFmt w:val="bullet"/>
+      <w:lvlText w:val=""/>
+      <w:lvlJc w:val="left"/>
+      <w:pPr>
+        <w:ind w:left="6480" w:hanging="360"/>
+      </w:pPr>
+      <w:rPr>
+        <w:rFonts w:ascii="Wingdings" w:hAnsi="Wingdings" w:hint="default"/>
+      </w:rPr>
+    </w:lvl>
+  </w:abstractNum>
+  <w:abstractNum w:abstractNumId="12" w15:restartNumberingAfterBreak="0">
     <w:nsid w:val="44FE0155"/>
     <w:multiLevelType w:val="hybridMultilevel"/>
     <w:tmpl w:val="DFB0041E"/>
@@ -11672,7 +12885,156 @@
       </w:rPr>
     </w:lvl>
   </w:abstractNum>
-  <w:abstractNum w:abstractNumId="11" w15:restartNumberingAfterBreak="0">
+  <w:abstractNum w:abstractNumId="13" w15:restartNumberingAfterBreak="0">
+    <w:nsid w:val="4EFD79A2"/>
+    <w:multiLevelType w:val="multilevel"/>
+    <w:tmpl w:val="1A94EB02"/>
+    <w:lvl w:ilvl="0">
+      <w:start w:val="1"/>
+      <w:numFmt w:val="bullet"/>
+      <w:lvlText w:val=""/>
+      <w:lvlJc w:val="left"/>
+      <w:pPr>
+        <w:tabs>
+          <w:tab w:val="num" w:pos="720"/>
+        </w:tabs>
+        <w:ind w:left="720" w:hanging="360"/>
+      </w:pPr>
+      <w:rPr>
+        <w:rFonts w:ascii="Symbol" w:hAnsi="Symbol" w:hint="default"/>
+        <w:sz w:val="20"/>
+      </w:rPr>
+    </w:lvl>
+    <w:lvl w:ilvl="1" w:tentative="1">
+      <w:start w:val="1"/>
+      <w:numFmt w:val="bullet"/>
+      <w:lvlText w:val="o"/>
+      <w:lvlJc w:val="left"/>
+      <w:pPr>
+        <w:tabs>
+          <w:tab w:val="num" w:pos="1440"/>
+        </w:tabs>
+        <w:ind w:left="1440" w:hanging="360"/>
+      </w:pPr>
+      <w:rPr>
+        <w:rFonts w:ascii="Courier New" w:hAnsi="Courier New" w:hint="default"/>
+        <w:sz w:val="20"/>
+      </w:rPr>
+    </w:lvl>
+    <w:lvl w:ilvl="2" w:tentative="1">
+      <w:start w:val="1"/>
+      <w:numFmt w:val="bullet"/>
+      <w:lvlText w:val=""/>
+      <w:lvlJc w:val="left"/>
+      <w:pPr>
+        <w:tabs>
+          <w:tab w:val="num" w:pos="2160"/>
+        </w:tabs>
+        <w:ind w:left="2160" w:hanging="360"/>
+      </w:pPr>
+      <w:rPr>
+        <w:rFonts w:ascii="Wingdings" w:hAnsi="Wingdings" w:hint="default"/>
+        <w:sz w:val="20"/>
+      </w:rPr>
+    </w:lvl>
+    <w:lvl w:ilvl="3" w:tentative="1">
+      <w:start w:val="1"/>
+      <w:numFmt w:val="bullet"/>
+      <w:lvlText w:val=""/>
+      <w:lvlJc w:val="left"/>
+      <w:pPr>
+        <w:tabs>
+          <w:tab w:val="num" w:pos="2880"/>
+        </w:tabs>
+        <w:ind w:left="2880" w:hanging="360"/>
+      </w:pPr>
+      <w:rPr>
+        <w:rFonts w:ascii="Wingdings" w:hAnsi="Wingdings" w:hint="default"/>
+        <w:sz w:val="20"/>
+      </w:rPr>
+    </w:lvl>
+    <w:lvl w:ilvl="4" w:tentative="1">
+      <w:start w:val="1"/>
+      <w:numFmt w:val="bullet"/>
+      <w:lvlText w:val=""/>
+      <w:lvlJc w:val="left"/>
+      <w:pPr>
+        <w:tabs>
+          <w:tab w:val="num" w:pos="3600"/>
+        </w:tabs>
+        <w:ind w:left="3600" w:hanging="360"/>
+      </w:pPr>
+      <w:rPr>
+        <w:rFonts w:ascii="Wingdings" w:hAnsi="Wingdings" w:hint="default"/>
+        <w:sz w:val="20"/>
+      </w:rPr>
+    </w:lvl>
+    <w:lvl w:ilvl="5" w:tentative="1">
+      <w:start w:val="1"/>
+      <w:numFmt w:val="bullet"/>
+      <w:lvlText w:val=""/>
+      <w:lvlJc w:val="left"/>
+      <w:pPr>
+        <w:tabs>
+          <w:tab w:val="num" w:pos="4320"/>
+        </w:tabs>
+        <w:ind w:left="4320" w:hanging="360"/>
+      </w:pPr>
+      <w:rPr>
+        <w:rFonts w:ascii="Wingdings" w:hAnsi="Wingdings" w:hint="default"/>
+        <w:sz w:val="20"/>
+      </w:rPr>
+    </w:lvl>
+    <w:lvl w:ilvl="6" w:tentative="1">
+      <w:start w:val="1"/>
+      <w:numFmt w:val="bullet"/>
+      <w:lvlText w:val=""/>
+      <w:lvlJc w:val="left"/>
+      <w:pPr>
+        <w:tabs>
+          <w:tab w:val="num" w:pos="5040"/>
+        </w:tabs>
+        <w:ind w:left="5040" w:hanging="360"/>
+      </w:pPr>
+      <w:rPr>
+        <w:rFonts w:ascii="Wingdings" w:hAnsi="Wingdings" w:hint="default"/>
+        <w:sz w:val="20"/>
+      </w:rPr>
+    </w:lvl>
+    <w:lvl w:ilvl="7" w:tentative="1">
+      <w:start w:val="1"/>
+      <w:numFmt w:val="bullet"/>
+      <w:lvlText w:val=""/>
+      <w:lvlJc w:val="left"/>
+      <w:pPr>
+        <w:tabs>
+          <w:tab w:val="num" w:pos="5760"/>
+        </w:tabs>
+        <w:ind w:left="5760" w:hanging="360"/>
+      </w:pPr>
+      <w:rPr>
+        <w:rFonts w:ascii="Wingdings" w:hAnsi="Wingdings" w:hint="default"/>
+        <w:sz w:val="20"/>
+      </w:rPr>
+    </w:lvl>
+    <w:lvl w:ilvl="8" w:tentative="1">
+      <w:start w:val="1"/>
+      <w:numFmt w:val="bullet"/>
+      <w:lvlText w:val=""/>
+      <w:lvlJc w:val="left"/>
+      <w:pPr>
+        <w:tabs>
+          <w:tab w:val="num" w:pos="6480"/>
+        </w:tabs>
+        <w:ind w:left="6480" w:hanging="360"/>
+      </w:pPr>
+      <w:rPr>
+        <w:rFonts w:ascii="Wingdings" w:hAnsi="Wingdings" w:hint="default"/>
+        <w:sz w:val="20"/>
+      </w:rPr>
+    </w:lvl>
+  </w:abstractNum>
+  <w:abstractNum w:abstractNumId="14" w15:restartNumberingAfterBreak="0">
     <w:nsid w:val="55DC1621"/>
     <w:multiLevelType w:val="hybridMultilevel"/>
     <w:tmpl w:val="3196C1F0"/>
@@ -11785,7 +13147,7 @@
       </w:rPr>
     </w:lvl>
   </w:abstractNum>
-  <w:abstractNum w:abstractNumId="12" w15:restartNumberingAfterBreak="0">
+  <w:abstractNum w:abstractNumId="15" w15:restartNumberingAfterBreak="0">
     <w:nsid w:val="5F3420C3"/>
     <w:multiLevelType w:val="multilevel"/>
     <w:tmpl w:val="148CB8AC"/>
@@ -11934,7 +13296,7 @@
       </w:rPr>
     </w:lvl>
   </w:abstractNum>
-  <w:abstractNum w:abstractNumId="13" w15:restartNumberingAfterBreak="0">
+  <w:abstractNum w:abstractNumId="16" w15:restartNumberingAfterBreak="0">
     <w:nsid w:val="65CA4ADB"/>
     <w:multiLevelType w:val="hybridMultilevel"/>
     <w:tmpl w:val="2CA04056"/>
@@ -12047,7 +13409,7 @@
       </w:rPr>
     </w:lvl>
   </w:abstractNum>
-  <w:abstractNum w:abstractNumId="14" w15:restartNumberingAfterBreak="0">
+  <w:abstractNum w:abstractNumId="17" w15:restartNumberingAfterBreak="0">
     <w:nsid w:val="685F64C5"/>
     <w:multiLevelType w:val="hybridMultilevel"/>
     <w:tmpl w:val="D95C4462"/>
@@ -12160,7 +13522,7 @@
       </w:rPr>
     </w:lvl>
   </w:abstractNum>
-  <w:abstractNum w:abstractNumId="15" w15:restartNumberingAfterBreak="0">
+  <w:abstractNum w:abstractNumId="18" w15:restartNumberingAfterBreak="0">
     <w:nsid w:val="6BC479C5"/>
     <w:multiLevelType w:val="hybridMultilevel"/>
     <w:tmpl w:val="AC2E0260"/>
@@ -12273,7 +13635,7 @@
       </w:rPr>
     </w:lvl>
   </w:abstractNum>
-  <w:abstractNum w:abstractNumId="16" w15:restartNumberingAfterBreak="0">
+  <w:abstractNum w:abstractNumId="19" w15:restartNumberingAfterBreak="0">
     <w:nsid w:val="6EBB3E08"/>
     <w:multiLevelType w:val="hybridMultilevel"/>
     <w:tmpl w:val="F120050C"/>
@@ -12386,7 +13748,156 @@
       </w:rPr>
     </w:lvl>
   </w:abstractNum>
-  <w:abstractNum w:abstractNumId="17" w15:restartNumberingAfterBreak="0">
+  <w:abstractNum w:abstractNumId="20" w15:restartNumberingAfterBreak="0">
+    <w:nsid w:val="70F5497A"/>
+    <w:multiLevelType w:val="multilevel"/>
+    <w:tmpl w:val="3ED83A3A"/>
+    <w:lvl w:ilvl="0">
+      <w:start w:val="1"/>
+      <w:numFmt w:val="bullet"/>
+      <w:lvlText w:val=""/>
+      <w:lvlJc w:val="left"/>
+      <w:pPr>
+        <w:tabs>
+          <w:tab w:val="num" w:pos="720"/>
+        </w:tabs>
+        <w:ind w:left="720" w:hanging="360"/>
+      </w:pPr>
+      <w:rPr>
+        <w:rFonts w:ascii="Symbol" w:hAnsi="Symbol" w:hint="default"/>
+        <w:sz w:val="20"/>
+      </w:rPr>
+    </w:lvl>
+    <w:lvl w:ilvl="1" w:tentative="1">
+      <w:start w:val="1"/>
+      <w:numFmt w:val="bullet"/>
+      <w:lvlText w:val="o"/>
+      <w:lvlJc w:val="left"/>
+      <w:pPr>
+        <w:tabs>
+          <w:tab w:val="num" w:pos="1440"/>
+        </w:tabs>
+        <w:ind w:left="1440" w:hanging="360"/>
+      </w:pPr>
+      <w:rPr>
+        <w:rFonts w:ascii="Courier New" w:hAnsi="Courier New" w:hint="default"/>
+        <w:sz w:val="20"/>
+      </w:rPr>
+    </w:lvl>
+    <w:lvl w:ilvl="2" w:tentative="1">
+      <w:start w:val="1"/>
+      <w:numFmt w:val="bullet"/>
+      <w:lvlText w:val=""/>
+      <w:lvlJc w:val="left"/>
+      <w:pPr>
+        <w:tabs>
+          <w:tab w:val="num" w:pos="2160"/>
+        </w:tabs>
+        <w:ind w:left="2160" w:hanging="360"/>
+      </w:pPr>
+      <w:rPr>
+        <w:rFonts w:ascii="Wingdings" w:hAnsi="Wingdings" w:hint="default"/>
+        <w:sz w:val="20"/>
+      </w:rPr>
+    </w:lvl>
+    <w:lvl w:ilvl="3" w:tentative="1">
+      <w:start w:val="1"/>
+      <w:numFmt w:val="bullet"/>
+      <w:lvlText w:val=""/>
+      <w:lvlJc w:val="left"/>
+      <w:pPr>
+        <w:tabs>
+          <w:tab w:val="num" w:pos="2880"/>
+        </w:tabs>
+        <w:ind w:left="2880" w:hanging="360"/>
+      </w:pPr>
+      <w:rPr>
+        <w:rFonts w:ascii="Wingdings" w:hAnsi="Wingdings" w:hint="default"/>
+        <w:sz w:val="20"/>
+      </w:rPr>
+    </w:lvl>
+    <w:lvl w:ilvl="4" w:tentative="1">
+      <w:start w:val="1"/>
+      <w:numFmt w:val="bullet"/>
+      <w:lvlText w:val=""/>
+      <w:lvlJc w:val="left"/>
+      <w:pPr>
+        <w:tabs>
+          <w:tab w:val="num" w:pos="3600"/>
+        </w:tabs>
+        <w:ind w:left="3600" w:hanging="360"/>
+      </w:pPr>
+      <w:rPr>
+        <w:rFonts w:ascii="Wingdings" w:hAnsi="Wingdings" w:hint="default"/>
+        <w:sz w:val="20"/>
+      </w:rPr>
+    </w:lvl>
+    <w:lvl w:ilvl="5" w:tentative="1">
+      <w:start w:val="1"/>
+      <w:numFmt w:val="bullet"/>
+      <w:lvlText w:val=""/>
+      <w:lvlJc w:val="left"/>
+      <w:pPr>
+        <w:tabs>
+          <w:tab w:val="num" w:pos="4320"/>
+        </w:tabs>
+        <w:ind w:left="4320" w:hanging="360"/>
+      </w:pPr>
+      <w:rPr>
+        <w:rFonts w:ascii="Wingdings" w:hAnsi="Wingdings" w:hint="default"/>
+        <w:sz w:val="20"/>
+      </w:rPr>
+    </w:lvl>
+    <w:lvl w:ilvl="6" w:tentative="1">
+      <w:start w:val="1"/>
+      <w:numFmt w:val="bullet"/>
+      <w:lvlText w:val=""/>
+      <w:lvlJc w:val="left"/>
+      <w:pPr>
+        <w:tabs>
+          <w:tab w:val="num" w:pos="5040"/>
+        </w:tabs>
+        <w:ind w:left="5040" w:hanging="360"/>
+      </w:pPr>
+      <w:rPr>
+        <w:rFonts w:ascii="Wingdings" w:hAnsi="Wingdings" w:hint="default"/>
+        <w:sz w:val="20"/>
+      </w:rPr>
+    </w:lvl>
+    <w:lvl w:ilvl="7" w:tentative="1">
+      <w:start w:val="1"/>
+      <w:numFmt w:val="bullet"/>
+      <w:lvlText w:val=""/>
+      <w:lvlJc w:val="left"/>
+      <w:pPr>
+        <w:tabs>
+          <w:tab w:val="num" w:pos="5760"/>
+        </w:tabs>
+        <w:ind w:left="5760" w:hanging="360"/>
+      </w:pPr>
+      <w:rPr>
+        <w:rFonts w:ascii="Wingdings" w:hAnsi="Wingdings" w:hint="default"/>
+        <w:sz w:val="20"/>
+      </w:rPr>
+    </w:lvl>
+    <w:lvl w:ilvl="8" w:tentative="1">
+      <w:start w:val="1"/>
+      <w:numFmt w:val="bullet"/>
+      <w:lvlText w:val=""/>
+      <w:lvlJc w:val="left"/>
+      <w:pPr>
+        <w:tabs>
+          <w:tab w:val="num" w:pos="6480"/>
+        </w:tabs>
+        <w:ind w:left="6480" w:hanging="360"/>
+      </w:pPr>
+      <w:rPr>
+        <w:rFonts w:ascii="Wingdings" w:hAnsi="Wingdings" w:hint="default"/>
+        <w:sz w:val="20"/>
+      </w:rPr>
+    </w:lvl>
+  </w:abstractNum>
+  <w:abstractNum w:abstractNumId="21" w15:restartNumberingAfterBreak="0">
     <w:nsid w:val="75690130"/>
     <w:multiLevelType w:val="multilevel"/>
     <w:tmpl w:val="69988C80"/>
@@ -12535,7 +14046,7 @@
       </w:rPr>
     </w:lvl>
   </w:abstractNum>
-  <w:abstractNum w:abstractNumId="18" w15:restartNumberingAfterBreak="0">
+  <w:abstractNum w:abstractNumId="22" w15:restartNumberingAfterBreak="0">
     <w:nsid w:val="77721F32"/>
     <w:multiLevelType w:val="hybridMultilevel"/>
     <w:tmpl w:val="13760090"/>
@@ -12648,10 +14159,10 @@
       </w:rPr>
     </w:lvl>
   </w:abstractNum>
-  <w:abstractNum w:abstractNumId="19" w15:restartNumberingAfterBreak="0">
+  <w:abstractNum w:abstractNumId="23" w15:restartNumberingAfterBreak="0">
     <w:nsid w:val="7CA04BBF"/>
     <w:multiLevelType w:val="hybridMultilevel"/>
-    <w:tmpl w:val="38D0F72C"/>
+    <w:tmpl w:val="C672ACA6"/>
     <w:lvl w:ilvl="0" w:tplc="04090001">
       <w:start w:val="1"/>
       <w:numFmt w:val="bullet"/>
@@ -12765,31 +14276,31 @@
     <w:abstractNumId w:val="1"/>
   </w:num>
   <w:num w:numId="2" w16cid:durableId="1724061926">
-    <w:abstractNumId w:val="11"/>
+    <w:abstractNumId w:val="14"/>
   </w:num>
   <w:num w:numId="3" w16cid:durableId="2060085104">
-    <w:abstractNumId w:val="16"/>
+    <w:abstractNumId w:val="19"/>
   </w:num>
   <w:num w:numId="4" w16cid:durableId="789473921">
-    <w:abstractNumId w:val="5"/>
+    <w:abstractNumId w:val="6"/>
   </w:num>
   <w:num w:numId="5" w16cid:durableId="1670062766">
-    <w:abstractNumId w:val="6"/>
+    <w:abstractNumId w:val="7"/>
   </w:num>
   <w:num w:numId="6" w16cid:durableId="861431501">
     <w:abstractNumId w:val="2"/>
   </w:num>
   <w:num w:numId="7" w16cid:durableId="1410300980">
-    <w:abstractNumId w:val="9"/>
+    <w:abstractNumId w:val="10"/>
   </w:num>
   <w:num w:numId="8" w16cid:durableId="518586853">
-    <w:abstractNumId w:val="13"/>
+    <w:abstractNumId w:val="16"/>
   </w:num>
   <w:num w:numId="9" w16cid:durableId="784807550">
-    <w:abstractNumId w:val="10"/>
+    <w:abstractNumId w:val="12"/>
   </w:num>
   <w:num w:numId="10" w16cid:durableId="608506301">
-    <w:abstractNumId w:val="12"/>
+    <w:abstractNumId w:val="15"/>
   </w:num>
   <w:num w:numId="11" w16cid:durableId="1173715416">
     <w:abstractNumId w:val="4"/>
@@ -12801,25 +14312,37 @@
     <w:abstractNumId w:val="3"/>
   </w:num>
   <w:num w:numId="14" w16cid:durableId="167141314">
-    <w:abstractNumId w:val="15"/>
+    <w:abstractNumId w:val="18"/>
   </w:num>
   <w:num w:numId="15" w16cid:durableId="1711104382">
-    <w:abstractNumId w:val="18"/>
+    <w:abstractNumId w:val="22"/>
   </w:num>
   <w:num w:numId="16" w16cid:durableId="70083866">
-    <w:abstractNumId w:val="14"/>
+    <w:abstractNumId w:val="17"/>
   </w:num>
   <w:num w:numId="17" w16cid:durableId="1955014208">
+    <w:abstractNumId w:val="9"/>
+  </w:num>
+  <w:num w:numId="18" w16cid:durableId="330568974">
+    <w:abstractNumId w:val="23"/>
+  </w:num>
+  <w:num w:numId="19" w16cid:durableId="1583104091">
     <w:abstractNumId w:val="8"/>
   </w:num>
-  <w:num w:numId="18" w16cid:durableId="330568974">
-    <w:abstractNumId w:val="19"/>
+  <w:num w:numId="20" w16cid:durableId="1486504874">
+    <w:abstractNumId w:val="21"/>
   </w:num>
-  <w:num w:numId="19" w16cid:durableId="1583104091">
-    <w:abstractNumId w:val="7"/>
+  <w:num w:numId="21" w16cid:durableId="553271288">
+    <w:abstractNumId w:val="20"/>
   </w:num>
-  <w:num w:numId="20" w16cid:durableId="1486504874">
-    <w:abstractNumId w:val="17"/>
+  <w:num w:numId="22" w16cid:durableId="940455693">
+    <w:abstractNumId w:val="13"/>
+  </w:num>
+  <w:num w:numId="23" w16cid:durableId="1856915708">
+    <w:abstractNumId w:val="11"/>
+  </w:num>
+  <w:num w:numId="24" w16cid:durableId="87970668">
+    <w:abstractNumId w:val="5"/>
   </w:num>
 </w:numbering>
 </file>

</xml_diff>

<commit_message>
add routing notes for express
</commit_message>
<xml_diff>
--- a/Javascript/NodeJs Notes.docx
+++ b/Javascript/NodeJs Notes.docx
@@ -11357,9 +11357,318 @@
           <w:szCs w:val="22"/>
           <w14:ligatures w14:val="standardContextual"/>
         </w:rPr>
-        <w:t xml:space="preserve">Inside each file we have </w:t>
-      </w:r>
-      <w:r>
+        <w:t>routing means deciding what should happen when a user visits a particular URL using a particular HTTP method</w:t>
+      </w:r>
+    </w:p>
+    <w:p>
+      <w:pPr>
+        <w:pStyle w:val="ListParagraph"/>
+        <w:numPr>
+          <w:ilvl w:val="0"/>
+          <w:numId w:val="25"/>
+        </w:numPr>
+        <w:rPr>
+          <w:color w:val="000000" w:themeColor="text1"/>
+          <w:sz w:val="22"/>
+          <w:szCs w:val="22"/>
+        </w:rPr>
+      </w:pPr>
+      <w:r>
+        <w:rPr>
+          <w:color w:val="000000" w:themeColor="text1"/>
+          <w:sz w:val="22"/>
+          <w:szCs w:val="22"/>
+        </w:rPr>
+        <w:t>Route parameters</w:t>
+      </w:r>
+      <w:r>
+        <w:rPr>
+          <w:color w:val="000000" w:themeColor="text1"/>
+          <w:sz w:val="22"/>
+          <w:szCs w:val="22"/>
+        </w:rPr>
+        <w:t xml:space="preserve">: </w:t>
+      </w:r>
+      <w:r>
+        <w:rPr>
+          <w:color w:val="000000" w:themeColor="text1"/>
+          <w:sz w:val="22"/>
+          <w:szCs w:val="22"/>
+        </w:rPr>
+        <w:t xml:space="preserve">This is one of the most useful concepts in Express </w:t>
+      </w:r>
+      <w:proofErr w:type="gramStart"/>
+      <w:r>
+        <w:rPr>
+          <w:color w:val="000000" w:themeColor="text1"/>
+          <w:sz w:val="22"/>
+          <w:szCs w:val="22"/>
+        </w:rPr>
+        <w:t>routing</w:t>
+      </w:r>
+      <w:proofErr w:type="gramEnd"/>
+      <w:r>
+        <w:rPr>
+          <w:color w:val="000000" w:themeColor="text1"/>
+          <w:sz w:val="22"/>
+          <w:szCs w:val="22"/>
+        </w:rPr>
+        <w:t>.</w:t>
+      </w:r>
+      <w:r>
+        <w:rPr>
+          <w:color w:val="000000" w:themeColor="text1"/>
+          <w:sz w:val="22"/>
+          <w:szCs w:val="22"/>
+        </w:rPr>
+        <w:t xml:space="preserve"> And </w:t>
+      </w:r>
+      <w:proofErr w:type="gramStart"/>
+      <w:r>
+        <w:rPr>
+          <w:color w:val="000000" w:themeColor="text1"/>
+          <w:sz w:val="22"/>
+          <w:szCs w:val="22"/>
+        </w:rPr>
+        <w:t>its</w:t>
+      </w:r>
+      <w:proofErr w:type="gramEnd"/>
+      <w:r>
+        <w:rPr>
+          <w:color w:val="000000" w:themeColor="text1"/>
+          <w:sz w:val="22"/>
+          <w:szCs w:val="22"/>
+        </w:rPr>
+        <w:t xml:space="preserve"> taking a parameter as a variable in the URL for example an id of a user or an order so get/resource/:id </w:t>
+      </w:r>
+      <w:r>
+        <w:rPr>
+          <w:color w:val="000000" w:themeColor="text1"/>
+          <w:sz w:val="22"/>
+          <w:szCs w:val="22"/>
+        </w:rPr>
+        <w:sym w:font="Wingdings" w:char="F0E0"/>
+      </w:r>
+      <w:r>
+        <w:rPr>
+          <w:color w:val="000000" w:themeColor="text1"/>
+          <w:sz w:val="22"/>
+          <w:szCs w:val="22"/>
+        </w:rPr>
+        <w:t xml:space="preserve"> where id is a variable </w:t>
+      </w:r>
+    </w:p>
+    <w:p>
+      <w:pPr>
+        <w:pStyle w:val="ListParagraph"/>
+        <w:numPr>
+          <w:ilvl w:val="0"/>
+          <w:numId w:val="25"/>
+        </w:numPr>
+        <w:rPr>
+          <w:color w:val="000000" w:themeColor="text1"/>
+          <w:sz w:val="22"/>
+          <w:szCs w:val="22"/>
+        </w:rPr>
+      </w:pPr>
+      <w:r>
+        <w:rPr>
+          <w:color w:val="000000" w:themeColor="text1"/>
+          <w:sz w:val="22"/>
+          <w:szCs w:val="22"/>
+        </w:rPr>
+        <w:t xml:space="preserve">In express using </w:t>
+      </w:r>
+      <w:proofErr w:type="spellStart"/>
+      <w:proofErr w:type="gramStart"/>
+      <w:r>
+        <w:rPr>
+          <w:color w:val="000000" w:themeColor="text1"/>
+          <w:sz w:val="22"/>
+          <w:szCs w:val="22"/>
+        </w:rPr>
+        <w:t>req.params</w:t>
+      </w:r>
+      <w:proofErr w:type="spellEnd"/>
+      <w:proofErr w:type="gramEnd"/>
+      <w:r>
+        <w:rPr>
+          <w:color w:val="000000" w:themeColor="text1"/>
+          <w:sz w:val="22"/>
+          <w:szCs w:val="22"/>
+        </w:rPr>
+        <w:t xml:space="preserve"> will include the parameters passed in the request for example the id</w:t>
+      </w:r>
+    </w:p>
+    <w:p>
+      <w:pPr>
+        <w:pStyle w:val="ListParagraph"/>
+        <w:numPr>
+          <w:ilvl w:val="0"/>
+          <w:numId w:val="25"/>
+        </w:numPr>
+        <w:rPr>
+          <w:color w:val="000000" w:themeColor="text1"/>
+          <w:sz w:val="22"/>
+          <w:szCs w:val="22"/>
+        </w:rPr>
+      </w:pPr>
+      <w:r>
+        <w:rPr>
+          <w:color w:val="000000" w:themeColor="text1"/>
+          <w:sz w:val="22"/>
+          <w:szCs w:val="22"/>
+        </w:rPr>
+        <w:t>Route parameters identify something as part of the URL's path. Query parameters modify/filter the request.</w:t>
+      </w:r>
+      <w:r>
+        <w:rPr>
+          <w:color w:val="000000" w:themeColor="text1"/>
+          <w:sz w:val="22"/>
+          <w:szCs w:val="22"/>
+        </w:rPr>
+        <w:t xml:space="preserve"> :id </w:t>
+      </w:r>
+      <w:r>
+        <w:rPr>
+          <w:color w:val="000000" w:themeColor="text1"/>
+          <w:sz w:val="22"/>
+          <w:szCs w:val="22"/>
+        </w:rPr>
+        <w:sym w:font="Wingdings" w:char="F0E8"/>
+      </w:r>
+      <w:r>
+        <w:rPr>
+          <w:color w:val="000000" w:themeColor="text1"/>
+          <w:sz w:val="22"/>
+          <w:szCs w:val="22"/>
+        </w:rPr>
+        <w:t xml:space="preserve"> is request parameter </w:t>
+      </w:r>
+      <w:proofErr w:type="gramStart"/>
+      <w:r>
+        <w:rPr>
+          <w:color w:val="000000" w:themeColor="text1"/>
+          <w:sz w:val="22"/>
+          <w:szCs w:val="22"/>
+        </w:rPr>
+        <w:t>while ?id</w:t>
+      </w:r>
+      <w:proofErr w:type="gramEnd"/>
+      <w:r>
+        <w:rPr>
+          <w:color w:val="000000" w:themeColor="text1"/>
+          <w:sz w:val="22"/>
+          <w:szCs w:val="22"/>
+        </w:rPr>
+        <w:t xml:space="preserve"> is a query parameter</w:t>
+      </w:r>
+    </w:p>
+    <w:p>
+      <w:pPr>
+        <w:pStyle w:val="ListParagraph"/>
+        <w:numPr>
+          <w:ilvl w:val="0"/>
+          <w:numId w:val="25"/>
+        </w:numPr>
+        <w:rPr>
+          <w:color w:val="000000" w:themeColor="text1"/>
+          <w:sz w:val="22"/>
+          <w:szCs w:val="22"/>
+        </w:rPr>
+      </w:pPr>
+      <w:proofErr w:type="spellStart"/>
+      <w:r>
+        <w:rPr>
+          <w:color w:val="000000" w:themeColor="text1"/>
+          <w:sz w:val="22"/>
+          <w:szCs w:val="22"/>
+        </w:rPr>
+        <w:t>app.use</w:t>
+      </w:r>
+      <w:proofErr w:type="spellEnd"/>
+      <w:r>
+        <w:rPr>
+          <w:color w:val="000000" w:themeColor="text1"/>
+          <w:sz w:val="22"/>
+          <w:szCs w:val="22"/>
+        </w:rPr>
+        <w:t>(</w:t>
+      </w:r>
+      <w:proofErr w:type="spellStart"/>
+      <w:proofErr w:type="gramStart"/>
+      <w:r>
+        <w:rPr>
+          <w:color w:val="000000" w:themeColor="text1"/>
+          <w:sz w:val="22"/>
+          <w:szCs w:val="22"/>
+        </w:rPr>
+        <w:t>express.json</w:t>
+      </w:r>
+      <w:proofErr w:type="spellEnd"/>
+      <w:proofErr w:type="gramEnd"/>
+      <w:r>
+        <w:rPr>
+          <w:color w:val="000000" w:themeColor="text1"/>
+          <w:sz w:val="22"/>
+          <w:szCs w:val="22"/>
+        </w:rPr>
+        <w:t>()) is usually registered once for the whole Express app</w:t>
+      </w:r>
+      <w:r>
+        <w:rPr>
+          <w:color w:val="000000" w:themeColor="text1"/>
+          <w:sz w:val="22"/>
+          <w:szCs w:val="22"/>
+        </w:rPr>
+        <w:t xml:space="preserve">, we put it in the top of our application once and it allows us to parse data passed into the body of a request into a </w:t>
+      </w:r>
+      <w:proofErr w:type="spellStart"/>
+      <w:r>
+        <w:rPr>
+          <w:color w:val="000000" w:themeColor="text1"/>
+          <w:sz w:val="22"/>
+          <w:szCs w:val="22"/>
+        </w:rPr>
+        <w:t>json</w:t>
+      </w:r>
+      <w:proofErr w:type="spellEnd"/>
+      <w:r>
+        <w:rPr>
+          <w:color w:val="000000" w:themeColor="text1"/>
+          <w:sz w:val="22"/>
+          <w:szCs w:val="22"/>
+        </w:rPr>
+        <w:t xml:space="preserve"> that we can use </w:t>
+      </w:r>
+      <w:proofErr w:type="spellStart"/>
+      <w:proofErr w:type="gramStart"/>
+      <w:r>
+        <w:rPr>
+          <w:color w:val="000000" w:themeColor="text1"/>
+          <w:sz w:val="22"/>
+          <w:szCs w:val="22"/>
+        </w:rPr>
+        <w:t>req.params</w:t>
+      </w:r>
+      <w:proofErr w:type="spellEnd"/>
+      <w:proofErr w:type="gramEnd"/>
+      <w:r>
+        <w:rPr>
+          <w:color w:val="000000" w:themeColor="text1"/>
+          <w:sz w:val="22"/>
+          <w:szCs w:val="22"/>
+        </w:rPr>
+        <w:t xml:space="preserve"> on</w:t>
+      </w:r>
+    </w:p>
+    <w:p>
+      <w:pPr>
+        <w:pStyle w:val="HTMLPreformatted"/>
+        <w:numPr>
+          <w:ilvl w:val="0"/>
+          <w:numId w:val="25"/>
+        </w:numPr>
         <w:rPr>
           <w:rFonts w:asciiTheme="minorHAnsi" w:eastAsiaTheme="minorHAnsi" w:hAnsiTheme="minorHAnsi" w:cstheme="minorBidi"/>
           <w:color w:val="000000" w:themeColor="text1"/>
@@ -11368,6 +11677,16 @@
           <w:szCs w:val="22"/>
           <w14:ligatures w14:val="standardContextual"/>
         </w:rPr>
+      </w:pPr>
+      <w:r>
+        <w:rPr>
+          <w:rFonts w:asciiTheme="minorHAnsi" w:eastAsiaTheme="minorHAnsi" w:hAnsiTheme="minorHAnsi" w:cstheme="minorBidi"/>
+          <w:color w:val="000000" w:themeColor="text1"/>
+          <w:kern w:val="2"/>
+          <w:sz w:val="22"/>
+          <w:szCs w:val="22"/>
+          <w14:ligatures w14:val="standardContextual"/>
+        </w:rPr>
         <w:t xml:space="preserve">const router = </w:t>
       </w:r>
       <w:proofErr w:type="spellStart"/>
@@ -11394,9 +11713,8 @@
           <w:szCs w:val="22"/>
           <w14:ligatures w14:val="standardContextual"/>
         </w:rPr>
-        <w:t>(</w:t>
-      </w:r>
-      <w:proofErr w:type="gramStart"/>
+        <w:t>();</w:t>
+      </w:r>
       <w:r>
         <w:rPr>
           <w:rFonts w:asciiTheme="minorHAnsi" w:eastAsiaTheme="minorHAnsi" w:hAnsiTheme="minorHAnsi" w:cstheme="minorBidi"/>
@@ -11406,7 +11724,7 @@
           <w:szCs w:val="22"/>
           <w14:ligatures w14:val="standardContextual"/>
         </w:rPr>
-        <w:t xml:space="preserve">);  </w:t>
+        <w:t xml:space="preserve"> </w:t>
       </w:r>
       <w:r>
         <w:rPr>
@@ -11417,20 +11735,302 @@
           <w:szCs w:val="22"/>
           <w14:ligatures w14:val="standardContextual"/>
         </w:rPr>
-        <w:t>that</w:t>
-      </w:r>
-      <w:proofErr w:type="gramEnd"/>
+        <w:t xml:space="preserve">It creates a </w:t>
+      </w:r>
       <w:r>
         <w:rPr>
           <w:rFonts w:asciiTheme="minorHAnsi" w:eastAsiaTheme="minorHAnsi" w:hAnsiTheme="minorHAnsi" w:cstheme="minorBidi"/>
+          <w:b/>
+          <w:bCs/>
           <w:color w:val="000000" w:themeColor="text1"/>
           <w:kern w:val="2"/>
           <w:sz w:val="22"/>
           <w:szCs w:val="22"/>
           <w14:ligatures w14:val="standardContextual"/>
         </w:rPr>
-        <w:t xml:space="preserve"> gives us the ability to use http methods to handle requests</w:t>
-      </w:r>
+        <w:t>router</w:t>
+      </w:r>
+      <w:r>
+        <w:rPr>
+          <w:rFonts w:asciiTheme="minorHAnsi" w:eastAsiaTheme="minorHAnsi" w:hAnsiTheme="minorHAnsi" w:cstheme="minorBidi"/>
+          <w:color w:val="000000" w:themeColor="text1"/>
+          <w:kern w:val="2"/>
+          <w:sz w:val="22"/>
+          <w:szCs w:val="22"/>
+          <w14:ligatures w14:val="standardContextual"/>
+        </w:rPr>
+        <w:t>, which is like a smaller, separate group of routes that you can organize into its own module/file.</w:t>
+      </w:r>
+    </w:p>
+    <w:p>
+      <w:pPr>
+        <w:pStyle w:val="ListParagraph"/>
+        <w:numPr>
+          <w:ilvl w:val="0"/>
+          <w:numId w:val="25"/>
+        </w:numPr>
+        <w:rPr>
+          <w:color w:val="000000" w:themeColor="text1"/>
+          <w:sz w:val="22"/>
+          <w:szCs w:val="22"/>
+        </w:rPr>
+      </w:pPr>
+      <w:proofErr w:type="spellStart"/>
+      <w:proofErr w:type="gramStart"/>
+      <w:r>
+        <w:rPr>
+          <w:color w:val="000000" w:themeColor="text1"/>
+          <w:sz w:val="22"/>
+          <w:szCs w:val="22"/>
+        </w:rPr>
+        <w:t>router.route</w:t>
+      </w:r>
+      <w:proofErr w:type="spellEnd"/>
+      <w:proofErr w:type="gramEnd"/>
+      <w:r>
+        <w:rPr>
+          <w:color w:val="000000" w:themeColor="text1"/>
+          <w:sz w:val="22"/>
+          <w:szCs w:val="22"/>
+        </w:rPr>
+        <w:t>() lets you define multiple HTTP methods for the same URL path.</w:t>
+      </w:r>
+    </w:p>
+    <w:p>
+      <w:pPr>
+        <w:ind w:firstLine="720"/>
+        <w:rPr>
+          <w:color w:val="000000" w:themeColor="text1"/>
+          <w:sz w:val="22"/>
+          <w:szCs w:val="22"/>
+        </w:rPr>
+      </w:pPr>
+      <w:r>
+        <w:rPr>
+          <w:color w:val="000000" w:themeColor="text1"/>
+          <w:sz w:val="22"/>
+          <w:szCs w:val="22"/>
+        </w:rPr>
+        <w:t>A useful rule</w:t>
+      </w:r>
+    </w:p>
+    <w:p>
+      <w:pPr>
+        <w:spacing w:before="100" w:beforeAutospacing="1" w:after="100" w:afterAutospacing="1" w:line="240" w:lineRule="auto"/>
+        <w:ind w:left="720"/>
+        <w:rPr>
+          <w:color w:val="000000" w:themeColor="text1"/>
+          <w:sz w:val="22"/>
+          <w:szCs w:val="22"/>
+        </w:rPr>
+      </w:pPr>
+      <w:r>
+        <w:rPr>
+          <w:color w:val="000000" w:themeColor="text1"/>
+          <w:sz w:val="22"/>
+          <w:szCs w:val="22"/>
+        </w:rPr>
+        <w:t>When defining Express routes:</w:t>
+      </w:r>
+    </w:p>
+    <w:p>
+      <w:pPr>
+        <w:tabs>
+          <w:tab w:val="left" w:pos="916"/>
+          <w:tab w:val="left" w:pos="1832"/>
+          <w:tab w:val="left" w:pos="2748"/>
+          <w:tab w:val="left" w:pos="3664"/>
+          <w:tab w:val="left" w:pos="4580"/>
+          <w:tab w:val="left" w:pos="5496"/>
+          <w:tab w:val="left" w:pos="6412"/>
+          <w:tab w:val="left" w:pos="7328"/>
+          <w:tab w:val="left" w:pos="8244"/>
+          <w:tab w:val="left" w:pos="9160"/>
+          <w:tab w:val="left" w:pos="10076"/>
+          <w:tab w:val="left" w:pos="10992"/>
+          <w:tab w:val="left" w:pos="11908"/>
+          <w:tab w:val="left" w:pos="12824"/>
+          <w:tab w:val="left" w:pos="13740"/>
+          <w:tab w:val="left" w:pos="14656"/>
+        </w:tabs>
+        <w:spacing w:after="0" w:line="240" w:lineRule="auto"/>
+        <w:ind w:left="720"/>
+        <w:rPr>
+          <w:color w:val="000000" w:themeColor="text1"/>
+          <w:sz w:val="22"/>
+          <w:szCs w:val="22"/>
+        </w:rPr>
+      </w:pPr>
+      <w:r>
+        <w:rPr>
+          <w:color w:val="000000" w:themeColor="text1"/>
+          <w:sz w:val="22"/>
+          <w:szCs w:val="22"/>
+        </w:rPr>
+        <w:t>STATIC / SPECIFIC routes</w:t>
+      </w:r>
+    </w:p>
+    <w:p>
+      <w:pPr>
+        <w:tabs>
+          <w:tab w:val="left" w:pos="916"/>
+          <w:tab w:val="left" w:pos="1832"/>
+          <w:tab w:val="left" w:pos="2748"/>
+          <w:tab w:val="left" w:pos="3664"/>
+          <w:tab w:val="left" w:pos="4580"/>
+          <w:tab w:val="left" w:pos="5496"/>
+          <w:tab w:val="left" w:pos="6412"/>
+          <w:tab w:val="left" w:pos="7328"/>
+          <w:tab w:val="left" w:pos="8244"/>
+          <w:tab w:val="left" w:pos="9160"/>
+          <w:tab w:val="left" w:pos="10076"/>
+          <w:tab w:val="left" w:pos="10992"/>
+          <w:tab w:val="left" w:pos="11908"/>
+          <w:tab w:val="left" w:pos="12824"/>
+          <w:tab w:val="left" w:pos="13740"/>
+          <w:tab w:val="left" w:pos="14656"/>
+        </w:tabs>
+        <w:spacing w:after="0" w:line="240" w:lineRule="auto"/>
+        <w:ind w:left="720"/>
+        <w:rPr>
+          <w:color w:val="000000" w:themeColor="text1"/>
+          <w:sz w:val="22"/>
+          <w:szCs w:val="22"/>
+        </w:rPr>
+      </w:pPr>
+      <w:r>
+        <w:rPr>
+          <w:color w:val="000000" w:themeColor="text1"/>
+          <w:sz w:val="22"/>
+          <w:szCs w:val="22"/>
+        </w:rPr>
+        <w:t xml:space="preserve">        ↓</w:t>
+      </w:r>
+    </w:p>
+    <w:p>
+      <w:pPr>
+        <w:tabs>
+          <w:tab w:val="left" w:pos="916"/>
+          <w:tab w:val="left" w:pos="1832"/>
+          <w:tab w:val="left" w:pos="2748"/>
+          <w:tab w:val="left" w:pos="3664"/>
+          <w:tab w:val="left" w:pos="4580"/>
+          <w:tab w:val="left" w:pos="5496"/>
+          <w:tab w:val="left" w:pos="6412"/>
+          <w:tab w:val="left" w:pos="7328"/>
+          <w:tab w:val="left" w:pos="8244"/>
+          <w:tab w:val="left" w:pos="9160"/>
+          <w:tab w:val="left" w:pos="10076"/>
+          <w:tab w:val="left" w:pos="10992"/>
+          <w:tab w:val="left" w:pos="11908"/>
+          <w:tab w:val="left" w:pos="12824"/>
+          <w:tab w:val="left" w:pos="13740"/>
+          <w:tab w:val="left" w:pos="14656"/>
+        </w:tabs>
+        <w:spacing w:after="0" w:line="240" w:lineRule="auto"/>
+        <w:ind w:left="720"/>
+        <w:rPr>
+          <w:color w:val="000000" w:themeColor="text1"/>
+          <w:sz w:val="22"/>
+          <w:szCs w:val="22"/>
+        </w:rPr>
+      </w:pPr>
+      <w:r>
+        <w:rPr>
+          <w:color w:val="000000" w:themeColor="text1"/>
+          <w:sz w:val="22"/>
+          <w:szCs w:val="22"/>
+        </w:rPr>
+        <w:t>DYNAMIC routes</w:t>
+      </w:r>
+    </w:p>
+    <w:p>
+      <w:pPr>
+        <w:tabs>
+          <w:tab w:val="left" w:pos="916"/>
+          <w:tab w:val="left" w:pos="1832"/>
+          <w:tab w:val="left" w:pos="2748"/>
+          <w:tab w:val="left" w:pos="3664"/>
+          <w:tab w:val="left" w:pos="4580"/>
+          <w:tab w:val="left" w:pos="5496"/>
+          <w:tab w:val="left" w:pos="6412"/>
+          <w:tab w:val="left" w:pos="7328"/>
+          <w:tab w:val="left" w:pos="8244"/>
+          <w:tab w:val="left" w:pos="9160"/>
+          <w:tab w:val="left" w:pos="10076"/>
+          <w:tab w:val="left" w:pos="10992"/>
+          <w:tab w:val="left" w:pos="11908"/>
+          <w:tab w:val="left" w:pos="12824"/>
+          <w:tab w:val="left" w:pos="13740"/>
+          <w:tab w:val="left" w:pos="14656"/>
+        </w:tabs>
+        <w:spacing w:after="0" w:line="240" w:lineRule="auto"/>
+        <w:ind w:left="720"/>
+        <w:rPr>
+          <w:color w:val="000000" w:themeColor="text1"/>
+          <w:sz w:val="22"/>
+          <w:szCs w:val="22"/>
+        </w:rPr>
+      </w:pPr>
+      <w:r>
+        <w:rPr>
+          <w:color w:val="000000" w:themeColor="text1"/>
+          <w:sz w:val="22"/>
+          <w:szCs w:val="22"/>
+        </w:rPr>
+        <w:t xml:space="preserve">        ↓</w:t>
+      </w:r>
+    </w:p>
+    <w:p>
+      <w:pPr>
+        <w:tabs>
+          <w:tab w:val="left" w:pos="916"/>
+          <w:tab w:val="left" w:pos="1832"/>
+          <w:tab w:val="left" w:pos="2748"/>
+          <w:tab w:val="left" w:pos="3664"/>
+          <w:tab w:val="left" w:pos="4580"/>
+          <w:tab w:val="left" w:pos="5496"/>
+          <w:tab w:val="left" w:pos="6412"/>
+          <w:tab w:val="left" w:pos="7328"/>
+          <w:tab w:val="left" w:pos="8244"/>
+          <w:tab w:val="left" w:pos="9160"/>
+          <w:tab w:val="left" w:pos="10076"/>
+          <w:tab w:val="left" w:pos="10992"/>
+          <w:tab w:val="left" w:pos="11908"/>
+          <w:tab w:val="left" w:pos="12824"/>
+          <w:tab w:val="left" w:pos="13740"/>
+          <w:tab w:val="left" w:pos="14656"/>
+        </w:tabs>
+        <w:spacing w:after="0" w:line="240" w:lineRule="auto"/>
+        <w:ind w:left="720"/>
+        <w:rPr>
+          <w:color w:val="000000" w:themeColor="text1"/>
+          <w:sz w:val="22"/>
+          <w:szCs w:val="22"/>
+        </w:rPr>
+      </w:pPr>
+      <w:r>
+        <w:rPr>
+          <w:color w:val="000000" w:themeColor="text1"/>
+          <w:sz w:val="22"/>
+          <w:szCs w:val="22"/>
+        </w:rPr>
+        <w:t>CATCH-ALL routes</w:t>
+      </w:r>
+    </w:p>
+    <w:p>
+      <w:pPr>
+        <w:pStyle w:val="ListParagraph"/>
+        <w:numPr>
+          <w:ilvl w:val="0"/>
+          <w:numId w:val="25"/>
+        </w:numPr>
+        <w:rPr>
+          <w:color w:val="000000" w:themeColor="text1"/>
+          <w:sz w:val="22"/>
+          <w:szCs w:val="22"/>
+        </w:rPr>
+      </w:pPr>
     </w:p>
     <w:p>
       <w:pPr>
@@ -11457,9 +12057,8 @@
           <w:szCs w:val="22"/>
           <w14:ligatures w14:val="standardContextual"/>
         </w:rPr>
-        <w:t xml:space="preserve">For </w:t>
-      </w:r>
-      <w:proofErr w:type="gramStart"/>
+        <w:t xml:space="preserve">Inside each file we have </w:t>
+      </w:r>
       <w:r>
         <w:rPr>
           <w:rFonts w:asciiTheme="minorHAnsi" w:eastAsiaTheme="minorHAnsi" w:hAnsiTheme="minorHAnsi" w:cstheme="minorBidi"/>
@@ -11469,9 +12068,10 @@
           <w:szCs w:val="22"/>
           <w14:ligatures w14:val="standardContextual"/>
         </w:rPr>
-        <w:t>example</w:t>
-      </w:r>
-      <w:proofErr w:type="gramEnd"/>
+        <w:t xml:space="preserve">const router = </w:t>
+      </w:r>
+      <w:proofErr w:type="spellStart"/>
+      <w:proofErr w:type="gramStart"/>
       <w:r>
         <w:rPr>
           <w:rFonts w:asciiTheme="minorHAnsi" w:eastAsiaTheme="minorHAnsi" w:hAnsiTheme="minorHAnsi" w:cstheme="minorBidi"/>
@@ -11481,9 +12081,10 @@
           <w:szCs w:val="22"/>
           <w14:ligatures w14:val="standardContextual"/>
         </w:rPr>
-        <w:t xml:space="preserve"> for </w:t>
-      </w:r>
-      <w:proofErr w:type="gramStart"/>
+        <w:t>express.Router</w:t>
+      </w:r>
+      <w:proofErr w:type="spellEnd"/>
+      <w:proofErr w:type="gramEnd"/>
       <w:r>
         <w:rPr>
           <w:rFonts w:asciiTheme="minorHAnsi" w:eastAsiaTheme="minorHAnsi" w:hAnsiTheme="minorHAnsi" w:cstheme="minorBidi"/>
@@ -11493,9 +12094,9 @@
           <w:szCs w:val="22"/>
           <w14:ligatures w14:val="standardContextual"/>
         </w:rPr>
-        <w:t>user</w:t>
-      </w:r>
-      <w:proofErr w:type="gramEnd"/>
+        <w:t>(</w:t>
+      </w:r>
+      <w:proofErr w:type="gramStart"/>
       <w:r>
         <w:rPr>
           <w:rFonts w:asciiTheme="minorHAnsi" w:eastAsiaTheme="minorHAnsi" w:hAnsiTheme="minorHAnsi" w:cstheme="minorBidi"/>
@@ -11505,7 +12106,30 @@
           <w:szCs w:val="22"/>
           <w14:ligatures w14:val="standardContextual"/>
         </w:rPr>
-        <w:t xml:space="preserve"> we will have the previous code and the same for a product.js file</w:t>
+        <w:t xml:space="preserve">);  </w:t>
+      </w:r>
+      <w:r>
+        <w:rPr>
+          <w:rFonts w:asciiTheme="minorHAnsi" w:eastAsiaTheme="minorHAnsi" w:hAnsiTheme="minorHAnsi" w:cstheme="minorBidi"/>
+          <w:color w:val="000000" w:themeColor="text1"/>
+          <w:kern w:val="2"/>
+          <w:sz w:val="22"/>
+          <w:szCs w:val="22"/>
+          <w14:ligatures w14:val="standardContextual"/>
+        </w:rPr>
+        <w:t>that</w:t>
+      </w:r>
+      <w:proofErr w:type="gramEnd"/>
+      <w:r>
+        <w:rPr>
+          <w:rFonts w:asciiTheme="minorHAnsi" w:eastAsiaTheme="minorHAnsi" w:hAnsiTheme="minorHAnsi" w:cstheme="minorBidi"/>
+          <w:color w:val="000000" w:themeColor="text1"/>
+          <w:kern w:val="2"/>
+          <w:sz w:val="22"/>
+          <w:szCs w:val="22"/>
+          <w14:ligatures w14:val="standardContextual"/>
+        </w:rPr>
+        <w:t xml:space="preserve"> gives us the ability to use http methods to handle requests</w:t>
       </w:r>
     </w:p>
     <w:p>
@@ -11533,9 +12157,9 @@
           <w:szCs w:val="22"/>
           <w14:ligatures w14:val="standardContextual"/>
         </w:rPr>
-        <w:t xml:space="preserve">The method </w:t>
-      </w:r>
-      <w:proofErr w:type="spellStart"/>
+        <w:lastRenderedPageBreak/>
+        <w:t xml:space="preserve">For </w:t>
+      </w:r>
       <w:proofErr w:type="gramStart"/>
       <w:r>
         <w:rPr>
@@ -11546,9 +12170,8 @@
           <w:szCs w:val="22"/>
           <w14:ligatures w14:val="standardContextual"/>
         </w:rPr>
-        <w:t>router.route</w:t>
-      </w:r>
-      <w:proofErr w:type="spellEnd"/>
+        <w:t>example</w:t>
+      </w:r>
       <w:proofErr w:type="gramEnd"/>
       <w:r>
         <w:rPr>
@@ -11559,7 +12182,7 @@
           <w:szCs w:val="22"/>
           <w14:ligatures w14:val="standardContextual"/>
         </w:rPr>
-        <w:t>(‘path’</w:t>
+        <w:t xml:space="preserve"> for </w:t>
       </w:r>
       <w:proofErr w:type="gramStart"/>
       <w:r>
@@ -11571,7 +12194,7 @@
           <w:szCs w:val="22"/>
           <w14:ligatures w14:val="standardContextual"/>
         </w:rPr>
-        <w:t>) it</w:t>
+        <w:t>user</w:t>
       </w:r>
       <w:proofErr w:type="gramEnd"/>
       <w:r>
@@ -11583,7 +12206,7 @@
           <w:szCs w:val="22"/>
           <w14:ligatures w14:val="standardContextual"/>
         </w:rPr>
-        <w:t xml:space="preserve"> lets us group http methods under it for the same path</w:t>
+        <w:t xml:space="preserve"> we will have the previous code and the same for a product.js file</w:t>
       </w:r>
     </w:p>
     <w:p>
@@ -11611,6 +12234,84 @@
           <w:szCs w:val="22"/>
           <w14:ligatures w14:val="standardContextual"/>
         </w:rPr>
+        <w:t xml:space="preserve">The method </w:t>
+      </w:r>
+      <w:proofErr w:type="spellStart"/>
+      <w:proofErr w:type="gramStart"/>
+      <w:r>
+        <w:rPr>
+          <w:rFonts w:asciiTheme="minorHAnsi" w:eastAsiaTheme="minorHAnsi" w:hAnsiTheme="minorHAnsi" w:cstheme="minorBidi"/>
+          <w:color w:val="000000" w:themeColor="text1"/>
+          <w:kern w:val="2"/>
+          <w:sz w:val="22"/>
+          <w:szCs w:val="22"/>
+          <w14:ligatures w14:val="standardContextual"/>
+        </w:rPr>
+        <w:t>router.route</w:t>
+      </w:r>
+      <w:proofErr w:type="spellEnd"/>
+      <w:proofErr w:type="gramEnd"/>
+      <w:r>
+        <w:rPr>
+          <w:rFonts w:asciiTheme="minorHAnsi" w:eastAsiaTheme="minorHAnsi" w:hAnsiTheme="minorHAnsi" w:cstheme="minorBidi"/>
+          <w:color w:val="000000" w:themeColor="text1"/>
+          <w:kern w:val="2"/>
+          <w:sz w:val="22"/>
+          <w:szCs w:val="22"/>
+          <w14:ligatures w14:val="standardContextual"/>
+        </w:rPr>
+        <w:t>(‘path’</w:t>
+      </w:r>
+      <w:proofErr w:type="gramStart"/>
+      <w:r>
+        <w:rPr>
+          <w:rFonts w:asciiTheme="minorHAnsi" w:eastAsiaTheme="minorHAnsi" w:hAnsiTheme="minorHAnsi" w:cstheme="minorBidi"/>
+          <w:color w:val="000000" w:themeColor="text1"/>
+          <w:kern w:val="2"/>
+          <w:sz w:val="22"/>
+          <w:szCs w:val="22"/>
+          <w14:ligatures w14:val="standardContextual"/>
+        </w:rPr>
+        <w:t>) it</w:t>
+      </w:r>
+      <w:proofErr w:type="gramEnd"/>
+      <w:r>
+        <w:rPr>
+          <w:rFonts w:asciiTheme="minorHAnsi" w:eastAsiaTheme="minorHAnsi" w:hAnsiTheme="minorHAnsi" w:cstheme="minorBidi"/>
+          <w:color w:val="000000" w:themeColor="text1"/>
+          <w:kern w:val="2"/>
+          <w:sz w:val="22"/>
+          <w:szCs w:val="22"/>
+          <w14:ligatures w14:val="standardContextual"/>
+        </w:rPr>
+        <w:t xml:space="preserve"> lets us group http methods under it for the same path</w:t>
+      </w:r>
+    </w:p>
+    <w:p>
+      <w:pPr>
+        <w:pStyle w:val="pdq2pgselectionanchorcontainer"/>
+        <w:numPr>
+          <w:ilvl w:val="0"/>
+          <w:numId w:val="25"/>
+        </w:numPr>
+        <w:rPr>
+          <w:rFonts w:asciiTheme="minorHAnsi" w:eastAsiaTheme="minorHAnsi" w:hAnsiTheme="minorHAnsi" w:cstheme="minorBidi"/>
+          <w:color w:val="000000" w:themeColor="text1"/>
+          <w:kern w:val="2"/>
+          <w:sz w:val="22"/>
+          <w:szCs w:val="22"/>
+          <w14:ligatures w14:val="standardContextual"/>
+        </w:rPr>
+      </w:pPr>
+      <w:r>
+        <w:rPr>
+          <w:rFonts w:asciiTheme="minorHAnsi" w:eastAsiaTheme="minorHAnsi" w:hAnsiTheme="minorHAnsi" w:cstheme="minorBidi"/>
+          <w:color w:val="000000" w:themeColor="text1"/>
+          <w:kern w:val="2"/>
+          <w:sz w:val="22"/>
+          <w:szCs w:val="22"/>
+          <w14:ligatures w14:val="standardContextual"/>
+        </w:rPr>
         <w:t>app = the whole application/server</w:t>
       </w:r>
       <w:r>
@@ -11634,6 +12335,236 @@
           <w14:ligatures w14:val="standardContextual"/>
         </w:rPr>
         <w:t>router = a smaller piece of the application that handles a group of routes</w:t>
+      </w:r>
+    </w:p>
+    <w:p>
+      <w:pPr>
+        <w:pStyle w:val="pdq2pgselectionanchorcontainer"/>
+        <w:numPr>
+          <w:ilvl w:val="0"/>
+          <w:numId w:val="25"/>
+        </w:numPr>
+        <w:rPr>
+          <w:rFonts w:asciiTheme="minorHAnsi" w:eastAsiaTheme="minorHAnsi" w:hAnsiTheme="minorHAnsi" w:cstheme="minorBidi"/>
+          <w:color w:val="000000" w:themeColor="text1"/>
+          <w:kern w:val="2"/>
+          <w:sz w:val="22"/>
+          <w:szCs w:val="22"/>
+          <w14:ligatures w14:val="standardContextual"/>
+        </w:rPr>
+      </w:pPr>
+      <w:r>
+        <w:rPr>
+          <w:rFonts w:asciiTheme="minorHAnsi" w:eastAsiaTheme="minorHAnsi" w:hAnsiTheme="minorHAnsi" w:cstheme="minorBidi"/>
+          <w:color w:val="000000" w:themeColor="text1"/>
+          <w:kern w:val="2"/>
+          <w:sz w:val="22"/>
+          <w:szCs w:val="22"/>
+          <w14:ligatures w14:val="standardContextual"/>
+        </w:rPr>
+        <w:t xml:space="preserve">after using a router where we route our requests we should inside our app or server.js use the router as the call back function: </w:t>
+      </w:r>
+      <w:proofErr w:type="spellStart"/>
+      <w:proofErr w:type="gramStart"/>
+      <w:r>
+        <w:rPr>
+          <w:rFonts w:asciiTheme="minorHAnsi" w:eastAsiaTheme="minorHAnsi" w:hAnsiTheme="minorHAnsi" w:cstheme="minorBidi"/>
+          <w:color w:val="000000" w:themeColor="text1"/>
+          <w:kern w:val="2"/>
+          <w:sz w:val="22"/>
+          <w:szCs w:val="22"/>
+          <w14:ligatures w14:val="standardContextual"/>
+        </w:rPr>
+        <w:t>app.use</w:t>
+      </w:r>
+      <w:proofErr w:type="spellEnd"/>
+      <w:r>
+        <w:rPr>
+          <w:rFonts w:asciiTheme="minorHAnsi" w:eastAsiaTheme="minorHAnsi" w:hAnsiTheme="minorHAnsi" w:cstheme="minorBidi"/>
+          <w:color w:val="000000" w:themeColor="text1"/>
+          <w:kern w:val="2"/>
+          <w:sz w:val="22"/>
+          <w:szCs w:val="22"/>
+          <w14:ligatures w14:val="standardContextual"/>
+        </w:rPr>
+        <w:t>(</w:t>
+      </w:r>
+      <w:proofErr w:type="gramEnd"/>
+      <w:r>
+        <w:rPr>
+          <w:rFonts w:asciiTheme="minorHAnsi" w:eastAsiaTheme="minorHAnsi" w:hAnsiTheme="minorHAnsi" w:cstheme="minorBidi"/>
+          <w:color w:val="000000" w:themeColor="text1"/>
+          <w:kern w:val="2"/>
+          <w:sz w:val="22"/>
+          <w:szCs w:val="22"/>
+          <w14:ligatures w14:val="standardContextual"/>
+        </w:rPr>
+        <w:t xml:space="preserve">"/users", </w:t>
+      </w:r>
+      <w:proofErr w:type="spellStart"/>
+      <w:r>
+        <w:rPr>
+          <w:rFonts w:asciiTheme="minorHAnsi" w:eastAsiaTheme="minorHAnsi" w:hAnsiTheme="minorHAnsi" w:cstheme="minorBidi"/>
+          <w:color w:val="000000" w:themeColor="text1"/>
+          <w:kern w:val="2"/>
+          <w:sz w:val="22"/>
+          <w:szCs w:val="22"/>
+          <w14:ligatures w14:val="standardContextual"/>
+        </w:rPr>
+        <w:t>userRouter</w:t>
+      </w:r>
+      <w:proofErr w:type="spellEnd"/>
+      <w:r>
+        <w:rPr>
+          <w:rFonts w:asciiTheme="minorHAnsi" w:eastAsiaTheme="minorHAnsi" w:hAnsiTheme="minorHAnsi" w:cstheme="minorBidi"/>
+          <w:color w:val="000000" w:themeColor="text1"/>
+          <w:kern w:val="2"/>
+          <w:sz w:val="22"/>
+          <w:szCs w:val="22"/>
+          <w14:ligatures w14:val="standardContextual"/>
+        </w:rPr>
+        <w:t>);</w:t>
+      </w:r>
+      <w:r>
+        <w:rPr>
+          <w:rFonts w:asciiTheme="minorHAnsi" w:eastAsiaTheme="minorHAnsi" w:hAnsiTheme="minorHAnsi" w:cstheme="minorBidi"/>
+          <w:color w:val="000000" w:themeColor="text1"/>
+          <w:kern w:val="2"/>
+          <w:sz w:val="22"/>
+          <w:szCs w:val="22"/>
+          <w14:ligatures w14:val="standardContextual"/>
+        </w:rPr>
+        <w:t xml:space="preserve"> </w:t>
+      </w:r>
+      <w:r>
+        <w:rPr>
+          <w:rFonts w:asciiTheme="minorHAnsi" w:eastAsiaTheme="minorHAnsi" w:hAnsiTheme="minorHAnsi" w:cstheme="minorBidi"/>
+          <w:color w:val="000000" w:themeColor="text1"/>
+          <w:kern w:val="2"/>
+          <w:sz w:val="22"/>
+          <w:szCs w:val="22"/>
+          <w14:ligatures w14:val="standardContextual"/>
+        </w:rPr>
+        <w:t>For requests beginning with /users, use this router.</w:t>
+      </w:r>
+    </w:p>
+    <w:p>
+      <w:pPr>
+        <w:pStyle w:val="pdq2pgselectionanchorcontainer"/>
+        <w:numPr>
+          <w:ilvl w:val="0"/>
+          <w:numId w:val="25"/>
+        </w:numPr>
+        <w:rPr>
+          <w:rFonts w:asciiTheme="minorHAnsi" w:eastAsiaTheme="minorHAnsi" w:hAnsiTheme="minorHAnsi" w:cstheme="minorBidi"/>
+          <w:color w:val="000000" w:themeColor="text1"/>
+          <w:kern w:val="2"/>
+          <w:sz w:val="22"/>
+          <w:szCs w:val="22"/>
+          <w14:ligatures w14:val="standardContextual"/>
+        </w:rPr>
+      </w:pPr>
+      <w:r>
+        <w:rPr>
+          <w:rFonts w:asciiTheme="minorHAnsi" w:eastAsiaTheme="minorHAnsi" w:hAnsiTheme="minorHAnsi" w:cstheme="minorBidi"/>
+          <w:color w:val="000000" w:themeColor="text1"/>
+          <w:kern w:val="2"/>
+          <w:sz w:val="22"/>
+          <w:szCs w:val="22"/>
+          <w14:ligatures w14:val="standardContextual"/>
+        </w:rPr>
+        <w:t>Request ↓ Route ↓ Middleware ↓ Controller ↓ Model / Database ↓ Controller ↓ Response</w:t>
+      </w:r>
+    </w:p>
+    <w:p>
+      <w:pPr>
+        <w:pStyle w:val="pdq2pgselectionanchorcontainer"/>
+        <w:numPr>
+          <w:ilvl w:val="0"/>
+          <w:numId w:val="25"/>
+        </w:numPr>
+        <w:rPr>
+          <w:rFonts w:asciiTheme="minorHAnsi" w:eastAsiaTheme="minorHAnsi" w:hAnsiTheme="minorHAnsi" w:cstheme="minorBidi"/>
+          <w:color w:val="000000" w:themeColor="text1"/>
+          <w:kern w:val="2"/>
+          <w:sz w:val="22"/>
+          <w:szCs w:val="22"/>
+          <w14:ligatures w14:val="standardContextual"/>
+        </w:rPr>
+      </w:pPr>
+      <w:r>
+        <w:rPr>
+          <w:rFonts w:asciiTheme="minorHAnsi" w:eastAsiaTheme="minorHAnsi" w:hAnsiTheme="minorHAnsi" w:cstheme="minorBidi"/>
+          <w:color w:val="000000" w:themeColor="text1"/>
+          <w:kern w:val="2"/>
+          <w:sz w:val="22"/>
+          <w:szCs w:val="22"/>
+          <w14:ligatures w14:val="standardContextual"/>
+        </w:rPr>
+        <w:t xml:space="preserve">const app = </w:t>
+      </w:r>
+      <w:proofErr w:type="gramStart"/>
+      <w:r>
+        <w:rPr>
+          <w:rFonts w:asciiTheme="minorHAnsi" w:eastAsiaTheme="minorHAnsi" w:hAnsiTheme="minorHAnsi" w:cstheme="minorBidi"/>
+          <w:color w:val="000000" w:themeColor="text1"/>
+          <w:kern w:val="2"/>
+          <w:sz w:val="22"/>
+          <w:szCs w:val="22"/>
+          <w14:ligatures w14:val="standardContextual"/>
+        </w:rPr>
+        <w:t>express();</w:t>
+      </w:r>
+      <w:r>
+        <w:rPr>
+          <w:rFonts w:asciiTheme="minorHAnsi" w:eastAsiaTheme="minorHAnsi" w:hAnsiTheme="minorHAnsi" w:cstheme="minorBidi"/>
+          <w:color w:val="000000" w:themeColor="text1"/>
+          <w:kern w:val="2"/>
+          <w:sz w:val="22"/>
+          <w:szCs w:val="22"/>
+          <w14:ligatures w14:val="standardContextual"/>
+        </w:rPr>
+        <w:t xml:space="preserve">  this</w:t>
+      </w:r>
+      <w:proofErr w:type="gramEnd"/>
+      <w:r>
+        <w:rPr>
+          <w:rFonts w:asciiTheme="minorHAnsi" w:eastAsiaTheme="minorHAnsi" w:hAnsiTheme="minorHAnsi" w:cstheme="minorBidi"/>
+          <w:color w:val="000000" w:themeColor="text1"/>
+          <w:kern w:val="2"/>
+          <w:sz w:val="22"/>
+          <w:szCs w:val="22"/>
+          <w14:ligatures w14:val="standardContextual"/>
+        </w:rPr>
+        <w:t xml:space="preserve"> line creates our express application</w:t>
+      </w:r>
+    </w:p>
+    <w:p>
+      <w:pPr>
+        <w:pStyle w:val="pdq2pgselectionanchorcontainer"/>
+        <w:numPr>
+          <w:ilvl w:val="0"/>
+          <w:numId w:val="25"/>
+        </w:numPr>
+        <w:rPr>
+          <w:rFonts w:asciiTheme="minorHAnsi" w:eastAsiaTheme="minorHAnsi" w:hAnsiTheme="minorHAnsi" w:cstheme="minorBidi"/>
+          <w:color w:val="000000" w:themeColor="text1"/>
+          <w:kern w:val="2"/>
+          <w:sz w:val="22"/>
+          <w:szCs w:val="22"/>
+          <w14:ligatures w14:val="standardContextual"/>
+        </w:rPr>
+      </w:pPr>
+      <w:r>
+        <w:rPr>
+          <w:rFonts w:asciiTheme="minorHAnsi" w:eastAsiaTheme="minorHAnsi" w:hAnsiTheme="minorHAnsi" w:cstheme="minorBidi"/>
+          <w:color w:val="000000" w:themeColor="text1"/>
+          <w:kern w:val="2"/>
+          <w:sz w:val="22"/>
+          <w:szCs w:val="22"/>
+          <w14:ligatures w14:val="standardContextual"/>
+        </w:rPr>
+        <w:t>A web API is an API that applications communicate with over the web, commonly using HTTP.</w:t>
       </w:r>
     </w:p>
     <w:p>
@@ -11728,6 +12659,44 @@
           <w:szCs w:val="22"/>
         </w:rPr>
         <w:t>The express and node.js design of API is REST if we treat our data or entities as resources that can be queries from end points</w:t>
+      </w:r>
+    </w:p>
+    <w:p>
+      <w:pPr>
+        <w:pStyle w:val="ListParagraph"/>
+        <w:numPr>
+          <w:ilvl w:val="0"/>
+          <w:numId w:val="24"/>
+        </w:numPr>
+        <w:rPr>
+          <w:color w:val="000000" w:themeColor="text1"/>
+          <w:sz w:val="22"/>
+          <w:szCs w:val="22"/>
+        </w:rPr>
+      </w:pPr>
+      <w:r>
+        <w:rPr>
+          <w:color w:val="000000" w:themeColor="text1"/>
+          <w:sz w:val="22"/>
+          <w:szCs w:val="22"/>
+        </w:rPr>
+        <w:t xml:space="preserve">REST is an </w:t>
+      </w:r>
+      <w:r>
+        <w:rPr>
+          <w:color w:val="000000" w:themeColor="text1"/>
+          <w:sz w:val="22"/>
+          <w:szCs w:val="22"/>
+        </w:rPr>
+        <w:t>architectural style for designing systems that commonly use HTTP</w:t>
+      </w:r>
+      <w:r>
+        <w:rPr>
+          <w:color w:val="000000" w:themeColor="text1"/>
+          <w:sz w:val="22"/>
+          <w:szCs w:val="22"/>
+        </w:rPr>
+        <w:t>.</w:t>
       </w:r>
     </w:p>
     <w:p>
@@ -13407,7 +14376,7 @@
   <w:abstractNum w:abstractNumId="14" w15:restartNumberingAfterBreak="0">
     <w:nsid w:val="48720458"/>
     <w:multiLevelType w:val="hybridMultilevel"/>
-    <w:tmpl w:val="BA1A0640"/>
+    <w:tmpl w:val="F3EADAC6"/>
     <w:lvl w:ilvl="0" w:tplc="04090001">
       <w:start w:val="1"/>
       <w:numFmt w:val="bullet"/>
@@ -15957,7 +16926,6 @@
     <w:basedOn w:val="Normal"/>
     <w:link w:val="HTMLPreformattedChar"/>
     <w:uiPriority w:val="99"/>
-    <w:semiHidden/>
     <w:unhideWhenUsed/>
     <w:rsid w:val="00FF725D"/>
     <w:pPr>
@@ -15994,7 +16962,6 @@
     <w:basedOn w:val="DefaultParagraphFont"/>
     <w:link w:val="HTMLPreformatted"/>
     <w:uiPriority w:val="99"/>
-    <w:semiHidden/>
     <w:rsid w:val="00FF725D"/>
     <w:rPr>
       <w:rFonts w:ascii="Courier New" w:eastAsia="Times New Roman" w:hAnsi="Courier New" w:cs="Courier New"/>

</xml_diff>